<commit_message>
Adding the settings to make it more like to wirefram
</commit_message>
<xml_diff>
--- a/Comp sci.docx
+++ b/Comp sci.docx
@@ -78,6 +78,264 @@
         </w:rPr>
         <w:br/>
       </w:r>
+    </w:p>
+    <w:p>
+      <w:pPr>
+        <w:rPr>
+          <w:noProof/>
+          <w:sz w:val="22"/>
+          <w:szCs w:val="22"/>
+          <w:lang w:val="en-AU"/>
+        </w:rPr>
+      </w:pPr>
+    </w:p>
+    <w:p>
+      <w:pPr>
+        <w:rPr>
+          <w:noProof/>
+          <w:sz w:val="22"/>
+          <w:szCs w:val="22"/>
+          <w:lang w:val="en-AU"/>
+        </w:rPr>
+      </w:pPr>
+    </w:p>
+    <w:p>
+      <w:pPr>
+        <w:rPr>
+          <w:noProof/>
+          <w:sz w:val="22"/>
+          <w:szCs w:val="22"/>
+          <w:lang w:val="en-AU"/>
+        </w:rPr>
+      </w:pPr>
+    </w:p>
+    <w:p>
+      <w:pPr>
+        <w:rPr>
+          <w:noProof/>
+          <w:sz w:val="22"/>
+          <w:szCs w:val="22"/>
+          <w:lang w:val="en-AU"/>
+        </w:rPr>
+      </w:pPr>
+    </w:p>
+    <w:p>
+      <w:pPr>
+        <w:rPr>
+          <w:noProof/>
+          <w:sz w:val="22"/>
+          <w:szCs w:val="22"/>
+          <w:lang w:val="en-AU"/>
+        </w:rPr>
+      </w:pPr>
+    </w:p>
+    <w:p>
+      <w:pPr>
+        <w:rPr>
+          <w:noProof/>
+          <w:sz w:val="22"/>
+          <w:szCs w:val="22"/>
+          <w:lang w:val="en-AU"/>
+        </w:rPr>
+      </w:pPr>
+    </w:p>
+    <w:p>
+      <w:pPr>
+        <w:rPr>
+          <w:noProof/>
+          <w:sz w:val="22"/>
+          <w:szCs w:val="22"/>
+          <w:lang w:val="en-AU"/>
+        </w:rPr>
+      </w:pPr>
+    </w:p>
+    <w:p>
+      <w:pPr>
+        <w:rPr>
+          <w:noProof/>
+          <w:sz w:val="22"/>
+          <w:szCs w:val="22"/>
+          <w:lang w:val="en-AU"/>
+        </w:rPr>
+      </w:pPr>
+    </w:p>
+    <w:p>
+      <w:pPr>
+        <w:rPr>
+          <w:noProof/>
+          <w:sz w:val="22"/>
+          <w:szCs w:val="22"/>
+          <w:lang w:val="en-AU"/>
+        </w:rPr>
+      </w:pPr>
+    </w:p>
+    <w:p>
+      <w:pPr>
+        <w:rPr>
+          <w:noProof/>
+          <w:sz w:val="22"/>
+          <w:szCs w:val="22"/>
+          <w:lang w:val="en-AU"/>
+        </w:rPr>
+      </w:pPr>
+      <w:r>
+        <w:rPr>
+          <w:noProof/>
+          <w:sz w:val="22"/>
+          <w:szCs w:val="22"/>
+          <w:lang w:val="en-AU"/>
+        </w:rPr>
+        <w:t xml:space="preserve">Advance Technqies </w:t>
+      </w:r>
+    </w:p>
+    <w:p>
+      <w:pPr>
+        <w:rPr>
+          <w:noProof/>
+          <w:sz w:val="22"/>
+          <w:szCs w:val="22"/>
+          <w:lang w:val="en-AU"/>
+        </w:rPr>
+      </w:pPr>
+      <w:r>
+        <w:rPr>
+          <w:noProof/>
+          <w:sz w:val="22"/>
+          <w:szCs w:val="22"/>
+          <w:lang w:val="en-AU"/>
+        </w:rPr>
+        <w:t>My first adviacne Technqies is going to be using java Scipt for the Progam that breaks down there spending</w:t>
+      </w:r>
+    </w:p>
+    <w:p>
+      <w:pPr>
+        <w:rPr>
+          <w:noProof/>
+          <w:sz w:val="22"/>
+          <w:szCs w:val="22"/>
+          <w:lang w:val="en-AU"/>
+        </w:rPr>
+      </w:pPr>
+    </w:p>
+    <w:p>
+      <w:pPr>
+        <w:rPr>
+          <w:noProof/>
+          <w:sz w:val="22"/>
+          <w:szCs w:val="22"/>
+          <w:lang w:val="en-AU"/>
+        </w:rPr>
+      </w:pPr>
+    </w:p>
+    <w:p>
+      <w:pPr>
+        <w:rPr>
+          <w:noProof/>
+          <w:sz w:val="22"/>
+          <w:szCs w:val="22"/>
+          <w:lang w:val="en-AU"/>
+        </w:rPr>
+      </w:pPr>
+    </w:p>
+    <w:p>
+      <w:pPr>
+        <w:rPr>
+          <w:noProof/>
+          <w:sz w:val="22"/>
+          <w:szCs w:val="22"/>
+          <w:lang w:val="en-AU"/>
+        </w:rPr>
+      </w:pPr>
+    </w:p>
+    <w:p>
+      <w:pPr>
+        <w:rPr>
+          <w:noProof/>
+          <w:sz w:val="22"/>
+          <w:szCs w:val="22"/>
+          <w:lang w:val="en-AU"/>
+        </w:rPr>
+      </w:pPr>
+    </w:p>
+    <w:p>
+      <w:pPr>
+        <w:rPr>
+          <w:noProof/>
+          <w:sz w:val="22"/>
+          <w:szCs w:val="22"/>
+          <w:lang w:val="en-AU"/>
+        </w:rPr>
+      </w:pPr>
+    </w:p>
+    <w:p>
+      <w:pPr>
+        <w:rPr>
+          <w:noProof/>
+          <w:sz w:val="22"/>
+          <w:szCs w:val="22"/>
+          <w:lang w:val="en-AU"/>
+        </w:rPr>
+      </w:pPr>
+    </w:p>
+    <w:p>
+      <w:pPr>
+        <w:rPr>
+          <w:noProof/>
+          <w:sz w:val="22"/>
+          <w:szCs w:val="22"/>
+          <w:lang w:val="en-AU"/>
+        </w:rPr>
+      </w:pPr>
+    </w:p>
+    <w:p>
+      <w:pPr>
+        <w:rPr>
+          <w:noProof/>
+          <w:sz w:val="22"/>
+          <w:szCs w:val="22"/>
+          <w:lang w:val="en-AU"/>
+        </w:rPr>
+      </w:pPr>
+    </w:p>
+    <w:p>
+      <w:pPr>
+        <w:rPr>
+          <w:noProof/>
+          <w:sz w:val="22"/>
+          <w:szCs w:val="22"/>
+          <w:lang w:val="en-AU"/>
+        </w:rPr>
+      </w:pPr>
+    </w:p>
+    <w:p>
+      <w:pPr>
+        <w:rPr>
+          <w:noProof/>
+          <w:sz w:val="22"/>
+          <w:szCs w:val="22"/>
+          <w:lang w:val="en-AU"/>
+        </w:rPr>
+      </w:pPr>
+    </w:p>
+    <w:p>
+      <w:pPr>
+        <w:rPr>
+          <w:noProof/>
+          <w:sz w:val="22"/>
+          <w:szCs w:val="22"/>
+          <w:lang w:val="en-AU"/>
+        </w:rPr>
+      </w:pPr>
+    </w:p>
+    <w:p>
+      <w:pPr>
+        <w:rPr>
+          <w:noProof/>
+          <w:sz w:val="22"/>
+          <w:szCs w:val="22"/>
+          <w:lang w:val="en-AU"/>
+        </w:rPr>
+      </w:pPr>
       <w:r>
         <w:rPr>
           <w:noProof/>
@@ -2117,142 +2375,314 @@
     <w:p>
       <w:pPr>
         <w:rPr>
-          <w:b/>
-          <w:bCs/>
-          <w:noProof/>
-          <w:sz w:val="28"/>
-          <w:szCs w:val="28"/>
-          <w:u w:val="single"/>
-          <w:lang w:val="en-AU"/>
-        </w:rPr>
-      </w:pPr>
-      <w:r>
-        <w:rPr>
-          <w:b/>
-          <w:bCs/>
-          <w:noProof/>
-          <w:sz w:val="28"/>
-          <w:szCs w:val="28"/>
-          <w:u w:val="single"/>
+          <w:noProof/>
+          <w:sz w:val="22"/>
+          <w:szCs w:val="22"/>
+          <w:lang w:val="en-AU"/>
+        </w:rPr>
+      </w:pPr>
+    </w:p>
+    <w:p>
+      <w:pPr>
+        <w:rPr>
+          <w:noProof/>
+          <w:sz w:val="22"/>
+          <w:szCs w:val="22"/>
+          <w:lang w:val="en-AU"/>
+        </w:rPr>
+      </w:pPr>
+    </w:p>
+    <w:p>
+      <w:pPr>
+        <w:rPr>
+          <w:noProof/>
+          <w:sz w:val="22"/>
+          <w:szCs w:val="22"/>
+          <w:lang w:val="en-AU"/>
+        </w:rPr>
+      </w:pPr>
+    </w:p>
+    <w:p>
+      <w:pPr>
+        <w:rPr>
+          <w:noProof/>
+          <w:sz w:val="22"/>
+          <w:szCs w:val="22"/>
+          <w:lang w:val="en-AU"/>
+        </w:rPr>
+      </w:pPr>
+    </w:p>
+    <w:p>
+      <w:pPr>
+        <w:rPr>
+          <w:noProof/>
+          <w:sz w:val="22"/>
+          <w:szCs w:val="22"/>
+          <w:lang w:val="en-AU"/>
+        </w:rPr>
+      </w:pPr>
+    </w:p>
+    <w:p>
+      <w:pPr>
+        <w:rPr>
+          <w:noProof/>
+          <w:sz w:val="22"/>
+          <w:szCs w:val="22"/>
+          <w:lang w:val="en-AU"/>
+        </w:rPr>
+      </w:pPr>
+    </w:p>
+    <w:p>
+      <w:pPr>
+        <w:rPr>
+          <w:b/>
+          <w:bCs/>
+          <w:noProof/>
+          <w:sz w:val="28"/>
+          <w:szCs w:val="28"/>
+          <w:u w:val="single"/>
+          <w:lang w:val="en-AU"/>
+        </w:rPr>
+      </w:pPr>
+      <w:r>
+        <w:rPr>
+          <w:b/>
+          <w:bCs/>
+          <w:noProof/>
+          <w:sz w:val="28"/>
+          <w:szCs w:val="28"/>
+          <w:u w:val="single"/>
+          <w:lang w:val="en-AU"/>
+        </w:rPr>
+        <w:t>Version Control (Git)</w:t>
+      </w:r>
+    </w:p>
+    <w:p>
+      <w:pPr>
+        <w:rPr>
+          <w:noProof/>
+          <w:sz w:val="22"/>
+          <w:szCs w:val="22"/>
+          <w:lang w:val="en-AU"/>
+        </w:rPr>
+      </w:pPr>
+      <w:r>
+        <w:rPr>
+          <w:noProof/>
+          <w:sz w:val="22"/>
+          <w:szCs w:val="22"/>
+          <w:lang w:val="en-AU"/>
+        </w:rPr>
+        <w:t>I installed the wrong Git for my project I had installed git lens, Not only that but it was trying to back up by whole computer instead of just the whole folder and could do it becaues it said (10k+) changes. I deiced to restart.</w:t>
+      </w:r>
+      <w:r>
+        <w:rPr>
+          <w:noProof/>
+          <w:sz w:val="22"/>
+          <w:szCs w:val="22"/>
+          <w:lang w:val="en-AU"/>
+        </w:rPr>
+        <w:t xml:space="preserve"> Got it work on the 30/Aug where I had backed up what I had done.</w:t>
+      </w:r>
+    </w:p>
+    <w:p>
+      <w:pPr>
+        <w:rPr>
+          <w:noProof/>
+          <w:sz w:val="22"/>
+          <w:szCs w:val="22"/>
+          <w:lang w:val="en-AU"/>
+        </w:rPr>
+      </w:pPr>
+    </w:p>
+    <w:p>
+      <w:pPr>
+        <w:rPr>
+          <w:noProof/>
+          <w:sz w:val="22"/>
+          <w:szCs w:val="22"/>
+          <w:lang w:val="en-AU"/>
+        </w:rPr>
+      </w:pPr>
+    </w:p>
+    <w:p>
+      <w:pPr>
+        <w:rPr>
+          <w:b/>
+          <w:bCs/>
+          <w:noProof/>
+          <w:sz w:val="28"/>
+          <w:szCs w:val="28"/>
+          <w:u w:val="single"/>
+          <w:lang w:val="en-AU"/>
+        </w:rPr>
+      </w:pPr>
+      <w:r>
+        <w:rPr>
+          <w:b/>
+          <w:bCs/>
+          <w:noProof/>
+          <w:sz w:val="28"/>
+          <w:szCs w:val="28"/>
+          <w:u w:val="single"/>
+          <w:lang w:val="en-AU"/>
+        </w:rPr>
+        <w:t>Adding The CVS part</w:t>
+      </w:r>
+    </w:p>
+    <w:p>
+      <w:pPr>
+        <w:rPr>
+          <w:noProof/>
+          <w:sz w:val="22"/>
+          <w:szCs w:val="22"/>
+          <w:lang w:val="en-AU"/>
+        </w:rPr>
+      </w:pPr>
+      <w:r>
+        <w:rPr>
+          <w:noProof/>
+          <w:sz w:val="22"/>
+          <w:szCs w:val="22"/>
+          <w:lang w:val="en-AU"/>
+        </w:rPr>
+        <w:t>Frist I need to find a button on UIverse for me</w:t>
+      </w:r>
+      <w:r>
+        <w:rPr>
+          <w:noProof/>
+          <w:sz w:val="22"/>
+          <w:szCs w:val="22"/>
+          <w:lang w:val="en-AU"/>
+        </w:rPr>
+        <w:t xml:space="preserve"> where the user can add there CVS</w:t>
+      </w:r>
+    </w:p>
+    <w:p>
+      <w:pPr>
+        <w:rPr>
+          <w:noProof/>
+          <w:sz w:val="22"/>
+          <w:szCs w:val="22"/>
+          <w:lang w:val="en-AU"/>
+        </w:rPr>
+      </w:pPr>
+    </w:p>
+    <w:p>
+      <w:pPr>
+        <w:rPr>
+          <w:noProof/>
+          <w:sz w:val="22"/>
+          <w:szCs w:val="22"/>
+          <w:lang w:val="en-AU"/>
+        </w:rPr>
+      </w:pPr>
+    </w:p>
+    <w:p>
+      <w:pPr>
+        <w:rPr>
+          <w:b/>
+          <w:bCs/>
+          <w:noProof/>
+          <w:sz w:val="28"/>
+          <w:szCs w:val="28"/>
+          <w:u w:val="single"/>
+          <w:lang w:val="en-AU"/>
+        </w:rPr>
+      </w:pPr>
+      <w:r>
+        <w:rPr>
+          <w:b/>
+          <w:bCs/>
+          <w:noProof/>
+          <w:sz w:val="28"/>
+          <w:szCs w:val="28"/>
+          <w:u w:val="single"/>
+          <w:lang w:val="en-AU"/>
+        </w:rPr>
+        <w:t>Addin</w:t>
+      </w:r>
+      <w:r>
+        <w:rPr>
+          <w:b/>
+          <w:bCs/>
+          <w:noProof/>
+          <w:sz w:val="28"/>
+          <w:szCs w:val="28"/>
+          <w:u w:val="single"/>
+          <w:lang w:val="en-AU"/>
+        </w:rPr>
+        <w:t>g the Parts to settings like the wire frame</w:t>
+      </w:r>
+    </w:p>
+    <w:p>
+      <w:pPr>
+        <w:rPr>
+          <w:noProof/>
+          <w:sz w:val="22"/>
+          <w:szCs w:val="22"/>
+          <w:lang w:val="en-AU"/>
+        </w:rPr>
+      </w:pPr>
+    </w:p>
+    <w:p>
+      <w:pPr>
+        <w:rPr>
+          <w:noProof/>
+          <w:sz w:val="22"/>
+          <w:szCs w:val="22"/>
+          <w:lang w:val="en-AU"/>
+        </w:rPr>
+      </w:pPr>
+      <w:r>
+        <w:rPr>
+          <w:noProof/>
+          <w:sz w:val="22"/>
+          <w:szCs w:val="22"/>
           <w:lang w:val="en-AU"/>
         </w:rPr>
         <w:lastRenderedPageBreak/>
-        <w:t xml:space="preserve">Adding the </w:t>
-      </w:r>
-      <w:r>
-        <w:rPr>
-          <w:b/>
-          <w:bCs/>
-          <w:noProof/>
-          <w:sz w:val="28"/>
-          <w:szCs w:val="28"/>
-          <w:u w:val="single"/>
-          <w:lang w:val="en-AU"/>
-        </w:rPr>
-        <w:t>CVS</w:t>
-      </w:r>
-      <w:r>
-        <w:rPr>
-          <w:b/>
-          <w:bCs/>
-          <w:noProof/>
-          <w:sz w:val="28"/>
-          <w:szCs w:val="28"/>
-          <w:u w:val="single"/>
-          <w:lang w:val="en-AU"/>
-        </w:rPr>
-        <w:t xml:space="preserve"> part</w:t>
-      </w:r>
-    </w:p>
-    <w:p>
-      <w:pPr>
-        <w:rPr>
-          <w:noProof/>
-          <w:sz w:val="22"/>
-          <w:szCs w:val="22"/>
-          <w:lang w:val="en-AU"/>
-        </w:rPr>
-      </w:pPr>
-      <w:r>
-        <w:rPr>
-          <w:noProof/>
-          <w:sz w:val="22"/>
-          <w:szCs w:val="22"/>
-          <w:lang w:val="en-AU"/>
-        </w:rPr>
-        <w:t>When there is</w:t>
-      </w:r>
-      <w:r>
-        <w:rPr>
-          <w:noProof/>
-          <w:sz w:val="22"/>
-          <w:szCs w:val="22"/>
-          <w:lang w:val="en-AU"/>
-        </w:rPr>
-        <w:t xml:space="preserve"> no </w:t>
-      </w:r>
-      <w:r>
-        <w:rPr>
-          <w:noProof/>
-          <w:sz w:val="22"/>
-          <w:szCs w:val="22"/>
-          <w:lang w:val="en-AU"/>
-        </w:rPr>
-        <w:t>cvs</w:t>
-      </w:r>
-      <w:r>
-        <w:rPr>
-          <w:noProof/>
-          <w:sz w:val="22"/>
-          <w:szCs w:val="22"/>
-          <w:lang w:val="en-AU"/>
-        </w:rPr>
-        <w:t xml:space="preserve">. There should be an add button on the </w:t>
-      </w:r>
-      <w:r>
-        <w:rPr>
-          <w:noProof/>
-          <w:sz w:val="22"/>
-          <w:szCs w:val="22"/>
-          <w:lang w:val="en-AU"/>
-        </w:rPr>
-        <w:t xml:space="preserve">button right </w:t>
-      </w:r>
-      <w:r>
-        <w:rPr>
-          <w:noProof/>
-          <w:sz w:val="22"/>
-          <w:szCs w:val="22"/>
-          <w:lang w:val="en-AU"/>
-        </w:rPr>
-        <w:t xml:space="preserve">side so the user can </w:t>
-      </w:r>
-      <w:r>
-        <w:rPr>
-          <w:noProof/>
-          <w:sz w:val="22"/>
-          <w:szCs w:val="22"/>
-          <w:lang w:val="en-AU"/>
-        </w:rPr>
-        <w:t>q</w:t>
-      </w:r>
-      <w:r>
-        <w:rPr>
-          <w:noProof/>
-          <w:sz w:val="22"/>
-          <w:szCs w:val="22"/>
-          <w:lang w:val="en-AU"/>
-        </w:rPr>
-        <w:t xml:space="preserve">uickly add </w:t>
-      </w:r>
-      <w:r>
-        <w:rPr>
-          <w:noProof/>
-          <w:sz w:val="22"/>
-          <w:szCs w:val="22"/>
-          <w:lang w:val="en-AU"/>
-        </w:rPr>
-        <w:t>it.</w:t>
+        <w:drawing>
+          <wp:inline distT="0" distB="0" distL="0" distR="0" wp14:anchorId="59E8F6EC" wp14:editId="1DDCFF79">
+            <wp:extent cx="5731510" cy="6146165"/>
+            <wp:effectExtent l="0" t="0" r="0" b="635"/>
+            <wp:docPr id="1951267003" name="Picture 1"/>
+            <wp:cNvGraphicFramePr>
+              <a:graphicFrameLocks xmlns:a="http://schemas.openxmlformats.org/drawingml/2006/main" noChangeAspect="1"/>
+            </wp:cNvGraphicFramePr>
+            <a:graphic xmlns:a="http://schemas.openxmlformats.org/drawingml/2006/main">
+              <a:graphicData uri="http://schemas.openxmlformats.org/drawingml/2006/picture">
+                <pic:pic xmlns:pic="http://schemas.openxmlformats.org/drawingml/2006/picture">
+                  <pic:nvPicPr>
+                    <pic:cNvPr id="1951267003" name="Picture 1951267003"/>
+                    <pic:cNvPicPr/>
+                  </pic:nvPicPr>
+                  <pic:blipFill>
+                    <a:blip r:embed="rId18">
+                      <a:extLst>
+                        <a:ext uri="{28A0092B-C50C-407E-A947-70E740481C1C}">
+                          <a14:useLocalDpi xmlns:a14="http://schemas.microsoft.com/office/drawing/2010/main" val="0"/>
+                        </a:ext>
+                      </a:extLst>
+                    </a:blip>
+                    <a:stretch>
+                      <a:fillRect/>
+                    </a:stretch>
+                  </pic:blipFill>
+                  <pic:spPr>
+                    <a:xfrm>
+                      <a:off x="0" y="0"/>
+                      <a:ext cx="5731510" cy="6146165"/>
+                    </a:xfrm>
+                    <a:prstGeom prst="rect">
+                      <a:avLst/>
+                    </a:prstGeom>
+                  </pic:spPr>
+                </pic:pic>
+              </a:graphicData>
+            </a:graphic>
+          </wp:inline>
+        </w:drawing>
       </w:r>
     </w:p>
     <w:sectPr>

</xml_diff>

<commit_message>
Media queries aswell as Trying CVS parsing
</commit_message>
<xml_diff>
--- a/Comp sci.docx
+++ b/Comp sci.docx
@@ -69,6 +69,35 @@
         </w:rPr>
         <w:t>I am making a bank budgeting app. It works locally on the device, so there is less security risk. The user uploads the Excel file of their bank statement, and the program then gives a breakdown of their spending. It also has accessibility features such asdark mode, and possibly currency and language options.</w:t>
       </w:r>
+    </w:p>
+    <w:p>
+      <w:pPr>
+        <w:rPr>
+          <w:noProof/>
+          <w:sz w:val="22"/>
+          <w:szCs w:val="22"/>
+          <w:lang w:val="en-AU"/>
+        </w:rPr>
+      </w:pPr>
+    </w:p>
+    <w:p>
+      <w:pPr>
+        <w:rPr>
+          <w:noProof/>
+          <w:sz w:val="22"/>
+          <w:szCs w:val="22"/>
+          <w:lang w:val="en-AU"/>
+        </w:rPr>
+      </w:pPr>
+      <w:r>
+        <w:rPr>
+          <w:noProof/>
+          <w:sz w:val="22"/>
+          <w:szCs w:val="22"/>
+          <w:lang w:val="en-AU"/>
+        </w:rPr>
+        <w:t>High fediatly design using figma AI.</w:t>
+      </w:r>
       <w:r>
         <w:rPr>
           <w:noProof/>
@@ -88,341 +117,242 @@
           <w:lang w:val="en-AU"/>
         </w:rPr>
       </w:pPr>
-    </w:p>
-    <w:p>
-      <w:pPr>
-        <w:rPr>
-          <w:noProof/>
-          <w:sz w:val="22"/>
-          <w:szCs w:val="22"/>
-          <w:lang w:val="en-AU"/>
-        </w:rPr>
-      </w:pPr>
-    </w:p>
-    <w:p>
-      <w:pPr>
-        <w:rPr>
-          <w:noProof/>
-          <w:sz w:val="22"/>
-          <w:szCs w:val="22"/>
-          <w:lang w:val="en-AU"/>
-        </w:rPr>
-      </w:pPr>
-    </w:p>
-    <w:p>
-      <w:pPr>
-        <w:rPr>
-          <w:noProof/>
-          <w:sz w:val="22"/>
-          <w:szCs w:val="22"/>
-          <w:lang w:val="en-AU"/>
-        </w:rPr>
-      </w:pPr>
-    </w:p>
-    <w:p>
-      <w:pPr>
-        <w:rPr>
-          <w:noProof/>
-          <w:sz w:val="22"/>
-          <w:szCs w:val="22"/>
-          <w:lang w:val="en-AU"/>
-        </w:rPr>
-      </w:pPr>
-    </w:p>
-    <w:p>
-      <w:pPr>
-        <w:rPr>
-          <w:noProof/>
-          <w:sz w:val="22"/>
-          <w:szCs w:val="22"/>
-          <w:lang w:val="en-AU"/>
-        </w:rPr>
-      </w:pPr>
-    </w:p>
-    <w:p>
-      <w:pPr>
-        <w:rPr>
-          <w:noProof/>
-          <w:sz w:val="22"/>
-          <w:szCs w:val="22"/>
-          <w:lang w:val="en-AU"/>
-        </w:rPr>
-      </w:pPr>
-    </w:p>
-    <w:p>
-      <w:pPr>
-        <w:rPr>
-          <w:noProof/>
-          <w:sz w:val="22"/>
-          <w:szCs w:val="22"/>
-          <w:lang w:val="en-AU"/>
-        </w:rPr>
-      </w:pPr>
-    </w:p>
-    <w:p>
-      <w:pPr>
-        <w:rPr>
-          <w:noProof/>
-          <w:sz w:val="22"/>
-          <w:szCs w:val="22"/>
-          <w:lang w:val="en-AU"/>
-        </w:rPr>
-      </w:pPr>
-    </w:p>
-    <w:p>
-      <w:pPr>
-        <w:rPr>
-          <w:noProof/>
-          <w:sz w:val="22"/>
-          <w:szCs w:val="22"/>
-          <w:lang w:val="en-AU"/>
-        </w:rPr>
-      </w:pPr>
-      <w:r>
-        <w:rPr>
-          <w:noProof/>
-          <w:sz w:val="22"/>
-          <w:szCs w:val="22"/>
-          <w:lang w:val="en-AU"/>
-        </w:rPr>
-        <w:t xml:space="preserve">Advance Technqies </w:t>
-      </w:r>
-    </w:p>
-    <w:p>
-      <w:pPr>
-        <w:rPr>
-          <w:noProof/>
-          <w:sz w:val="22"/>
-          <w:szCs w:val="22"/>
-          <w:lang w:val="en-AU"/>
-        </w:rPr>
-      </w:pPr>
-      <w:r>
-        <w:rPr>
-          <w:noProof/>
-          <w:sz w:val="22"/>
-          <w:szCs w:val="22"/>
-          <w:lang w:val="en-AU"/>
-        </w:rPr>
-        <w:t>My first adviacne Technqies is going to be using java Scipt for the Progam that breaks down there spending</w:t>
-      </w:r>
-    </w:p>
-    <w:p>
-      <w:pPr>
-        <w:rPr>
-          <w:noProof/>
-          <w:sz w:val="22"/>
-          <w:szCs w:val="22"/>
-          <w:lang w:val="en-AU"/>
-        </w:rPr>
-      </w:pPr>
-    </w:p>
-    <w:p>
-      <w:pPr>
-        <w:rPr>
-          <w:noProof/>
-          <w:sz w:val="22"/>
-          <w:szCs w:val="22"/>
-          <w:lang w:val="en-AU"/>
-        </w:rPr>
-      </w:pPr>
-    </w:p>
-    <w:p>
-      <w:pPr>
-        <w:rPr>
-          <w:noProof/>
-          <w:sz w:val="22"/>
-          <w:szCs w:val="22"/>
-          <w:lang w:val="en-AU"/>
-        </w:rPr>
-      </w:pPr>
-    </w:p>
-    <w:p>
-      <w:pPr>
-        <w:rPr>
-          <w:noProof/>
-          <w:sz w:val="22"/>
-          <w:szCs w:val="22"/>
-          <w:lang w:val="en-AU"/>
-        </w:rPr>
-      </w:pPr>
-    </w:p>
-    <w:p>
-      <w:pPr>
-        <w:rPr>
-          <w:noProof/>
-          <w:sz w:val="22"/>
-          <w:szCs w:val="22"/>
-          <w:lang w:val="en-AU"/>
-        </w:rPr>
-      </w:pPr>
-    </w:p>
-    <w:p>
-      <w:pPr>
-        <w:rPr>
-          <w:noProof/>
-          <w:sz w:val="22"/>
-          <w:szCs w:val="22"/>
-          <w:lang w:val="en-AU"/>
-        </w:rPr>
-      </w:pPr>
-    </w:p>
-    <w:p>
-      <w:pPr>
-        <w:rPr>
-          <w:noProof/>
-          <w:sz w:val="22"/>
-          <w:szCs w:val="22"/>
-          <w:lang w:val="en-AU"/>
-        </w:rPr>
-      </w:pPr>
-    </w:p>
-    <w:p>
-      <w:pPr>
-        <w:rPr>
-          <w:noProof/>
-          <w:sz w:val="22"/>
-          <w:szCs w:val="22"/>
-          <w:lang w:val="en-AU"/>
-        </w:rPr>
-      </w:pPr>
-    </w:p>
-    <w:p>
-      <w:pPr>
-        <w:rPr>
-          <w:noProof/>
-          <w:sz w:val="22"/>
-          <w:szCs w:val="22"/>
-          <w:lang w:val="en-AU"/>
-        </w:rPr>
-      </w:pPr>
-    </w:p>
-    <w:p>
-      <w:pPr>
-        <w:rPr>
-          <w:noProof/>
-          <w:sz w:val="22"/>
-          <w:szCs w:val="22"/>
-          <w:lang w:val="en-AU"/>
-        </w:rPr>
-      </w:pPr>
-    </w:p>
-    <w:p>
-      <w:pPr>
-        <w:rPr>
-          <w:noProof/>
-          <w:sz w:val="22"/>
-          <w:szCs w:val="22"/>
-          <w:lang w:val="en-AU"/>
-        </w:rPr>
-      </w:pPr>
-    </w:p>
-    <w:p>
-      <w:pPr>
-        <w:rPr>
-          <w:noProof/>
-          <w:sz w:val="22"/>
-          <w:szCs w:val="22"/>
-          <w:lang w:val="en-AU"/>
-        </w:rPr>
-      </w:pPr>
-    </w:p>
-    <w:p>
-      <w:pPr>
-        <w:rPr>
-          <w:noProof/>
-          <w:sz w:val="22"/>
-          <w:szCs w:val="22"/>
-          <w:lang w:val="en-AU"/>
-        </w:rPr>
-      </w:pPr>
-      <w:r>
-        <w:rPr>
-          <w:noProof/>
-          <w:sz w:val="22"/>
-          <w:szCs w:val="22"/>
-          <w:lang w:val="en-AU"/>
-        </w:rPr>
-        <w:br/>
-      </w:r>
-      <w:r>
-        <w:rPr>
-          <w:noProof/>
-          <w:sz w:val="22"/>
-          <w:szCs w:val="22"/>
-          <w:lang w:val="en-AU"/>
-        </w:rPr>
-        <w:br/>
-        <w:t>Two Relvent Implactions</w:t>
-      </w:r>
-    </w:p>
-    <w:p>
-      <w:pPr>
-        <w:rPr>
-          <w:noProof/>
-          <w:sz w:val="22"/>
-          <w:szCs w:val="22"/>
-          <w:lang w:val="en-AU"/>
-        </w:rPr>
-      </w:pPr>
-      <w:r>
-        <w:rPr>
-          <w:noProof/>
-          <w:sz w:val="22"/>
-          <w:szCs w:val="22"/>
-          <w:lang w:val="en-AU"/>
-        </w:rPr>
-        <w:t xml:space="preserve">My two relvent impcations are going to be </w:t>
-      </w:r>
-    </w:p>
-    <w:p>
-      <w:pPr>
-        <w:rPr>
-          <w:noProof/>
-          <w:sz w:val="22"/>
-          <w:szCs w:val="22"/>
-          <w:lang w:val="en-AU"/>
-        </w:rPr>
-      </w:pPr>
-      <w:r>
-        <w:rPr>
-          <w:noProof/>
-          <w:sz w:val="22"/>
-          <w:szCs w:val="22"/>
-          <w:lang w:val="en-AU"/>
-        </w:rPr>
-        <w:tab/>
-        <w:t xml:space="preserve">Accessibity with the abity to turn on dark mode </w:t>
-      </w:r>
-    </w:p>
-    <w:p>
-      <w:pPr>
-        <w:rPr>
-          <w:noProof/>
-          <w:sz w:val="22"/>
-          <w:szCs w:val="22"/>
-          <w:lang w:val="en-AU"/>
-        </w:rPr>
-      </w:pPr>
-      <w:r>
-        <w:rPr>
-          <w:noProof/>
-          <w:sz w:val="22"/>
-          <w:szCs w:val="22"/>
-          <w:lang w:val="en-AU"/>
-        </w:rPr>
-        <w:tab/>
-        <w:t xml:space="preserve">Privacy will also be there as all the data is stored locally on the device  </w:t>
-      </w:r>
-      <w:r>
-        <w:rPr>
-          <w:noProof/>
-          <w:sz w:val="22"/>
-          <w:szCs w:val="22"/>
-          <w:lang w:val="en-AU"/>
-        </w:rPr>
-        <w:br/>
-      </w:r>
+      <w:r>
+        <w:rPr>
+          <w:noProof/>
+          <w:sz w:val="22"/>
+          <w:szCs w:val="22"/>
+          <w:lang w:val="en-AU"/>
+        </w:rPr>
+        <w:drawing>
+          <wp:inline distT="0" distB="0" distL="0" distR="0" wp14:anchorId="11C2FC56" wp14:editId="77598371">
+            <wp:extent cx="1353671" cy="2635428"/>
+            <wp:effectExtent l="0" t="0" r="5715" b="0"/>
+            <wp:docPr id="1256952579" name="Picture 1"/>
+            <wp:cNvGraphicFramePr>
+              <a:graphicFrameLocks xmlns:a="http://schemas.openxmlformats.org/drawingml/2006/main" noChangeAspect="1"/>
+            </wp:cNvGraphicFramePr>
+            <a:graphic xmlns:a="http://schemas.openxmlformats.org/drawingml/2006/main">
+              <a:graphicData uri="http://schemas.openxmlformats.org/drawingml/2006/picture">
+                <pic:pic xmlns:pic="http://schemas.openxmlformats.org/drawingml/2006/picture">
+                  <pic:nvPicPr>
+                    <pic:cNvPr id="1256952579" name="Picture 1256952579"/>
+                    <pic:cNvPicPr/>
+                  </pic:nvPicPr>
+                  <pic:blipFill>
+                    <a:blip r:embed="rId4" cstate="print">
+                      <a:extLst>
+                        <a:ext uri="{28A0092B-C50C-407E-A947-70E740481C1C}">
+                          <a14:useLocalDpi xmlns:a14="http://schemas.microsoft.com/office/drawing/2010/main" val="0"/>
+                        </a:ext>
+                      </a:extLst>
+                    </a:blip>
+                    <a:stretch>
+                      <a:fillRect/>
+                    </a:stretch>
+                  </pic:blipFill>
+                  <pic:spPr>
+                    <a:xfrm>
+                      <a:off x="0" y="0"/>
+                      <a:ext cx="1368561" cy="2664418"/>
+                    </a:xfrm>
+                    <a:prstGeom prst="rect">
+                      <a:avLst/>
+                    </a:prstGeom>
+                  </pic:spPr>
+                </pic:pic>
+              </a:graphicData>
+            </a:graphic>
+          </wp:inline>
+        </w:drawing>
+      </w:r>
+      <w:r>
+        <w:rPr>
+          <w:noProof/>
+          <w:sz w:val="22"/>
+          <w:szCs w:val="22"/>
+          <w:lang w:val="en-AU"/>
+        </w:rPr>
+        <w:drawing>
+          <wp:inline distT="0" distB="0" distL="0" distR="0" wp14:anchorId="3D288903" wp14:editId="43AB579D">
+            <wp:extent cx="1225844" cy="2634450"/>
+            <wp:effectExtent l="0" t="0" r="6350" b="0"/>
+            <wp:docPr id="1600084316" name="Picture 2"/>
+            <wp:cNvGraphicFramePr>
+              <a:graphicFrameLocks xmlns:a="http://schemas.openxmlformats.org/drawingml/2006/main" noChangeAspect="1"/>
+            </wp:cNvGraphicFramePr>
+            <a:graphic xmlns:a="http://schemas.openxmlformats.org/drawingml/2006/main">
+              <a:graphicData uri="http://schemas.openxmlformats.org/drawingml/2006/picture">
+                <pic:pic xmlns:pic="http://schemas.openxmlformats.org/drawingml/2006/picture">
+                  <pic:nvPicPr>
+                    <pic:cNvPr id="1600084316" name="Picture 1600084316"/>
+                    <pic:cNvPicPr/>
+                  </pic:nvPicPr>
+                  <pic:blipFill>
+                    <a:blip r:embed="rId5" cstate="print">
+                      <a:extLst>
+                        <a:ext uri="{28A0092B-C50C-407E-A947-70E740481C1C}">
+                          <a14:useLocalDpi xmlns:a14="http://schemas.microsoft.com/office/drawing/2010/main" val="0"/>
+                        </a:ext>
+                      </a:extLst>
+                    </a:blip>
+                    <a:stretch>
+                      <a:fillRect/>
+                    </a:stretch>
+                  </pic:blipFill>
+                  <pic:spPr>
+                    <a:xfrm>
+                      <a:off x="0" y="0"/>
+                      <a:ext cx="1250629" cy="2687715"/>
+                    </a:xfrm>
+                    <a:prstGeom prst="rect">
+                      <a:avLst/>
+                    </a:prstGeom>
+                  </pic:spPr>
+                </pic:pic>
+              </a:graphicData>
+            </a:graphic>
+          </wp:inline>
+        </w:drawing>
+      </w:r>
+      <w:r>
+        <w:rPr>
+          <w:noProof/>
+          <w:sz w:val="22"/>
+          <w:szCs w:val="22"/>
+          <w:lang w:val="en-AU"/>
+        </w:rPr>
+        <w:drawing>
+          <wp:inline distT="0" distB="0" distL="0" distR="0" wp14:anchorId="24873310" wp14:editId="386988A1">
+            <wp:extent cx="1188006" cy="2635213"/>
+            <wp:effectExtent l="0" t="0" r="6350" b="0"/>
+            <wp:docPr id="1476646389" name="Picture 3"/>
+            <wp:cNvGraphicFramePr>
+              <a:graphicFrameLocks xmlns:a="http://schemas.openxmlformats.org/drawingml/2006/main" noChangeAspect="1"/>
+            </wp:cNvGraphicFramePr>
+            <a:graphic xmlns:a="http://schemas.openxmlformats.org/drawingml/2006/main">
+              <a:graphicData uri="http://schemas.openxmlformats.org/drawingml/2006/picture">
+                <pic:pic xmlns:pic="http://schemas.openxmlformats.org/drawingml/2006/picture">
+                  <pic:nvPicPr>
+                    <pic:cNvPr id="1476646389" name="Picture 1476646389"/>
+                    <pic:cNvPicPr/>
+                  </pic:nvPicPr>
+                  <pic:blipFill>
+                    <a:blip r:embed="rId6" cstate="print">
+                      <a:extLst>
+                        <a:ext uri="{28A0092B-C50C-407E-A947-70E740481C1C}">
+                          <a14:useLocalDpi xmlns:a14="http://schemas.microsoft.com/office/drawing/2010/main" val="0"/>
+                        </a:ext>
+                      </a:extLst>
+                    </a:blip>
+                    <a:stretch>
+                      <a:fillRect/>
+                    </a:stretch>
+                  </pic:blipFill>
+                  <pic:spPr>
+                    <a:xfrm>
+                      <a:off x="0" y="0"/>
+                      <a:ext cx="1221663" cy="2709870"/>
+                    </a:xfrm>
+                    <a:prstGeom prst="rect">
+                      <a:avLst/>
+                    </a:prstGeom>
+                  </pic:spPr>
+                </pic:pic>
+              </a:graphicData>
+            </a:graphic>
+          </wp:inline>
+        </w:drawing>
+      </w:r>
+      <w:r>
+        <w:rPr>
+          <w:noProof/>
+          <w:sz w:val="22"/>
+          <w:szCs w:val="22"/>
+          <w:lang w:val="en-AU"/>
+        </w:rPr>
+        <w:drawing>
+          <wp:inline distT="0" distB="0" distL="0" distR="0" wp14:anchorId="2B9635C9" wp14:editId="0E8FA996">
+            <wp:extent cx="1239699" cy="2707285"/>
+            <wp:effectExtent l="0" t="0" r="5080" b="0"/>
+            <wp:docPr id="416072015" name="Picture 4"/>
+            <wp:cNvGraphicFramePr>
+              <a:graphicFrameLocks xmlns:a="http://schemas.openxmlformats.org/drawingml/2006/main" noChangeAspect="1"/>
+            </wp:cNvGraphicFramePr>
+            <a:graphic xmlns:a="http://schemas.openxmlformats.org/drawingml/2006/main">
+              <a:graphicData uri="http://schemas.openxmlformats.org/drawingml/2006/picture">
+                <pic:pic xmlns:pic="http://schemas.openxmlformats.org/drawingml/2006/picture">
+                  <pic:nvPicPr>
+                    <pic:cNvPr id="416072015" name="Picture 416072015"/>
+                    <pic:cNvPicPr/>
+                  </pic:nvPicPr>
+                  <pic:blipFill>
+                    <a:blip r:embed="rId7" cstate="print">
+                      <a:extLst>
+                        <a:ext uri="{28A0092B-C50C-407E-A947-70E740481C1C}">
+                          <a14:useLocalDpi xmlns:a14="http://schemas.microsoft.com/office/drawing/2010/main" val="0"/>
+                        </a:ext>
+                      </a:extLst>
+                    </a:blip>
+                    <a:stretch>
+                      <a:fillRect/>
+                    </a:stretch>
+                  </pic:blipFill>
+                  <pic:spPr>
+                    <a:xfrm>
+                      <a:off x="0" y="0"/>
+                      <a:ext cx="1259716" cy="2750998"/>
+                    </a:xfrm>
+                    <a:prstGeom prst="rect">
+                      <a:avLst/>
+                    </a:prstGeom>
+                  </pic:spPr>
+                </pic:pic>
+              </a:graphicData>
+            </a:graphic>
+          </wp:inline>
+        </w:drawing>
+      </w:r>
+    </w:p>
+    <w:p>
+      <w:pPr>
+        <w:rPr>
+          <w:noProof/>
+          <w:sz w:val="22"/>
+          <w:szCs w:val="22"/>
+          <w:lang w:val="en-AU"/>
+        </w:rPr>
+      </w:pPr>
+    </w:p>
+    <w:p>
+      <w:pPr>
+        <w:rPr>
+          <w:noProof/>
+          <w:sz w:val="22"/>
+          <w:szCs w:val="22"/>
+          <w:lang w:val="en-AU"/>
+        </w:rPr>
+      </w:pPr>
+    </w:p>
+    <w:p>
+      <w:pPr>
+        <w:rPr>
+          <w:noProof/>
+          <w:sz w:val="22"/>
+          <w:szCs w:val="22"/>
+          <w:lang w:val="en-AU"/>
+        </w:rPr>
+      </w:pPr>
+    </w:p>
+    <w:p>
+      <w:pPr>
+        <w:rPr>
+          <w:noProof/>
+          <w:sz w:val="22"/>
+          <w:szCs w:val="22"/>
+          <w:lang w:val="en-AU"/>
+        </w:rPr>
+      </w:pPr>
       <w:r>
         <w:rPr>
           <w:noProof/>
@@ -490,7 +420,7 @@
                     <pic:cNvPicPr/>
                   </pic:nvPicPr>
                   <pic:blipFill>
-                    <a:blip r:embed="rId4" cstate="print">
+                    <a:blip r:embed="rId8" cstate="print">
                       <a:extLst>
                         <a:ext uri="{28A0092B-C50C-407E-A947-70E740481C1C}">
                           <a14:useLocalDpi xmlns:a14="http://schemas.microsoft.com/office/drawing/2010/main" val="0"/>
@@ -690,7 +620,7 @@
                     <pic:cNvPicPr/>
                   </pic:nvPicPr>
                   <pic:blipFill>
-                    <a:blip r:embed="rId5" cstate="print">
+                    <a:blip r:embed="rId9" cstate="print">
                       <a:extLst>
                         <a:ext uri="{28A0092B-C50C-407E-A947-70E740481C1C}">
                           <a14:useLocalDpi xmlns:a14="http://schemas.microsoft.com/office/drawing/2010/main" val="0"/>
@@ -893,7 +823,7 @@
                     <pic:cNvPicPr/>
                   </pic:nvPicPr>
                   <pic:blipFill>
-                    <a:blip r:embed="rId6" cstate="print">
+                    <a:blip r:embed="rId10" cstate="print">
                       <a:extLst>
                         <a:ext uri="{28A0092B-C50C-407E-A947-70E740481C1C}">
                           <a14:useLocalDpi xmlns:a14="http://schemas.microsoft.com/office/drawing/2010/main" val="0"/>
@@ -954,7 +884,7 @@
         </w:rPr>
         <w:t xml:space="preserve">Loved the theme on this </w:t>
       </w:r>
-      <w:hyperlink r:id="rId7" w:history="1">
+      <w:hyperlink r:id="rId11" w:history="1">
         <w:r>
           <w:rPr>
             <w:rStyle w:val="Hyperlink"/>
@@ -1000,7 +930,7 @@
         </w:rPr>
         <w:t>C</w:t>
       </w:r>
-      <w:hyperlink r:id="rId8" w:history="1">
+      <w:hyperlink r:id="rId12" w:history="1">
         <w:r>
           <w:rPr>
             <w:rStyle w:val="Hyperlink"/>
@@ -1049,7 +979,7 @@
         </w:rPr>
         <w:t xml:space="preserve">Font is from </w:t>
       </w:r>
-      <w:hyperlink r:id="rId9" w:history="1">
+      <w:hyperlink r:id="rId13" w:history="1">
         <w:r>
           <w:rPr>
             <w:rStyle w:val="Hyperlink"/>
@@ -1138,6 +1068,132 @@
     <w:p>
       <w:pPr>
         <w:rPr>
+          <w:sz w:val="28"/>
+          <w:szCs w:val="28"/>
+          <w:lang w:val="en-AU"/>
+        </w:rPr>
+      </w:pPr>
+    </w:p>
+    <w:p>
+      <w:pPr>
+        <w:rPr>
+          <w:sz w:val="28"/>
+          <w:szCs w:val="28"/>
+          <w:lang w:val="en-AU"/>
+        </w:rPr>
+      </w:pPr>
+    </w:p>
+    <w:p>
+      <w:pPr>
+        <w:rPr>
+          <w:sz w:val="28"/>
+          <w:szCs w:val="28"/>
+          <w:lang w:val="en-AU"/>
+        </w:rPr>
+      </w:pPr>
+      <w:r>
+        <w:rPr>
+          <w:sz w:val="28"/>
+          <w:szCs w:val="28"/>
+          <w:lang w:val="en-AU"/>
+        </w:rPr>
+        <w:lastRenderedPageBreak/>
+        <w:t xml:space="preserve">Two Advance Techcqies </w:t>
+      </w:r>
+    </w:p>
+    <w:p>
+      <w:pPr>
+        <w:rPr>
+          <w:sz w:val="28"/>
+          <w:szCs w:val="28"/>
+          <w:lang w:val="en-AU"/>
+        </w:rPr>
+      </w:pPr>
+      <w:r>
+        <w:rPr>
+          <w:sz w:val="28"/>
+          <w:szCs w:val="28"/>
+          <w:lang w:val="en-AU"/>
+        </w:rPr>
+        <w:tab/>
+        <w:t>-Media Queries</w:t>
+      </w:r>
+    </w:p>
+    <w:p>
+      <w:pPr>
+        <w:rPr>
+          <w:sz w:val="28"/>
+          <w:szCs w:val="28"/>
+          <w:lang w:val="en-AU"/>
+        </w:rPr>
+      </w:pPr>
+      <w:r>
+        <w:rPr>
+          <w:sz w:val="28"/>
+          <w:szCs w:val="28"/>
+          <w:lang w:val="en-AU"/>
+        </w:rPr>
+        <w:tab/>
+        <w:t xml:space="preserve">- CVS using </w:t>
+      </w:r>
+    </w:p>
+    <w:p>
+      <w:pPr>
+        <w:rPr>
+          <w:sz w:val="28"/>
+          <w:szCs w:val="28"/>
+          <w:lang w:val="en-AU"/>
+        </w:rPr>
+      </w:pPr>
+    </w:p>
+    <w:p>
+      <w:pPr>
+        <w:rPr>
+          <w:sz w:val="28"/>
+          <w:szCs w:val="28"/>
+          <w:lang w:val="en-AU"/>
+        </w:rPr>
+      </w:pPr>
+    </w:p>
+    <w:p>
+      <w:pPr>
+        <w:rPr>
+          <w:sz w:val="28"/>
+          <w:szCs w:val="28"/>
+          <w:lang w:val="en-AU"/>
+        </w:rPr>
+      </w:pPr>
+    </w:p>
+    <w:p>
+      <w:pPr>
+        <w:rPr>
+          <w:sz w:val="28"/>
+          <w:szCs w:val="28"/>
+          <w:lang w:val="en-AU"/>
+        </w:rPr>
+      </w:pPr>
+    </w:p>
+    <w:p>
+      <w:pPr>
+        <w:rPr>
+          <w:sz w:val="28"/>
+          <w:szCs w:val="28"/>
+          <w:lang w:val="en-AU"/>
+        </w:rPr>
+      </w:pPr>
+    </w:p>
+    <w:p>
+      <w:pPr>
+        <w:rPr>
+          <w:sz w:val="28"/>
+          <w:szCs w:val="28"/>
+          <w:lang w:val="en-AU"/>
+        </w:rPr>
+      </w:pPr>
+    </w:p>
+    <w:p>
+      <w:pPr>
+        <w:rPr>
           <w:b/>
           <w:bCs/>
           <w:sz w:val="28"/>
@@ -1173,6 +1229,30 @@
     <w:p>
       <w:pPr>
         <w:rPr>
+          <w:b/>
+          <w:bCs/>
+          <w:sz w:val="28"/>
+          <w:szCs w:val="28"/>
+          <w:u w:val="single"/>
+          <w:lang w:val="en-AU"/>
+        </w:rPr>
+      </w:pPr>
+    </w:p>
+    <w:p>
+      <w:pPr>
+        <w:rPr>
+          <w:b/>
+          <w:bCs/>
+          <w:sz w:val="28"/>
+          <w:szCs w:val="28"/>
+          <w:u w:val="single"/>
+          <w:lang w:val="en-AU"/>
+        </w:rPr>
+      </w:pPr>
+    </w:p>
+    <w:p>
+      <w:pPr>
+        <w:rPr>
           <w:sz w:val="22"/>
           <w:szCs w:val="22"/>
           <w:lang w:val="en-AU"/>
@@ -1202,7 +1282,7 @@
         </w:rPr>
         <w:t>before I changed my idea, I would still like to use the mobile Menu form UI verse (</w:t>
       </w:r>
-      <w:hyperlink r:id="rId10" w:history="1">
+      <w:hyperlink r:id="rId14" w:history="1">
         <w:r>
           <w:rPr>
             <w:rStyle w:val="Hyperlink"/>
@@ -1299,7 +1379,7 @@
                     <pic:cNvPicPr/>
                   </pic:nvPicPr>
                   <pic:blipFill>
-                    <a:blip r:embed="rId11" cstate="print">
+                    <a:blip r:embed="rId15" cstate="print">
                       <a:extLst>
                         <a:ext uri="{28A0092B-C50C-407E-A947-70E740481C1C}">
                           <a14:useLocalDpi xmlns:a14="http://schemas.microsoft.com/office/drawing/2010/main" val="0"/>
@@ -1371,7 +1451,7 @@
                     <pic:cNvPicPr/>
                   </pic:nvPicPr>
                   <pic:blipFill>
-                    <a:blip r:embed="rId12" cstate="print">
+                    <a:blip r:embed="rId16" cstate="print">
                       <a:extLst>
                         <a:ext uri="{28A0092B-C50C-407E-A947-70E740481C1C}">
                           <a14:useLocalDpi xmlns:a14="http://schemas.microsoft.com/office/drawing/2010/main" val="0"/>
@@ -1531,7 +1611,7 @@
                     <pic:cNvPicPr/>
                   </pic:nvPicPr>
                   <pic:blipFill>
-                    <a:blip r:embed="rId13" cstate="print">
+                    <a:blip r:embed="rId17" cstate="print">
                       <a:extLst>
                         <a:ext uri="{28A0092B-C50C-407E-A947-70E740481C1C}">
                           <a14:useLocalDpi xmlns:a14="http://schemas.microsoft.com/office/drawing/2010/main" val="0"/>
@@ -1753,7 +1833,7 @@
                     <pic:cNvPicPr/>
                   </pic:nvPicPr>
                   <pic:blipFill>
-                    <a:blip r:embed="rId14" cstate="print">
+                    <a:blip r:embed="rId18" cstate="print">
                       <a:extLst>
                         <a:ext uri="{28A0092B-C50C-407E-A947-70E740481C1C}">
                           <a14:useLocalDpi xmlns:a14="http://schemas.microsoft.com/office/drawing/2010/main" val="0"/>
@@ -1954,7 +2034,7 @@
                     <pic:cNvPicPr/>
                   </pic:nvPicPr>
                   <pic:blipFill>
-                    <a:blip r:embed="rId15" cstate="print">
+                    <a:blip r:embed="rId19" cstate="print">
                       <a:extLst>
                         <a:ext uri="{28A0092B-C50C-407E-A947-70E740481C1C}">
                           <a14:useLocalDpi xmlns:a14="http://schemas.microsoft.com/office/drawing/2010/main" val="0"/>
@@ -2107,7 +2187,7 @@
                     <pic:cNvPicPr/>
                   </pic:nvPicPr>
                   <pic:blipFill>
-                    <a:blip r:embed="rId16" cstate="print">
+                    <a:blip r:embed="rId20" cstate="print">
                       <a:extLst>
                         <a:ext uri="{28A0092B-C50C-407E-A947-70E740481C1C}">
                           <a14:useLocalDpi xmlns:a14="http://schemas.microsoft.com/office/drawing/2010/main" val="0"/>
@@ -2215,7 +2295,7 @@
                     <pic:cNvPicPr/>
                   </pic:nvPicPr>
                   <pic:blipFill>
-                    <a:blip r:embed="rId17" cstate="print">
+                    <a:blip r:embed="rId21" cstate="print">
                       <a:extLst>
                         <a:ext uri="{28A0092B-C50C-407E-A947-70E740481C1C}">
                           <a14:useLocalDpi xmlns:a14="http://schemas.microsoft.com/office/drawing/2010/main" val="0"/>
@@ -2600,30 +2680,166 @@
           <w:u w:val="single"/>
           <w:lang w:val="en-AU"/>
         </w:rPr>
-        <w:t>Addin</w:t>
-      </w:r>
-      <w:r>
-        <w:rPr>
-          <w:b/>
-          <w:bCs/>
-          <w:noProof/>
-          <w:sz w:val="28"/>
-          <w:szCs w:val="28"/>
-          <w:u w:val="single"/>
-          <w:lang w:val="en-AU"/>
-        </w:rPr>
-        <w:t>g the Parts to settings like the wire frame</w:t>
-      </w:r>
-    </w:p>
-    <w:p>
-      <w:pPr>
-        <w:rPr>
-          <w:noProof/>
-          <w:sz w:val="22"/>
-          <w:szCs w:val="22"/>
-          <w:lang w:val="en-AU"/>
-        </w:rPr>
-      </w:pPr>
+        <w:t>Adding the Parts to settings like the wire frame</w:t>
+      </w:r>
+    </w:p>
+    <w:p>
+      <w:pPr>
+        <w:rPr>
+          <w:b/>
+          <w:bCs/>
+          <w:noProof/>
+          <w:sz w:val="28"/>
+          <w:szCs w:val="28"/>
+          <w:u w:val="single"/>
+          <w:lang w:val="en-AU"/>
+        </w:rPr>
+      </w:pPr>
+      <w:r>
+        <w:rPr>
+          <w:noProof/>
+          <w:sz w:val="22"/>
+          <w:szCs w:val="22"/>
+          <w:lang w:val="en-AU"/>
+        </w:rPr>
+        <w:drawing>
+          <wp:anchor distT="0" distB="0" distL="114300" distR="114300" simplePos="0" relativeHeight="251668480" behindDoc="0" locked="0" layoutInCell="1" allowOverlap="1" wp14:anchorId="425C9323" wp14:editId="203A0156">
+            <wp:simplePos x="0" y="0"/>
+            <wp:positionH relativeFrom="column">
+              <wp:posOffset>-367553</wp:posOffset>
+            </wp:positionH>
+            <wp:positionV relativeFrom="paragraph">
+              <wp:posOffset>225537</wp:posOffset>
+            </wp:positionV>
+            <wp:extent cx="2275200" cy="2570400"/>
+            <wp:effectExtent l="0" t="0" r="0" b="0"/>
+            <wp:wrapSquare wrapText="bothSides"/>
+            <wp:docPr id="1997093588" name="Picture 1"/>
+            <wp:cNvGraphicFramePr>
+              <a:graphicFrameLocks xmlns:a="http://schemas.openxmlformats.org/drawingml/2006/main" noChangeAspect="1"/>
+            </wp:cNvGraphicFramePr>
+            <a:graphic xmlns:a="http://schemas.openxmlformats.org/drawingml/2006/main">
+              <a:graphicData uri="http://schemas.openxmlformats.org/drawingml/2006/picture">
+                <pic:pic xmlns:pic="http://schemas.openxmlformats.org/drawingml/2006/picture">
+                  <pic:nvPicPr>
+                    <pic:cNvPr id="1997093588" name="Picture 1997093588"/>
+                    <pic:cNvPicPr/>
+                  </pic:nvPicPr>
+                  <pic:blipFill>
+                    <a:blip r:embed="rId22" cstate="print">
+                      <a:extLst>
+                        <a:ext uri="{28A0092B-C50C-407E-A947-70E740481C1C}">
+                          <a14:useLocalDpi xmlns:a14="http://schemas.microsoft.com/office/drawing/2010/main" val="0"/>
+                        </a:ext>
+                      </a:extLst>
+                    </a:blip>
+                    <a:stretch>
+                      <a:fillRect/>
+                    </a:stretch>
+                  </pic:blipFill>
+                  <pic:spPr>
+                    <a:xfrm>
+                      <a:off x="0" y="0"/>
+                      <a:ext cx="2275200" cy="2570400"/>
+                    </a:xfrm>
+                    <a:prstGeom prst="rect">
+                      <a:avLst/>
+                    </a:prstGeom>
+                  </pic:spPr>
+                </pic:pic>
+              </a:graphicData>
+            </a:graphic>
+            <wp14:sizeRelH relativeFrom="margin">
+              <wp14:pctWidth>0</wp14:pctWidth>
+            </wp14:sizeRelH>
+            <wp14:sizeRelV relativeFrom="margin">
+              <wp14:pctHeight>0</wp14:pctHeight>
+            </wp14:sizeRelV>
+          </wp:anchor>
+        </w:drawing>
+      </w:r>
+    </w:p>
+    <w:p>
+      <w:pPr>
+        <w:rPr>
+          <w:noProof/>
+          <w:sz w:val="22"/>
+          <w:szCs w:val="22"/>
+          <w:lang w:val="en-AU"/>
+        </w:rPr>
+      </w:pPr>
+      <w:r>
+        <w:rPr>
+          <w:noProof/>
+          <w:sz w:val="22"/>
+          <w:szCs w:val="22"/>
+          <w:lang w:val="en-AU"/>
+        </w:rPr>
+        <w:t xml:space="preserve">To align with the wireframe, I built the settings section using dedicated &lt;div&gt; rows. I used Flexbox specifically gap for uniform spacing and space-between to make the layout adapt responsively to any phone width. I </w:t>
+      </w:r>
+      <w:r>
+        <w:rPr>
+          <w:noProof/>
+          <w:sz w:val="22"/>
+          <w:szCs w:val="22"/>
+          <w:lang w:val="en-AU"/>
+        </w:rPr>
+        <w:t>used</w:t>
+      </w:r>
+      <w:r>
+        <w:rPr>
+          <w:noProof/>
+          <w:sz w:val="22"/>
+          <w:szCs w:val="22"/>
+          <w:lang w:val="en-AU"/>
+        </w:rPr>
+        <w:t xml:space="preserve">  a toggle switch for dark mode</w:t>
+      </w:r>
+      <w:r>
+        <w:rPr>
+          <w:noProof/>
+          <w:sz w:val="22"/>
+          <w:szCs w:val="22"/>
+          <w:lang w:val="en-AU"/>
+        </w:rPr>
+        <w:t xml:space="preserve">, form </w:t>
+      </w:r>
+      <w:r>
+        <w:rPr>
+          <w:noProof/>
+          <w:sz w:val="22"/>
+          <w:szCs w:val="22"/>
+          <w:lang w:val="en-AU"/>
+        </w:rPr>
+        <w:t>UIverse.</w:t>
+      </w:r>
+      <w:r>
+        <w:rPr>
+          <w:noProof/>
+          <w:sz w:val="22"/>
+          <w:szCs w:val="22"/>
+          <w:lang w:val="en-AU"/>
+        </w:rPr>
+        <w:t xml:space="preserve"> </w:t>
+      </w:r>
+      <w:r>
+        <w:rPr>
+          <w:noProof/>
+          <w:sz w:val="22"/>
+          <w:szCs w:val="22"/>
+          <w:lang w:val="en-AU"/>
+        </w:rPr>
+        <w:t>and</w:t>
+      </w:r>
+      <w:r>
+        <w:rPr>
+          <w:noProof/>
+          <w:sz w:val="22"/>
+          <w:szCs w:val="22"/>
+          <w:lang w:val="en-AU"/>
+        </w:rPr>
+        <w:t xml:space="preserve"> used &lt;select&gt; tags for currency and language to manage long lists of options.</w:t>
+      </w:r>
     </w:p>
     <w:p>
       <w:pPr>
@@ -2658,7 +2874,7 @@
                     <pic:cNvPicPr/>
                   </pic:nvPicPr>
                   <pic:blipFill>
-                    <a:blip r:embed="rId18">
+                    <a:blip r:embed="rId23">
                       <a:extLst>
                         <a:ext uri="{28A0092B-C50C-407E-A947-70E740481C1C}">
                           <a14:useLocalDpi xmlns:a14="http://schemas.microsoft.com/office/drawing/2010/main" val="0"/>

</xml_diff>

<commit_message>
Made new .html pages connect, with the nav bar.
</commit_message>
<xml_diff>
--- a/Comp sci.docx
+++ b/Comp sci.docx
@@ -2850,6 +2850,106 @@
           <w:lang w:val="en-AU"/>
         </w:rPr>
       </w:pPr>
+    </w:p>
+    <w:p>
+      <w:pPr>
+        <w:rPr>
+          <w:noProof/>
+          <w:sz w:val="22"/>
+          <w:szCs w:val="22"/>
+          <w:lang w:val="en-AU"/>
+        </w:rPr>
+      </w:pPr>
+    </w:p>
+    <w:p>
+      <w:pPr>
+        <w:rPr>
+          <w:noProof/>
+          <w:sz w:val="22"/>
+          <w:szCs w:val="22"/>
+          <w:lang w:val="en-AU"/>
+        </w:rPr>
+      </w:pPr>
+    </w:p>
+    <w:p>
+      <w:pPr>
+        <w:rPr>
+          <w:noProof/>
+          <w:sz w:val="22"/>
+          <w:szCs w:val="22"/>
+          <w:lang w:val="en-AU"/>
+        </w:rPr>
+      </w:pPr>
+    </w:p>
+    <w:p>
+      <w:pPr>
+        <w:rPr>
+          <w:noProof/>
+          <w:sz w:val="22"/>
+          <w:szCs w:val="22"/>
+          <w:lang w:val="en-AU"/>
+        </w:rPr>
+      </w:pPr>
+    </w:p>
+    <w:p>
+      <w:pPr>
+        <w:rPr>
+          <w:noProof/>
+          <w:sz w:val="22"/>
+          <w:szCs w:val="22"/>
+          <w:lang w:val="en-AU"/>
+        </w:rPr>
+      </w:pPr>
+    </w:p>
+    <w:p>
+      <w:pPr>
+        <w:rPr>
+          <w:noProof/>
+          <w:sz w:val="22"/>
+          <w:szCs w:val="22"/>
+          <w:lang w:val="en-AU"/>
+        </w:rPr>
+      </w:pPr>
+    </w:p>
+    <w:p>
+      <w:pPr>
+        <w:rPr>
+          <w:noProof/>
+          <w:sz w:val="22"/>
+          <w:szCs w:val="22"/>
+          <w:lang w:val="en-AU"/>
+        </w:rPr>
+      </w:pPr>
+    </w:p>
+    <w:p>
+      <w:pPr>
+        <w:rPr>
+          <w:noProof/>
+          <w:sz w:val="22"/>
+          <w:szCs w:val="22"/>
+          <w:lang w:val="en-AU"/>
+        </w:rPr>
+      </w:pPr>
+    </w:p>
+    <w:p>
+      <w:pPr>
+        <w:rPr>
+          <w:noProof/>
+          <w:sz w:val="22"/>
+          <w:szCs w:val="22"/>
+          <w:lang w:val="en-AU"/>
+        </w:rPr>
+      </w:pPr>
+    </w:p>
+    <w:p>
+      <w:pPr>
+        <w:rPr>
+          <w:noProof/>
+          <w:sz w:val="22"/>
+          <w:szCs w:val="22"/>
+          <w:lang w:val="en-AU"/>
+        </w:rPr>
+      </w:pPr>
       <w:r>
         <w:rPr>
           <w:noProof/>
@@ -2858,6 +2958,512 @@
           <w:lang w:val="en-AU"/>
         </w:rPr>
         <w:lastRenderedPageBreak/>
+        <w:t xml:space="preserve">Advance Techniqe Number 1 media </w:t>
+      </w:r>
+      <w:r>
+        <w:rPr>
+          <w:noProof/>
+          <w:sz w:val="22"/>
+          <w:szCs w:val="22"/>
+          <w:lang w:val="en-AU"/>
+        </w:rPr>
+        <w:t>queries</w:t>
+      </w:r>
+    </w:p>
+    <w:p>
+      <w:pPr>
+        <w:rPr>
+          <w:noProof/>
+          <w:sz w:val="22"/>
+          <w:szCs w:val="22"/>
+          <w:lang w:val="en-AU"/>
+        </w:rPr>
+      </w:pPr>
+      <w:r>
+        <w:rPr>
+          <w:noProof/>
+          <w:sz w:val="22"/>
+          <w:szCs w:val="22"/>
+          <w:lang w:val="en-AU"/>
+        </w:rPr>
+        <w:t xml:space="preserve">Before adding media queries </w:t>
+      </w:r>
+    </w:p>
+    <w:p>
+      <w:pPr>
+        <w:rPr>
+          <w:noProof/>
+          <w:sz w:val="22"/>
+          <w:szCs w:val="22"/>
+          <w:lang w:val="en-AU"/>
+        </w:rPr>
+      </w:pPr>
+      <w:r>
+        <w:rPr>
+          <w:noProof/>
+          <w:sz w:val="22"/>
+          <w:szCs w:val="22"/>
+          <w:lang w:val="en-AU"/>
+        </w:rPr>
+        <w:drawing>
+          <wp:inline distT="0" distB="0" distL="0" distR="0" wp14:anchorId="55A54A86" wp14:editId="721C9680">
+            <wp:extent cx="1657350" cy="3574989"/>
+            <wp:effectExtent l="0" t="0" r="0" b="0"/>
+            <wp:docPr id="1168117213" name="Picture 5"/>
+            <wp:cNvGraphicFramePr>
+              <a:graphicFrameLocks xmlns:a="http://schemas.openxmlformats.org/drawingml/2006/main" noChangeAspect="1"/>
+            </wp:cNvGraphicFramePr>
+            <a:graphic xmlns:a="http://schemas.openxmlformats.org/drawingml/2006/main">
+              <a:graphicData uri="http://schemas.openxmlformats.org/drawingml/2006/picture">
+                <pic:pic xmlns:pic="http://schemas.openxmlformats.org/drawingml/2006/picture">
+                  <pic:nvPicPr>
+                    <pic:cNvPr id="1168117213" name="Picture 1168117213"/>
+                    <pic:cNvPicPr/>
+                  </pic:nvPicPr>
+                  <pic:blipFill>
+                    <a:blip r:embed="rId23" cstate="print">
+                      <a:extLst>
+                        <a:ext uri="{28A0092B-C50C-407E-A947-70E740481C1C}">
+                          <a14:useLocalDpi xmlns:a14="http://schemas.microsoft.com/office/drawing/2010/main" val="0"/>
+                        </a:ext>
+                      </a:extLst>
+                    </a:blip>
+                    <a:stretch>
+                      <a:fillRect/>
+                    </a:stretch>
+                  </pic:blipFill>
+                  <pic:spPr>
+                    <a:xfrm>
+                      <a:off x="0" y="0"/>
+                      <a:ext cx="1667140" cy="3596106"/>
+                    </a:xfrm>
+                    <a:prstGeom prst="rect">
+                      <a:avLst/>
+                    </a:prstGeom>
+                  </pic:spPr>
+                </pic:pic>
+              </a:graphicData>
+            </a:graphic>
+          </wp:inline>
+        </w:drawing>
+      </w:r>
+    </w:p>
+    <w:p>
+      <w:pPr>
+        <w:rPr>
+          <w:noProof/>
+          <w:sz w:val="22"/>
+          <w:szCs w:val="22"/>
+          <w:lang w:val="en-AU"/>
+        </w:rPr>
+      </w:pPr>
+    </w:p>
+    <w:p>
+      <w:pPr>
+        <w:rPr>
+          <w:noProof/>
+          <w:sz w:val="22"/>
+          <w:szCs w:val="22"/>
+          <w:lang w:val="en-AU"/>
+        </w:rPr>
+      </w:pPr>
+      <w:r>
+        <w:rPr>
+          <w:noProof/>
+          <w:sz w:val="22"/>
+          <w:szCs w:val="22"/>
+          <w:lang w:val="en-AU"/>
+        </w:rPr>
+        <w:t>Advance techinqe Number 2</w:t>
+      </w:r>
+    </w:p>
+    <w:p>
+      <w:pPr>
+        <w:rPr>
+          <w:noProof/>
+          <w:sz w:val="22"/>
+          <w:szCs w:val="22"/>
+          <w:lang w:val="en-AU"/>
+        </w:rPr>
+      </w:pPr>
+      <w:r>
+        <w:rPr>
+          <w:noProof/>
+          <w:sz w:val="22"/>
+          <w:szCs w:val="22"/>
+          <w:lang w:val="en-AU"/>
+        </w:rPr>
+        <w:drawing>
+          <wp:anchor distT="0" distB="0" distL="114300" distR="114300" simplePos="0" relativeHeight="251669504" behindDoc="0" locked="0" layoutInCell="1" allowOverlap="1" wp14:anchorId="688D4AB8" wp14:editId="32CDF4FE">
+            <wp:simplePos x="0" y="0"/>
+            <wp:positionH relativeFrom="column">
+              <wp:posOffset>-106317</wp:posOffset>
+            </wp:positionH>
+            <wp:positionV relativeFrom="paragraph">
+              <wp:posOffset>276225</wp:posOffset>
+            </wp:positionV>
+            <wp:extent cx="3950335" cy="2016125"/>
+            <wp:effectExtent l="0" t="0" r="0" b="3175"/>
+            <wp:wrapSquare wrapText="bothSides"/>
+            <wp:docPr id="1893321286" name="Picture 6"/>
+            <wp:cNvGraphicFramePr>
+              <a:graphicFrameLocks xmlns:a="http://schemas.openxmlformats.org/drawingml/2006/main" noChangeAspect="1"/>
+            </wp:cNvGraphicFramePr>
+            <a:graphic xmlns:a="http://schemas.openxmlformats.org/drawingml/2006/main">
+              <a:graphicData uri="http://schemas.openxmlformats.org/drawingml/2006/picture">
+                <pic:pic xmlns:pic="http://schemas.openxmlformats.org/drawingml/2006/picture">
+                  <pic:nvPicPr>
+                    <pic:cNvPr id="1893321286" name="Picture 1893321286"/>
+                    <pic:cNvPicPr/>
+                  </pic:nvPicPr>
+                  <pic:blipFill>
+                    <a:blip r:embed="rId24" cstate="print">
+                      <a:extLst>
+                        <a:ext uri="{28A0092B-C50C-407E-A947-70E740481C1C}">
+                          <a14:useLocalDpi xmlns:a14="http://schemas.microsoft.com/office/drawing/2010/main" val="0"/>
+                        </a:ext>
+                      </a:extLst>
+                    </a:blip>
+                    <a:stretch>
+                      <a:fillRect/>
+                    </a:stretch>
+                  </pic:blipFill>
+                  <pic:spPr>
+                    <a:xfrm>
+                      <a:off x="0" y="0"/>
+                      <a:ext cx="3950335" cy="2016125"/>
+                    </a:xfrm>
+                    <a:prstGeom prst="rect">
+                      <a:avLst/>
+                    </a:prstGeom>
+                  </pic:spPr>
+                </pic:pic>
+              </a:graphicData>
+            </a:graphic>
+            <wp14:sizeRelH relativeFrom="page">
+              <wp14:pctWidth>0</wp14:pctWidth>
+            </wp14:sizeRelH>
+            <wp14:sizeRelV relativeFrom="page">
+              <wp14:pctHeight>0</wp14:pctHeight>
+            </wp14:sizeRelV>
+          </wp:anchor>
+        </w:drawing>
+      </w:r>
+      <w:r>
+        <w:rPr>
+          <w:noProof/>
+          <w:sz w:val="22"/>
+          <w:szCs w:val="22"/>
+          <w:lang w:val="en-AU"/>
+        </w:rPr>
+        <w:t xml:space="preserve">My second technies is CVS </w:t>
+      </w:r>
+      <w:r>
+        <w:rPr>
+          <w:noProof/>
+          <w:sz w:val="22"/>
+          <w:szCs w:val="22"/>
+          <w:lang w:val="en-AU"/>
+        </w:rPr>
+        <w:t>parsing</w:t>
+      </w:r>
+      <w:r>
+        <w:rPr>
+          <w:noProof/>
+          <w:sz w:val="22"/>
+          <w:szCs w:val="22"/>
+          <w:lang w:val="en-AU"/>
+        </w:rPr>
+        <w:t xml:space="preserve"> </w:t>
+      </w:r>
+    </w:p>
+    <w:p>
+      <w:pPr>
+        <w:rPr>
+          <w:noProof/>
+          <w:sz w:val="22"/>
+          <w:szCs w:val="22"/>
+          <w:lang w:val="en-AU"/>
+        </w:rPr>
+      </w:pPr>
+      <w:r>
+        <w:rPr>
+          <w:noProof/>
+          <w:sz w:val="22"/>
+          <w:szCs w:val="22"/>
+          <w:lang w:val="en-AU"/>
+        </w:rPr>
+        <w:t xml:space="preserve">I am using Java scipt to read the file, following a toutioal on </w:t>
+      </w:r>
+      <w:hyperlink r:id="rId25" w:history="1">
+        <w:r>
+          <w:rPr>
+            <w:rStyle w:val="Hyperlink"/>
+            <w:noProof/>
+            <w:sz w:val="22"/>
+            <w:szCs w:val="22"/>
+            <w:lang w:val="en-AU"/>
+          </w:rPr>
+          <w:t>youtube</w:t>
+        </w:r>
+      </w:hyperlink>
+      <w:r>
+        <w:rPr>
+          <w:noProof/>
+          <w:sz w:val="22"/>
+          <w:szCs w:val="22"/>
+          <w:lang w:val="en-AU"/>
+        </w:rPr>
+        <w:t xml:space="preserve"> I was able to get to this point .</w:t>
+      </w:r>
+    </w:p>
+    <w:p>
+      <w:pPr>
+        <w:rPr>
+          <w:noProof/>
+          <w:sz w:val="22"/>
+          <w:szCs w:val="22"/>
+          <w:lang w:val="en-AU"/>
+        </w:rPr>
+      </w:pPr>
+    </w:p>
+    <w:p>
+      <w:pPr>
+        <w:rPr>
+          <w:noProof/>
+          <w:sz w:val="22"/>
+          <w:szCs w:val="22"/>
+          <w:lang w:val="en-AU"/>
+        </w:rPr>
+      </w:pPr>
+    </w:p>
+    <w:p>
+      <w:pPr>
+        <w:rPr>
+          <w:noProof/>
+          <w:sz w:val="22"/>
+          <w:szCs w:val="22"/>
+          <w:lang w:val="en-AU"/>
+        </w:rPr>
+      </w:pPr>
+    </w:p>
+    <w:p>
+      <w:pPr>
+        <w:rPr>
+          <w:noProof/>
+          <w:sz w:val="22"/>
+          <w:szCs w:val="22"/>
+          <w:lang w:val="en-AU"/>
+        </w:rPr>
+      </w:pPr>
+    </w:p>
+    <w:p>
+      <w:pPr>
+        <w:rPr>
+          <w:noProof/>
+          <w:sz w:val="22"/>
+          <w:szCs w:val="22"/>
+          <w:lang w:val="en-AU"/>
+        </w:rPr>
+      </w:pPr>
+      <w:r>
+        <w:rPr>
+          <w:noProof/>
+          <w:sz w:val="22"/>
+          <w:szCs w:val="22"/>
+          <w:lang w:val="en-AU"/>
+        </w:rPr>
+        <w:t xml:space="preserve">However it looks unappling and I don’t thing there is much that can be done with this </w:t>
+      </w:r>
+    </w:p>
+    <w:p>
+      <w:pPr>
+        <w:rPr>
+          <w:noProof/>
+          <w:sz w:val="22"/>
+          <w:szCs w:val="22"/>
+          <w:lang w:val="en-AU"/>
+        </w:rPr>
+      </w:pPr>
+    </w:p>
+    <w:p>
+      <w:pPr>
+        <w:rPr>
+          <w:noProof/>
+          <w:sz w:val="22"/>
+          <w:szCs w:val="22"/>
+          <w:lang w:val="en-AU"/>
+        </w:rPr>
+      </w:pPr>
+    </w:p>
+    <w:p>
+      <w:pPr>
+        <w:rPr>
+          <w:noProof/>
+          <w:sz w:val="22"/>
+          <w:szCs w:val="22"/>
+          <w:lang w:val="en-AU"/>
+        </w:rPr>
+      </w:pPr>
+    </w:p>
+    <w:p>
+      <w:pPr>
+        <w:rPr>
+          <w:noProof/>
+          <w:sz w:val="22"/>
+          <w:szCs w:val="22"/>
+          <w:lang w:val="en-AU"/>
+        </w:rPr>
+      </w:pPr>
+      <w:r>
+        <w:rPr>
+          <w:noProof/>
+          <w:sz w:val="22"/>
+          <w:szCs w:val="22"/>
+          <w:lang w:val="en-AU"/>
+        </w:rPr>
+        <w:lastRenderedPageBreak/>
+        <w:drawing>
+          <wp:anchor distT="0" distB="0" distL="114300" distR="114300" simplePos="0" relativeHeight="251670528" behindDoc="0" locked="0" layoutInCell="1" allowOverlap="1" wp14:anchorId="1C723BA1" wp14:editId="119F996F">
+            <wp:simplePos x="0" y="0"/>
+            <wp:positionH relativeFrom="column">
+              <wp:posOffset>0</wp:posOffset>
+            </wp:positionH>
+            <wp:positionV relativeFrom="paragraph">
+              <wp:posOffset>0</wp:posOffset>
+            </wp:positionV>
+            <wp:extent cx="3298371" cy="1515438"/>
+            <wp:effectExtent l="0" t="0" r="3810" b="0"/>
+            <wp:wrapSquare wrapText="bothSides"/>
+            <wp:docPr id="2000477954" name="Picture 7"/>
+            <wp:cNvGraphicFramePr>
+              <a:graphicFrameLocks xmlns:a="http://schemas.openxmlformats.org/drawingml/2006/main" noChangeAspect="1"/>
+            </wp:cNvGraphicFramePr>
+            <a:graphic xmlns:a="http://schemas.openxmlformats.org/drawingml/2006/main">
+              <a:graphicData uri="http://schemas.openxmlformats.org/drawingml/2006/picture">
+                <pic:pic xmlns:pic="http://schemas.openxmlformats.org/drawingml/2006/picture">
+                  <pic:nvPicPr>
+                    <pic:cNvPr id="2000477954" name="Picture 2000477954"/>
+                    <pic:cNvPicPr/>
+                  </pic:nvPicPr>
+                  <pic:blipFill>
+                    <a:blip r:embed="rId26" cstate="print">
+                      <a:extLst>
+                        <a:ext uri="{28A0092B-C50C-407E-A947-70E740481C1C}">
+                          <a14:useLocalDpi xmlns:a14="http://schemas.microsoft.com/office/drawing/2010/main" val="0"/>
+                        </a:ext>
+                      </a:extLst>
+                    </a:blip>
+                    <a:stretch>
+                      <a:fillRect/>
+                    </a:stretch>
+                  </pic:blipFill>
+                  <pic:spPr>
+                    <a:xfrm>
+                      <a:off x="0" y="0"/>
+                      <a:ext cx="3298371" cy="1515438"/>
+                    </a:xfrm>
+                    <a:prstGeom prst="rect">
+                      <a:avLst/>
+                    </a:prstGeom>
+                  </pic:spPr>
+                </pic:pic>
+              </a:graphicData>
+            </a:graphic>
+            <wp14:sizeRelH relativeFrom="page">
+              <wp14:pctWidth>0</wp14:pctWidth>
+            </wp14:sizeRelH>
+            <wp14:sizeRelV relativeFrom="page">
+              <wp14:pctHeight>0</wp14:pctHeight>
+            </wp14:sizeRelV>
+          </wp:anchor>
+        </w:drawing>
+      </w:r>
+      <w:r>
+        <w:rPr>
+          <w:noProof/>
+          <w:sz w:val="22"/>
+          <w:szCs w:val="22"/>
+          <w:lang w:val="en-AU"/>
+        </w:rPr>
+        <w:t>This is another issue</w:t>
+      </w:r>
+      <w:r>
+        <w:rPr>
+          <w:noProof/>
+          <w:sz w:val="22"/>
+          <w:szCs w:val="22"/>
+          <w:lang w:val="en-AU"/>
+        </w:rPr>
+        <w:t xml:space="preserve"> </w:t>
+      </w:r>
+    </w:p>
+    <w:p>
+      <w:pPr>
+        <w:rPr>
+          <w:noProof/>
+          <w:sz w:val="22"/>
+          <w:szCs w:val="22"/>
+          <w:lang w:val="en-AU"/>
+        </w:rPr>
+      </w:pPr>
+    </w:p>
+    <w:p>
+      <w:pPr>
+        <w:rPr>
+          <w:noProof/>
+          <w:sz w:val="22"/>
+          <w:szCs w:val="22"/>
+          <w:lang w:val="en-AU"/>
+        </w:rPr>
+      </w:pPr>
+    </w:p>
+    <w:p>
+      <w:pPr>
+        <w:rPr>
+          <w:noProof/>
+          <w:sz w:val="22"/>
+          <w:szCs w:val="22"/>
+          <w:lang w:val="en-AU"/>
+        </w:rPr>
+      </w:pPr>
+    </w:p>
+    <w:p>
+      <w:pPr>
+        <w:rPr>
+          <w:noProof/>
+          <w:sz w:val="22"/>
+          <w:szCs w:val="22"/>
+          <w:lang w:val="en-AU"/>
+        </w:rPr>
+      </w:pPr>
+    </w:p>
+    <w:p>
+      <w:pPr>
+        <w:rPr>
+          <w:noProof/>
+          <w:sz w:val="22"/>
+          <w:szCs w:val="22"/>
+          <w:lang w:val="en-AU"/>
+        </w:rPr>
+      </w:pPr>
+    </w:p>
+    <w:p>
+      <w:pPr>
+        <w:rPr>
+          <w:noProof/>
+          <w:sz w:val="22"/>
+          <w:szCs w:val="22"/>
+          <w:lang w:val="en-AU"/>
+        </w:rPr>
+      </w:pPr>
+      <w:r>
+        <w:rPr>
+          <w:noProof/>
+          <w:sz w:val="22"/>
+          <w:szCs w:val="22"/>
+          <w:lang w:val="en-AU"/>
+        </w:rPr>
         <w:drawing>
           <wp:inline distT="0" distB="0" distL="0" distR="0" wp14:anchorId="59E8F6EC" wp14:editId="1DDCFF79">
             <wp:extent cx="5731510" cy="6146165"/>
@@ -2874,7 +3480,7 @@
                     <pic:cNvPicPr/>
                   </pic:nvPicPr>
                   <pic:blipFill>
-                    <a:blip r:embed="rId23">
+                    <a:blip r:embed="rId27">
                       <a:extLst>
                         <a:ext uri="{28A0092B-C50C-407E-A947-70E740481C1C}">
                           <a14:useLocalDpi xmlns:a14="http://schemas.microsoft.com/office/drawing/2010/main" val="0"/>

</xml_diff>

<commit_message>
Added pie Garph (doesnt look nice but funtioning)
</commit_message>
<xml_diff>
--- a/Comp sci.docx
+++ b/Comp sci.docx
@@ -3457,6 +3457,16 @@
           <w:lang w:val="en-AU"/>
         </w:rPr>
       </w:pPr>
+    </w:p>
+    <w:p>
+      <w:pPr>
+        <w:rPr>
+          <w:noProof/>
+          <w:sz w:val="22"/>
+          <w:szCs w:val="22"/>
+          <w:lang w:val="en-AU"/>
+        </w:rPr>
+      </w:pPr>
       <w:r>
         <w:rPr>
           <w:noProof/>
@@ -3465,10 +3475,18 @@
           <w:lang w:val="en-AU"/>
         </w:rPr>
         <w:drawing>
-          <wp:inline distT="0" distB="0" distL="0" distR="0" wp14:anchorId="59E8F6EC" wp14:editId="1DDCFF79">
-            <wp:extent cx="5731510" cy="6146165"/>
-            <wp:effectExtent l="0" t="0" r="0" b="635"/>
-            <wp:docPr id="1951267003" name="Picture 1"/>
+          <wp:anchor distT="0" distB="0" distL="114300" distR="114300" simplePos="0" relativeHeight="251671552" behindDoc="0" locked="0" layoutInCell="1" allowOverlap="1" wp14:anchorId="729566AF" wp14:editId="6A3F53D7">
+            <wp:simplePos x="0" y="0"/>
+            <wp:positionH relativeFrom="column">
+              <wp:posOffset>738332</wp:posOffset>
+            </wp:positionH>
+            <wp:positionV relativeFrom="paragraph">
+              <wp:posOffset>510944</wp:posOffset>
+            </wp:positionV>
+            <wp:extent cx="2950845" cy="1828800"/>
+            <wp:effectExtent l="0" t="0" r="0" b="0"/>
+            <wp:wrapTopAndBottom/>
+            <wp:docPr id="1498053668" name="Picture 1"/>
             <wp:cNvGraphicFramePr>
               <a:graphicFrameLocks xmlns:a="http://schemas.openxmlformats.org/drawingml/2006/main" noChangeAspect="1"/>
             </wp:cNvGraphicFramePr>
@@ -3476,11 +3494,11 @@
               <a:graphicData uri="http://schemas.openxmlformats.org/drawingml/2006/picture">
                 <pic:pic xmlns:pic="http://schemas.openxmlformats.org/drawingml/2006/picture">
                   <pic:nvPicPr>
-                    <pic:cNvPr id="1951267003" name="Picture 1951267003"/>
+                    <pic:cNvPr id="1498053668" name="Picture 1498053668"/>
                     <pic:cNvPicPr/>
                   </pic:nvPicPr>
                   <pic:blipFill>
-                    <a:blip r:embed="rId27">
+                    <a:blip r:embed="rId27" cstate="print">
                       <a:extLst>
                         <a:ext uri="{28A0092B-C50C-407E-A947-70E740481C1C}">
                           <a14:useLocalDpi xmlns:a14="http://schemas.microsoft.com/office/drawing/2010/main" val="0"/>
@@ -3494,7 +3512,241 @@
                   <pic:spPr>
                     <a:xfrm>
                       <a:off x="0" y="0"/>
-                      <a:ext cx="5731510" cy="6146165"/>
+                      <a:ext cx="2950845" cy="1828800"/>
+                    </a:xfrm>
+                    <a:prstGeom prst="rect">
+                      <a:avLst/>
+                    </a:prstGeom>
+                  </pic:spPr>
+                </pic:pic>
+              </a:graphicData>
+            </a:graphic>
+            <wp14:sizeRelH relativeFrom="page">
+              <wp14:pctWidth>0</wp14:pctWidth>
+            </wp14:sizeRelH>
+            <wp14:sizeRelV relativeFrom="page">
+              <wp14:pctHeight>0</wp14:pctHeight>
+            </wp14:sizeRelV>
+          </wp:anchor>
+        </w:drawing>
+      </w:r>
+      <w:r>
+        <w:rPr>
+          <w:noProof/>
+          <w:sz w:val="22"/>
+          <w:szCs w:val="22"/>
+          <w:lang w:val="en-AU"/>
+        </w:rPr>
+        <w:t>I have to make it so it can cartieges itself, into a section. When I did it all the categorys were saying other even though they were in one</w:t>
+      </w:r>
+      <w:r>
+        <w:rPr>
+          <w:noProof/>
+          <w:sz w:val="22"/>
+          <w:szCs w:val="22"/>
+          <w:lang w:val="en-AU"/>
+        </w:rPr>
+        <w:t xml:space="preserve">. </w:t>
+      </w:r>
+    </w:p>
+    <w:p>
+      <w:pPr>
+        <w:rPr>
+          <w:noProof/>
+          <w:sz w:val="22"/>
+          <w:szCs w:val="22"/>
+          <w:lang w:val="en-AU"/>
+        </w:rPr>
+      </w:pPr>
+    </w:p>
+    <w:p>
+      <w:pPr>
+        <w:rPr>
+          <w:noProof/>
+          <w:sz w:val="22"/>
+          <w:szCs w:val="22"/>
+          <w:lang w:val="en-AU"/>
+        </w:rPr>
+      </w:pPr>
+      <w:r>
+        <w:rPr>
+          <w:noProof/>
+          <w:sz w:val="22"/>
+          <w:szCs w:val="22"/>
+          <w:lang w:val="en-AU"/>
+        </w:rPr>
+        <w:drawing>
+          <wp:anchor distT="0" distB="0" distL="114300" distR="114300" simplePos="0" relativeHeight="251672576" behindDoc="0" locked="0" layoutInCell="1" allowOverlap="1" wp14:anchorId="751F2698" wp14:editId="2E96CCE6">
+            <wp:simplePos x="0" y="0"/>
+            <wp:positionH relativeFrom="column">
+              <wp:posOffset>0</wp:posOffset>
+            </wp:positionH>
+            <wp:positionV relativeFrom="paragraph">
+              <wp:posOffset>494665</wp:posOffset>
+            </wp:positionV>
+            <wp:extent cx="3941445" cy="1930400"/>
+            <wp:effectExtent l="0" t="0" r="0" b="0"/>
+            <wp:wrapTopAndBottom/>
+            <wp:docPr id="1863878851" name="Picture 2"/>
+            <wp:cNvGraphicFramePr>
+              <a:graphicFrameLocks xmlns:a="http://schemas.openxmlformats.org/drawingml/2006/main" noChangeAspect="1"/>
+            </wp:cNvGraphicFramePr>
+            <a:graphic xmlns:a="http://schemas.openxmlformats.org/drawingml/2006/main">
+              <a:graphicData uri="http://schemas.openxmlformats.org/drawingml/2006/picture">
+                <pic:pic xmlns:pic="http://schemas.openxmlformats.org/drawingml/2006/picture">
+                  <pic:nvPicPr>
+                    <pic:cNvPr id="1863878851" name="Picture 1863878851"/>
+                    <pic:cNvPicPr/>
+                  </pic:nvPicPr>
+                  <pic:blipFill>
+                    <a:blip r:embed="rId28" cstate="print">
+                      <a:extLst>
+                        <a:ext uri="{28A0092B-C50C-407E-A947-70E740481C1C}">
+                          <a14:useLocalDpi xmlns:a14="http://schemas.microsoft.com/office/drawing/2010/main" val="0"/>
+                        </a:ext>
+                      </a:extLst>
+                    </a:blip>
+                    <a:stretch>
+                      <a:fillRect/>
+                    </a:stretch>
+                  </pic:blipFill>
+                  <pic:spPr>
+                    <a:xfrm>
+                      <a:off x="0" y="0"/>
+                      <a:ext cx="3941445" cy="1930400"/>
+                    </a:xfrm>
+                    <a:prstGeom prst="rect">
+                      <a:avLst/>
+                    </a:prstGeom>
+                  </pic:spPr>
+                </pic:pic>
+              </a:graphicData>
+            </a:graphic>
+            <wp14:sizeRelH relativeFrom="page">
+              <wp14:pctWidth>0</wp14:pctWidth>
+            </wp14:sizeRelH>
+            <wp14:sizeRelV relativeFrom="page">
+              <wp14:pctHeight>0</wp14:pctHeight>
+            </wp14:sizeRelV>
+          </wp:anchor>
+        </w:drawing>
+      </w:r>
+      <w:r>
+        <w:rPr>
+          <w:noProof/>
+          <w:sz w:val="22"/>
+          <w:szCs w:val="22"/>
+          <w:lang w:val="en-AU"/>
+        </w:rPr>
+        <w:t>FIX</w:t>
+      </w:r>
+      <w:r>
+        <w:rPr>
+          <w:noProof/>
+          <w:sz w:val="22"/>
+          <w:szCs w:val="22"/>
+          <w:lang w:val="en-AU"/>
+        </w:rPr>
+        <w:br/>
+        <w:t>I had to get “idex’s” in the right order because it was trying to match with the wrong cloum.</w:t>
+      </w:r>
+    </w:p>
+    <w:p>
+      <w:pPr>
+        <w:rPr>
+          <w:noProof/>
+          <w:sz w:val="22"/>
+          <w:szCs w:val="22"/>
+          <w:lang w:val="en-AU"/>
+        </w:rPr>
+      </w:pPr>
+    </w:p>
+    <w:p>
+      <w:pPr>
+        <w:rPr>
+          <w:noProof/>
+          <w:sz w:val="22"/>
+          <w:szCs w:val="22"/>
+          <w:lang w:val="en-AU"/>
+        </w:rPr>
+      </w:pPr>
+      <w:r>
+        <w:rPr>
+          <w:noProof/>
+          <w:sz w:val="22"/>
+          <w:szCs w:val="22"/>
+          <w:lang w:val="en-AU"/>
+        </w:rPr>
+        <w:t>Next Step: I want it to tell the differnece between money coming in or out. By looking at the amount wheter it is a plus or minus.</w:t>
+      </w:r>
+    </w:p>
+    <w:p>
+      <w:pPr>
+        <w:rPr>
+          <w:noProof/>
+          <w:sz w:val="22"/>
+          <w:szCs w:val="22"/>
+          <w:lang w:val="en-AU"/>
+        </w:rPr>
+      </w:pPr>
+      <w:r>
+        <w:rPr>
+          <w:noProof/>
+          <w:sz w:val="22"/>
+          <w:szCs w:val="22"/>
+          <w:lang w:val="en-AU"/>
+        </w:rPr>
+        <w:t xml:space="preserve">It was easy as it was the same as the other just a different way of cargtiesing it </w:t>
+      </w:r>
+    </w:p>
+    <w:p>
+      <w:pPr>
+        <w:rPr>
+          <w:noProof/>
+          <w:sz w:val="22"/>
+          <w:szCs w:val="22"/>
+          <w:lang w:val="en-AU"/>
+        </w:rPr>
+      </w:pPr>
+      <w:r>
+        <w:rPr>
+          <w:noProof/>
+          <w:sz w:val="22"/>
+          <w:szCs w:val="22"/>
+          <w:lang w:val="en-AU"/>
+        </w:rPr>
+        <w:lastRenderedPageBreak/>
+        <w:drawing>
+          <wp:inline distT="0" distB="0" distL="0" distR="0" wp14:anchorId="18A92C1A" wp14:editId="0A156A4A">
+            <wp:extent cx="4830618" cy="2721437"/>
+            <wp:effectExtent l="0" t="0" r="0" b="0"/>
+            <wp:docPr id="1501366770" name="Picture 3"/>
+            <wp:cNvGraphicFramePr>
+              <a:graphicFrameLocks xmlns:a="http://schemas.openxmlformats.org/drawingml/2006/main" noChangeAspect="1"/>
+            </wp:cNvGraphicFramePr>
+            <a:graphic xmlns:a="http://schemas.openxmlformats.org/drawingml/2006/main">
+              <a:graphicData uri="http://schemas.openxmlformats.org/drawingml/2006/picture">
+                <pic:pic xmlns:pic="http://schemas.openxmlformats.org/drawingml/2006/picture">
+                  <pic:nvPicPr>
+                    <pic:cNvPr id="1501366770" name="Picture 1501366770"/>
+                    <pic:cNvPicPr/>
+                  </pic:nvPicPr>
+                  <pic:blipFill>
+                    <a:blip r:embed="rId29" cstate="print">
+                      <a:extLst>
+                        <a:ext uri="{28A0092B-C50C-407E-A947-70E740481C1C}">
+                          <a14:useLocalDpi xmlns:a14="http://schemas.microsoft.com/office/drawing/2010/main" val="0"/>
+                        </a:ext>
+                      </a:extLst>
+                    </a:blip>
+                    <a:stretch>
+                      <a:fillRect/>
+                    </a:stretch>
+                  </pic:blipFill>
+                  <pic:spPr>
+                    <a:xfrm>
+                      <a:off x="0" y="0"/>
+                      <a:ext cx="4905203" cy="2763456"/>
                     </a:xfrm>
                     <a:prstGeom prst="rect">
                       <a:avLst/>
@@ -3505,6 +3757,112 @@
             </a:graphic>
           </wp:inline>
         </w:drawing>
+      </w:r>
+    </w:p>
+    <w:p>
+      <w:pPr>
+        <w:rPr>
+          <w:noProof/>
+          <w:sz w:val="22"/>
+          <w:szCs w:val="22"/>
+          <w:lang w:val="en-AU"/>
+        </w:rPr>
+      </w:pPr>
+      <w:r>
+        <w:rPr>
+          <w:noProof/>
+          <w:sz w:val="22"/>
+          <w:szCs w:val="22"/>
+          <w:lang w:val="en-AU"/>
+        </w:rPr>
+        <w:t>Next Step: Creating it so the data looks more appealing to the users</w:t>
+      </w:r>
+    </w:p>
+    <w:p>
+      <w:pPr>
+        <w:rPr>
+          <w:noProof/>
+          <w:sz w:val="22"/>
+          <w:szCs w:val="22"/>
+          <w:lang w:val="en-AU"/>
+        </w:rPr>
+      </w:pPr>
+      <w:r>
+        <w:rPr>
+          <w:noProof/>
+          <w:sz w:val="22"/>
+          <w:szCs w:val="22"/>
+          <w:lang w:val="en-AU"/>
+        </w:rPr>
+        <w:drawing>
+          <wp:inline distT="0" distB="0" distL="0" distR="0" wp14:anchorId="21579194" wp14:editId="64CC3B8D">
+            <wp:extent cx="5731510" cy="3996055"/>
+            <wp:effectExtent l="0" t="0" r="0" b="4445"/>
+            <wp:docPr id="59159604" name="Picture 1"/>
+            <wp:cNvGraphicFramePr>
+              <a:graphicFrameLocks xmlns:a="http://schemas.openxmlformats.org/drawingml/2006/main" noChangeAspect="1"/>
+            </wp:cNvGraphicFramePr>
+            <a:graphic xmlns:a="http://schemas.openxmlformats.org/drawingml/2006/main">
+              <a:graphicData uri="http://schemas.openxmlformats.org/drawingml/2006/picture">
+                <pic:pic xmlns:pic="http://schemas.openxmlformats.org/drawingml/2006/picture">
+                  <pic:nvPicPr>
+                    <pic:cNvPr id="59159604" name="Picture 59159604"/>
+                    <pic:cNvPicPr/>
+                  </pic:nvPicPr>
+                  <pic:blipFill>
+                    <a:blip r:embed="rId30" cstate="print">
+                      <a:extLst>
+                        <a:ext uri="{28A0092B-C50C-407E-A947-70E740481C1C}">
+                          <a14:useLocalDpi xmlns:a14="http://schemas.microsoft.com/office/drawing/2010/main" val="0"/>
+                        </a:ext>
+                      </a:extLst>
+                    </a:blip>
+                    <a:stretch>
+                      <a:fillRect/>
+                    </a:stretch>
+                  </pic:blipFill>
+                  <pic:spPr>
+                    <a:xfrm>
+                      <a:off x="0" y="0"/>
+                      <a:ext cx="5731510" cy="3996055"/>
+                    </a:xfrm>
+                    <a:prstGeom prst="rect">
+                      <a:avLst/>
+                    </a:prstGeom>
+                  </pic:spPr>
+                </pic:pic>
+              </a:graphicData>
+            </a:graphic>
+          </wp:inline>
+        </w:drawing>
+      </w:r>
+    </w:p>
+    <w:p>
+      <w:pPr>
+        <w:rPr>
+          <w:noProof/>
+          <w:sz w:val="22"/>
+          <w:szCs w:val="22"/>
+          <w:lang w:val="en-AU"/>
+        </w:rPr>
+      </w:pPr>
+      <w:r>
+        <w:rPr>
+          <w:noProof/>
+          <w:sz w:val="22"/>
+          <w:szCs w:val="22"/>
+          <w:lang w:val="en-AU"/>
+        </w:rPr>
+        <w:t>I added a graph</w:t>
+      </w:r>
+      <w:r>
+        <w:rPr>
+          <w:noProof/>
+          <w:sz w:val="22"/>
+          <w:szCs w:val="22"/>
+          <w:lang w:val="en-AU"/>
+        </w:rPr>
+        <w:t xml:space="preserve"> from google charts, as a basic wire for my graph, it uses javascipt in html.</w:t>
       </w:r>
     </w:p>
     <w:sectPr>

</xml_diff>

<commit_message>
Does not allow empty cvs flies to be uploaded
</commit_message>
<xml_diff>
--- a/Comp sci.docx
+++ b/Comp sci.docx
@@ -3717,7 +3717,7 @@
         </w:rPr>
         <w:lastRenderedPageBreak/>
         <w:drawing>
-          <wp:inline distT="0" distB="0" distL="0" distR="0" wp14:anchorId="18A92C1A" wp14:editId="0A156A4A">
+          <wp:inline distT="0" distB="0" distL="0" distR="0" wp14:anchorId="18A92C1A" wp14:editId="7171AB54">
             <wp:extent cx="4830618" cy="2721437"/>
             <wp:effectExtent l="0" t="0" r="0" b="0"/>
             <wp:docPr id="1501366770" name="Picture 3"/>
@@ -3853,6 +3853,7 @@
           <w:szCs w:val="22"/>
           <w:lang w:val="en-AU"/>
         </w:rPr>
+        <w:lastRenderedPageBreak/>
         <w:t>I added a graph</w:t>
       </w:r>
       <w:r>
@@ -3864,6 +3865,3290 @@
         </w:rPr>
         <w:t xml:space="preserve"> from google charts, as a basic wire for my graph, it uses javascipt in html.</w:t>
       </w:r>
+      <w:r>
+        <w:rPr>
+          <w:noProof/>
+          <w:sz w:val="22"/>
+          <w:szCs w:val="22"/>
+          <w:lang w:val="en-AU"/>
+        </w:rPr>
+        <w:drawing>
+          <wp:inline distT="0" distB="0" distL="0" distR="0" wp14:anchorId="5DE0ABE7" wp14:editId="7B907F54">
+            <wp:extent cx="1497724" cy="1605200"/>
+            <wp:effectExtent l="0" t="0" r="1270" b="0"/>
+            <wp:docPr id="548640387" name="Picture 1"/>
+            <wp:cNvGraphicFramePr>
+              <a:graphicFrameLocks xmlns:a="http://schemas.openxmlformats.org/drawingml/2006/main" noChangeAspect="1"/>
+            </wp:cNvGraphicFramePr>
+            <a:graphic xmlns:a="http://schemas.openxmlformats.org/drawingml/2006/main">
+              <a:graphicData uri="http://schemas.openxmlformats.org/drawingml/2006/picture">
+                <pic:pic xmlns:pic="http://schemas.openxmlformats.org/drawingml/2006/picture">
+                  <pic:nvPicPr>
+                    <pic:cNvPr id="548640387" name="Picture 548640387"/>
+                    <pic:cNvPicPr/>
+                  </pic:nvPicPr>
+                  <pic:blipFill>
+                    <a:blip r:embed="rId31" cstate="print">
+                      <a:extLst>
+                        <a:ext uri="{28A0092B-C50C-407E-A947-70E740481C1C}">
+                          <a14:useLocalDpi xmlns:a14="http://schemas.microsoft.com/office/drawing/2010/main" val="0"/>
+                        </a:ext>
+                      </a:extLst>
+                    </a:blip>
+                    <a:stretch>
+                      <a:fillRect/>
+                    </a:stretch>
+                  </pic:blipFill>
+                  <pic:spPr>
+                    <a:xfrm>
+                      <a:off x="0" y="0"/>
+                      <a:ext cx="1509182" cy="1617480"/>
+                    </a:xfrm>
+                    <a:prstGeom prst="rect">
+                      <a:avLst/>
+                    </a:prstGeom>
+                  </pic:spPr>
+                </pic:pic>
+              </a:graphicData>
+            </a:graphic>
+          </wp:inline>
+        </w:drawing>
+      </w:r>
+    </w:p>
+    <w:p>
+      <w:pPr>
+        <w:rPr>
+          <w:noProof/>
+          <w:sz w:val="22"/>
+          <w:szCs w:val="22"/>
+          <w:lang w:val="en-AU"/>
+        </w:rPr>
+      </w:pPr>
+      <w:r>
+        <w:rPr>
+          <w:noProof/>
+          <w:sz w:val="22"/>
+          <w:szCs w:val="22"/>
+          <w:lang w:val="en-AU"/>
+        </w:rPr>
+        <w:t>Got a working pie chart in it</w:t>
+      </w:r>
+      <w:r>
+        <w:rPr>
+          <w:noProof/>
+          <w:sz w:val="22"/>
+          <w:szCs w:val="22"/>
+          <w:lang w:val="en-AU"/>
+        </w:rPr>
+        <w:br/>
+        <w:t>Now I am working on making it look niceer more appealing to the user.</w:t>
+      </w:r>
+      <w:r>
+        <w:rPr>
+          <w:noProof/>
+          <w:sz w:val="22"/>
+          <w:szCs w:val="22"/>
+          <w:lang w:val="en-AU"/>
+        </w:rPr>
+        <w:br/>
+        <w:t xml:space="preserve">Looking back at it this is appear on the home page and not on the search page </w:t>
+      </w:r>
+    </w:p>
+    <w:p>
+      <w:pPr>
+        <w:rPr>
+          <w:noProof/>
+          <w:sz w:val="22"/>
+          <w:szCs w:val="22"/>
+          <w:lang w:val="en-AU"/>
+        </w:rPr>
+      </w:pPr>
+      <w:r>
+        <w:rPr>
+          <w:noProof/>
+          <w:sz w:val="22"/>
+          <w:szCs w:val="22"/>
+          <w:lang w:val="en-AU"/>
+        </w:rPr>
+        <w:t>Moved everything to the home page instead of search.html because I thought I would be easier to correct this mistake now rather then later down the line.</w:t>
+      </w:r>
+    </w:p>
+    <w:p>
+      <w:pPr>
+        <w:rPr>
+          <w:noProof/>
+          <w:sz w:val="22"/>
+          <w:szCs w:val="22"/>
+          <w:lang w:val="en-AU"/>
+        </w:rPr>
+      </w:pPr>
+      <w:r>
+        <w:rPr>
+          <w:noProof/>
+          <w:sz w:val="22"/>
+          <w:szCs w:val="22"/>
+          <w:lang w:val="en-AU"/>
+        </w:rPr>
+        <w:drawing>
+          <wp:inline distT="0" distB="0" distL="0" distR="0" wp14:anchorId="5475F931" wp14:editId="2F2D5E7A">
+            <wp:extent cx="1765476" cy="1783080"/>
+            <wp:effectExtent l="0" t="0" r="0" b="0"/>
+            <wp:docPr id="2082257010" name="Picture 2"/>
+            <wp:cNvGraphicFramePr>
+              <a:graphicFrameLocks xmlns:a="http://schemas.openxmlformats.org/drawingml/2006/main" noChangeAspect="1"/>
+            </wp:cNvGraphicFramePr>
+            <a:graphic xmlns:a="http://schemas.openxmlformats.org/drawingml/2006/main">
+              <a:graphicData uri="http://schemas.openxmlformats.org/drawingml/2006/picture">
+                <pic:pic xmlns:pic="http://schemas.openxmlformats.org/drawingml/2006/picture">
+                  <pic:nvPicPr>
+                    <pic:cNvPr id="2082257010" name="Picture 2082257010"/>
+                    <pic:cNvPicPr/>
+                  </pic:nvPicPr>
+                  <pic:blipFill>
+                    <a:blip r:embed="rId32" cstate="print">
+                      <a:extLst>
+                        <a:ext uri="{28A0092B-C50C-407E-A947-70E740481C1C}">
+                          <a14:useLocalDpi xmlns:a14="http://schemas.microsoft.com/office/drawing/2010/main" val="0"/>
+                        </a:ext>
+                      </a:extLst>
+                    </a:blip>
+                    <a:stretch>
+                      <a:fillRect/>
+                    </a:stretch>
+                  </pic:blipFill>
+                  <pic:spPr>
+                    <a:xfrm>
+                      <a:off x="0" y="0"/>
+                      <a:ext cx="1780663" cy="1798418"/>
+                    </a:xfrm>
+                    <a:prstGeom prst="rect">
+                      <a:avLst/>
+                    </a:prstGeom>
+                  </pic:spPr>
+                </pic:pic>
+              </a:graphicData>
+            </a:graphic>
+          </wp:inline>
+        </w:drawing>
+      </w:r>
+    </w:p>
+    <w:p>
+      <w:pPr>
+        <w:rPr>
+          <w:noProof/>
+          <w:sz w:val="22"/>
+          <w:szCs w:val="22"/>
+          <w:lang w:val="en-AU"/>
+        </w:rPr>
+      </w:pPr>
+      <w:r>
+        <w:rPr>
+          <w:noProof/>
+          <w:sz w:val="22"/>
+          <w:szCs w:val="22"/>
+          <w:lang w:val="en-AU"/>
+        </w:rPr>
+        <w:br/>
+      </w:r>
+      <w:r>
+        <w:rPr>
+          <w:noProof/>
+          <w:sz w:val="22"/>
+          <w:szCs w:val="22"/>
+          <w:lang w:val="en-AU"/>
+        </w:rPr>
+        <w:br/>
+      </w:r>
+      <w:r>
+        <w:rPr>
+          <w:noProof/>
+          <w:sz w:val="22"/>
+          <w:szCs w:val="22"/>
+          <w:lang w:val="en-AU"/>
+        </w:rPr>
+        <w:t xml:space="preserve">Added the toturail for the thing </w:t>
+      </w:r>
+      <w:r>
+        <w:rPr>
+          <w:noProof/>
+          <w:sz w:val="22"/>
+          <w:szCs w:val="22"/>
+          <w:lang w:val="en-AU"/>
+        </w:rPr>
+        <w:br/>
+        <w:t xml:space="preserve">The button used was from </w:t>
+      </w:r>
+      <w:hyperlink r:id="rId33" w:history="1">
+        <w:r>
+          <w:rPr>
+            <w:rStyle w:val="Hyperlink"/>
+            <w:noProof/>
+            <w:sz w:val="22"/>
+            <w:szCs w:val="22"/>
+            <w:lang w:val="en-AU"/>
+          </w:rPr>
+          <w:t>UI V</w:t>
+        </w:r>
+        <w:r>
+          <w:rPr>
+            <w:rStyle w:val="Hyperlink"/>
+            <w:noProof/>
+            <w:sz w:val="22"/>
+            <w:szCs w:val="22"/>
+            <w:lang w:val="en-AU"/>
+          </w:rPr>
+          <w:t>e</w:t>
+        </w:r>
+        <w:r>
+          <w:rPr>
+            <w:rStyle w:val="Hyperlink"/>
+            <w:noProof/>
+            <w:sz w:val="22"/>
+            <w:szCs w:val="22"/>
+            <w:lang w:val="en-AU"/>
+          </w:rPr>
+          <w:t>rse</w:t>
+        </w:r>
+      </w:hyperlink>
+      <w:r>
+        <w:rPr>
+          <w:noProof/>
+          <w:sz w:val="22"/>
+          <w:szCs w:val="22"/>
+          <w:lang w:val="en-AU"/>
+        </w:rPr>
+        <w:t xml:space="preserve"> </w:t>
+      </w:r>
+      <w:r>
+        <w:rPr>
+          <w:noProof/>
+          <w:sz w:val="22"/>
+          <w:szCs w:val="22"/>
+          <w:lang w:val="en-AU"/>
+        </w:rPr>
+        <w:br/>
+      </w:r>
+      <w:r>
+        <w:rPr>
+          <w:noProof/>
+          <w:sz w:val="22"/>
+          <w:szCs w:val="22"/>
+          <w:lang w:val="en-AU"/>
+        </w:rPr>
+        <w:br/>
+        <w:t xml:space="preserve">Assesabilty </w:t>
+      </w:r>
+      <w:r>
+        <w:rPr>
+          <w:noProof/>
+          <w:sz w:val="22"/>
+          <w:szCs w:val="22"/>
+          <w:lang w:val="en-AU"/>
+        </w:rPr>
+        <w:br/>
+      </w:r>
+      <w:r>
+        <w:rPr>
+          <w:noProof/>
+          <w:sz w:val="22"/>
+          <w:szCs w:val="22"/>
+          <w:lang w:val="en-AU"/>
+        </w:rPr>
+        <w:lastRenderedPageBreak/>
+        <w:t>The user is imforded about there privary and how there data is safe</w:t>
+      </w:r>
+      <w:r>
+        <w:rPr>
+          <w:noProof/>
+          <w:sz w:val="22"/>
+          <w:szCs w:val="22"/>
+          <w:lang w:val="en-AU"/>
+        </w:rPr>
+        <w:br/>
+      </w:r>
+      <w:r>
+        <w:rPr>
+          <w:noProof/>
+          <w:sz w:val="22"/>
+          <w:szCs w:val="22"/>
+          <w:lang w:val="en-AU"/>
+        </w:rPr>
+        <w:drawing>
+          <wp:inline distT="0" distB="0" distL="0" distR="0" wp14:anchorId="612874F4" wp14:editId="387D3892">
+            <wp:extent cx="2373549" cy="3316391"/>
+            <wp:effectExtent l="0" t="0" r="1905" b="0"/>
+            <wp:docPr id="1682193735" name="Picture 3"/>
+            <wp:cNvGraphicFramePr>
+              <a:graphicFrameLocks xmlns:a="http://schemas.openxmlformats.org/drawingml/2006/main" noChangeAspect="1"/>
+            </wp:cNvGraphicFramePr>
+            <a:graphic xmlns:a="http://schemas.openxmlformats.org/drawingml/2006/main">
+              <a:graphicData uri="http://schemas.openxmlformats.org/drawingml/2006/picture">
+                <pic:pic xmlns:pic="http://schemas.openxmlformats.org/drawingml/2006/picture">
+                  <pic:nvPicPr>
+                    <pic:cNvPr id="1682193735" name="Picture 1682193735"/>
+                    <pic:cNvPicPr/>
+                  </pic:nvPicPr>
+                  <pic:blipFill>
+                    <a:blip r:embed="rId34" cstate="print">
+                      <a:extLst>
+                        <a:ext uri="{28A0092B-C50C-407E-A947-70E740481C1C}">
+                          <a14:useLocalDpi xmlns:a14="http://schemas.microsoft.com/office/drawing/2010/main" val="0"/>
+                        </a:ext>
+                      </a:extLst>
+                    </a:blip>
+                    <a:stretch>
+                      <a:fillRect/>
+                    </a:stretch>
+                  </pic:blipFill>
+                  <pic:spPr>
+                    <a:xfrm>
+                      <a:off x="0" y="0"/>
+                      <a:ext cx="2403420" cy="3358128"/>
+                    </a:xfrm>
+                    <a:prstGeom prst="rect">
+                      <a:avLst/>
+                    </a:prstGeom>
+                  </pic:spPr>
+                </pic:pic>
+              </a:graphicData>
+            </a:graphic>
+          </wp:inline>
+        </w:drawing>
+      </w:r>
+    </w:p>
+    <w:p>
+      <w:pPr>
+        <w:rPr>
+          <w:noProof/>
+          <w:sz w:val="22"/>
+          <w:szCs w:val="22"/>
+          <w:lang w:val="en-AU"/>
+        </w:rPr>
+      </w:pPr>
+      <w:r>
+        <w:rPr>
+          <w:noProof/>
+          <w:sz w:val="22"/>
+          <w:szCs w:val="22"/>
+          <w:lang w:val="en-AU"/>
+        </w:rPr>
+        <w:t>The button is working using felx making sure that it works</w:t>
+      </w:r>
+    </w:p>
+    <w:p>
+      <w:pPr>
+        <w:rPr>
+          <w:noProof/>
+          <w:sz w:val="22"/>
+          <w:szCs w:val="22"/>
+          <w:lang w:val="en-AU"/>
+        </w:rPr>
+      </w:pPr>
+      <w:r>
+        <w:rPr>
+          <w:noProof/>
+          <w:sz w:val="22"/>
+          <w:szCs w:val="22"/>
+          <w:lang w:val="en-AU"/>
+        </w:rPr>
+        <w:br/>
+      </w:r>
+      <w:r>
+        <w:rPr>
+          <w:noProof/>
+          <w:sz w:val="22"/>
+          <w:szCs w:val="22"/>
+          <w:lang w:val="en-AU"/>
+        </w:rPr>
+        <w:br/>
+      </w:r>
+      <w:r>
+        <w:rPr>
+          <w:noProof/>
+          <w:sz w:val="22"/>
+          <w:szCs w:val="22"/>
+          <w:lang w:val="en-AU"/>
+        </w:rPr>
+        <w:br/>
+      </w:r>
+      <w:r>
+        <w:rPr>
+          <w:noProof/>
+          <w:sz w:val="22"/>
+          <w:szCs w:val="22"/>
+          <w:lang w:val="en-AU"/>
+        </w:rPr>
+        <w:br/>
+      </w:r>
+      <w:r>
+        <w:rPr>
+          <w:noProof/>
+          <w:sz w:val="22"/>
+          <w:szCs w:val="22"/>
+          <w:lang w:val="en-AU"/>
+        </w:rPr>
+        <w:br/>
+      </w:r>
+      <w:r>
+        <w:rPr>
+          <w:noProof/>
+          <w:sz w:val="22"/>
+          <w:szCs w:val="22"/>
+          <w:lang w:val="en-AU"/>
+        </w:rPr>
+        <w:br/>
+      </w:r>
+      <w:r>
+        <w:rPr>
+          <w:noProof/>
+          <w:sz w:val="22"/>
+          <w:szCs w:val="22"/>
+          <w:lang w:val="en-AU"/>
+        </w:rPr>
+        <w:br/>
+      </w:r>
+      <w:r>
+        <w:rPr>
+          <w:noProof/>
+          <w:sz w:val="22"/>
+          <w:szCs w:val="22"/>
+          <w:lang w:val="en-AU"/>
+        </w:rPr>
+        <w:br/>
+      </w:r>
+      <w:r>
+        <w:rPr>
+          <w:noProof/>
+          <w:sz w:val="22"/>
+          <w:szCs w:val="22"/>
+          <w:lang w:val="en-AU"/>
+        </w:rPr>
+        <w:br/>
+      </w:r>
+      <w:r>
+        <w:rPr>
+          <w:noProof/>
+          <w:sz w:val="22"/>
+          <w:szCs w:val="22"/>
+          <w:lang w:val="en-AU"/>
+        </w:rPr>
+        <w:br/>
+      </w:r>
+      <w:r>
+        <w:rPr>
+          <w:noProof/>
+          <w:sz w:val="22"/>
+          <w:szCs w:val="22"/>
+          <w:lang w:val="en-AU"/>
+        </w:rPr>
+        <w:br/>
+      </w:r>
+      <w:r>
+        <w:rPr>
+          <w:noProof/>
+          <w:sz w:val="22"/>
+          <w:szCs w:val="22"/>
+          <w:lang w:val="en-AU"/>
+        </w:rPr>
+        <w:br/>
+      </w:r>
+      <w:r>
+        <w:rPr>
+          <w:noProof/>
+          <w:sz w:val="22"/>
+          <w:szCs w:val="22"/>
+          <w:lang w:val="en-AU"/>
+        </w:rPr>
+        <w:br/>
+      </w:r>
+      <w:r>
+        <w:rPr>
+          <w:noProof/>
+          <w:sz w:val="22"/>
+          <w:szCs w:val="22"/>
+          <w:lang w:val="en-AU"/>
+        </w:rPr>
+        <w:br/>
+      </w:r>
+      <w:r>
+        <w:rPr>
+          <w:noProof/>
+          <w:sz w:val="22"/>
+          <w:szCs w:val="22"/>
+          <w:lang w:val="en-AU"/>
+        </w:rPr>
+        <w:br/>
+      </w:r>
+      <w:r>
+        <w:rPr>
+          <w:noProof/>
+          <w:sz w:val="22"/>
+          <w:szCs w:val="22"/>
+          <w:lang w:val="en-AU"/>
+        </w:rPr>
+        <w:br/>
+      </w:r>
+      <w:r>
+        <w:rPr>
+          <w:noProof/>
+          <w:sz w:val="22"/>
+          <w:szCs w:val="22"/>
+          <w:lang w:val="en-AU"/>
+        </w:rPr>
+        <w:br/>
+      </w:r>
+      <w:r>
+        <w:rPr>
+          <w:noProof/>
+          <w:sz w:val="22"/>
+          <w:szCs w:val="22"/>
+          <w:lang w:val="en-AU"/>
+        </w:rPr>
+        <w:br/>
+      </w:r>
+      <w:r>
+        <w:rPr>
+          <w:noProof/>
+          <w:sz w:val="22"/>
+          <w:szCs w:val="22"/>
+          <w:lang w:val="en-AU"/>
+        </w:rPr>
+        <w:br/>
+      </w:r>
+      <w:r>
+        <w:rPr>
+          <w:noProof/>
+          <w:sz w:val="22"/>
+          <w:szCs w:val="22"/>
+          <w:lang w:val="en-AU"/>
+        </w:rPr>
+        <w:br/>
+      </w:r>
+      <w:r>
+        <w:rPr>
+          <w:noProof/>
+          <w:sz w:val="22"/>
+          <w:szCs w:val="22"/>
+          <w:lang w:val="en-AU"/>
+        </w:rPr>
+        <w:br/>
+      </w:r>
+      <w:r>
+        <w:rPr>
+          <w:noProof/>
+          <w:sz w:val="22"/>
+          <w:szCs w:val="22"/>
+          <w:lang w:val="en-AU"/>
+        </w:rPr>
+        <w:br/>
+      </w:r>
+      <w:r>
+        <w:rPr>
+          <w:noProof/>
+          <w:sz w:val="22"/>
+          <w:szCs w:val="22"/>
+          <w:lang w:val="en-AU"/>
+        </w:rPr>
+        <w:br/>
+      </w:r>
+      <w:r>
+        <w:rPr>
+          <w:noProof/>
+          <w:sz w:val="22"/>
+          <w:szCs w:val="22"/>
+          <w:lang w:val="en-AU"/>
+        </w:rPr>
+        <w:br/>
+      </w:r>
+      <w:r>
+        <w:rPr>
+          <w:noProof/>
+          <w:sz w:val="22"/>
+          <w:szCs w:val="22"/>
+          <w:lang w:val="en-AU"/>
+        </w:rPr>
+        <w:br/>
+      </w:r>
+      <w:r>
+        <w:rPr>
+          <w:noProof/>
+          <w:sz w:val="22"/>
+          <w:szCs w:val="22"/>
+          <w:lang w:val="en-AU"/>
+        </w:rPr>
+        <w:lastRenderedPageBreak/>
+        <w:br/>
+      </w:r>
+      <w:r>
+        <w:rPr>
+          <w:noProof/>
+          <w:sz w:val="22"/>
+          <w:szCs w:val="22"/>
+          <w:lang w:val="en-AU"/>
+        </w:rPr>
+        <w:br/>
+      </w:r>
+      <w:r>
+        <w:rPr>
+          <w:noProof/>
+          <w:sz w:val="22"/>
+          <w:szCs w:val="22"/>
+          <w:lang w:val="en-AU"/>
+        </w:rPr>
+        <w:br/>
+        <w:t xml:space="preserve">Testing </w:t>
+      </w:r>
+    </w:p>
+    <w:tbl>
+      <w:tblPr>
+        <w:tblStyle w:val="TableGrid"/>
+        <w:tblW w:w="0" w:type="auto"/>
+        <w:tblLook w:val="04A0" w:firstRow="1" w:lastRow="0" w:firstColumn="1" w:lastColumn="0" w:noHBand="0" w:noVBand="1"/>
+      </w:tblPr>
+      <w:tblGrid>
+        <w:gridCol w:w="1680"/>
+        <w:gridCol w:w="1375"/>
+        <w:gridCol w:w="1247"/>
+        <w:gridCol w:w="2873"/>
+        <w:gridCol w:w="1841"/>
+      </w:tblGrid>
+      <w:tr>
+        <w:tc>
+          <w:tcPr>
+            <w:tcW w:w="1752" w:type="dxa"/>
+          </w:tcPr>
+          <w:p>
+            <w:pPr>
+              <w:rPr>
+                <w:noProof/>
+                <w:sz w:val="22"/>
+                <w:szCs w:val="22"/>
+                <w:lang w:val="en-AU"/>
+              </w:rPr>
+            </w:pPr>
+            <w:r>
+              <w:rPr>
+                <w:noProof/>
+                <w:sz w:val="22"/>
+                <w:szCs w:val="22"/>
+                <w:lang w:val="en-AU"/>
+              </w:rPr>
+              <w:t>Test</w:t>
+            </w:r>
+          </w:p>
+        </w:tc>
+        <w:tc>
+          <w:tcPr>
+            <w:tcW w:w="1432" w:type="dxa"/>
+          </w:tcPr>
+          <w:p>
+            <w:pPr>
+              <w:rPr>
+                <w:noProof/>
+                <w:sz w:val="22"/>
+                <w:szCs w:val="22"/>
+                <w:lang w:val="en-AU"/>
+              </w:rPr>
+            </w:pPr>
+            <w:r>
+              <w:rPr>
+                <w:noProof/>
+                <w:sz w:val="22"/>
+                <w:szCs w:val="22"/>
+                <w:lang w:val="en-AU"/>
+              </w:rPr>
+              <w:t>What test</w:t>
+            </w:r>
+          </w:p>
+        </w:tc>
+        <w:tc>
+          <w:tcPr>
+            <w:tcW w:w="1298" w:type="dxa"/>
+          </w:tcPr>
+          <w:p>
+            <w:pPr>
+              <w:rPr>
+                <w:noProof/>
+                <w:sz w:val="22"/>
+                <w:szCs w:val="22"/>
+                <w:lang w:val="en-AU"/>
+              </w:rPr>
+            </w:pPr>
+            <w:r>
+              <w:rPr>
+                <w:noProof/>
+                <w:sz w:val="22"/>
+                <w:szCs w:val="22"/>
+                <w:lang w:val="en-AU"/>
+              </w:rPr>
+              <w:t xml:space="preserve">Expected result </w:t>
+            </w:r>
+          </w:p>
+        </w:tc>
+        <w:tc>
+          <w:tcPr>
+            <w:tcW w:w="2613" w:type="dxa"/>
+          </w:tcPr>
+          <w:p>
+            <w:pPr>
+              <w:rPr>
+                <w:noProof/>
+                <w:sz w:val="22"/>
+                <w:szCs w:val="22"/>
+                <w:lang w:val="en-AU"/>
+              </w:rPr>
+            </w:pPr>
+            <w:r>
+              <w:rPr>
+                <w:noProof/>
+                <w:sz w:val="22"/>
+                <w:szCs w:val="22"/>
+                <w:lang w:val="en-AU"/>
+              </w:rPr>
+              <w:t>Result</w:t>
+            </w:r>
+          </w:p>
+        </w:tc>
+        <w:tc>
+          <w:tcPr>
+            <w:tcW w:w="1921" w:type="dxa"/>
+          </w:tcPr>
+          <w:p>
+            <w:pPr>
+              <w:rPr>
+                <w:noProof/>
+                <w:sz w:val="22"/>
+                <w:szCs w:val="22"/>
+                <w:lang w:val="en-AU"/>
+              </w:rPr>
+            </w:pPr>
+            <w:r>
+              <w:rPr>
+                <w:noProof/>
+                <w:sz w:val="22"/>
+                <w:szCs w:val="22"/>
+                <w:lang w:val="en-AU"/>
+              </w:rPr>
+              <w:t>Pass/fail/improvemt</w:t>
+            </w:r>
+          </w:p>
+        </w:tc>
+      </w:tr>
+      <w:tr>
+        <w:tc>
+          <w:tcPr>
+            <w:tcW w:w="1752" w:type="dxa"/>
+          </w:tcPr>
+          <w:p>
+            <w:pPr>
+              <w:rPr>
+                <w:noProof/>
+                <w:sz w:val="22"/>
+                <w:szCs w:val="22"/>
+                <w:lang w:val="en-AU"/>
+              </w:rPr>
+            </w:pPr>
+            <w:r>
+              <w:rPr>
+                <w:noProof/>
+                <w:sz w:val="22"/>
+                <w:szCs w:val="22"/>
+                <w:lang w:val="en-AU"/>
+              </w:rPr>
+              <w:t>CSV upload</w:t>
+            </w:r>
+          </w:p>
+        </w:tc>
+        <w:tc>
+          <w:tcPr>
+            <w:tcW w:w="1432" w:type="dxa"/>
+          </w:tcPr>
+          <w:p>
+            <w:pPr>
+              <w:rPr>
+                <w:noProof/>
+                <w:sz w:val="22"/>
+                <w:szCs w:val="22"/>
+                <w:lang w:val="en-AU"/>
+              </w:rPr>
+            </w:pPr>
+            <w:r>
+              <w:rPr>
+                <w:noProof/>
+                <w:sz w:val="22"/>
+                <w:szCs w:val="22"/>
+                <w:lang w:val="en-AU"/>
+              </w:rPr>
+              <w:t>Upload a valid ANZ CSV file</w:t>
+            </w:r>
+          </w:p>
+        </w:tc>
+        <w:tc>
+          <w:tcPr>
+            <w:tcW w:w="1298" w:type="dxa"/>
+          </w:tcPr>
+          <w:p>
+            <w:pPr>
+              <w:rPr>
+                <w:noProof/>
+                <w:sz w:val="22"/>
+                <w:szCs w:val="22"/>
+                <w:lang w:val="en-AU"/>
+              </w:rPr>
+            </w:pPr>
+            <w:r>
+              <w:rPr>
+                <w:noProof/>
+                <w:sz w:val="22"/>
+                <w:szCs w:val="22"/>
+                <w:lang w:val="en-AU"/>
+              </w:rPr>
+              <w:t>File uploads and transactions are read correctly</w:t>
+            </w:r>
+          </w:p>
+        </w:tc>
+        <w:tc>
+          <w:tcPr>
+            <w:tcW w:w="2613" w:type="dxa"/>
+          </w:tcPr>
+          <w:p>
+            <w:pPr>
+              <w:rPr>
+                <w:noProof/>
+                <w:sz w:val="22"/>
+                <w:szCs w:val="22"/>
+                <w:lang w:val="en-AU"/>
+              </w:rPr>
+            </w:pPr>
+            <w:r>
+              <w:rPr>
+                <w:noProof/>
+                <w:sz w:val="22"/>
+                <w:szCs w:val="22"/>
+                <w:lang w:val="en-AU"/>
+              </w:rPr>
+              <w:drawing>
+                <wp:inline distT="0" distB="0" distL="0" distR="0" wp14:anchorId="03E3D195" wp14:editId="5732C00F">
+                  <wp:extent cx="973960" cy="1148336"/>
+                  <wp:effectExtent l="0" t="0" r="4445" b="0"/>
+                  <wp:docPr id="472539126" name="Picture 4"/>
+                  <wp:cNvGraphicFramePr>
+                    <a:graphicFrameLocks xmlns:a="http://schemas.openxmlformats.org/drawingml/2006/main" noChangeAspect="1"/>
+                  </wp:cNvGraphicFramePr>
+                  <a:graphic xmlns:a="http://schemas.openxmlformats.org/drawingml/2006/main">
+                    <a:graphicData uri="http://schemas.openxmlformats.org/drawingml/2006/picture">
+                      <pic:pic xmlns:pic="http://schemas.openxmlformats.org/drawingml/2006/picture">
+                        <pic:nvPicPr>
+                          <pic:cNvPr id="472539126" name="Picture 472539126"/>
+                          <pic:cNvPicPr/>
+                        </pic:nvPicPr>
+                        <pic:blipFill>
+                          <a:blip r:embed="rId35" cstate="print">
+                            <a:extLst>
+                              <a:ext uri="{28A0092B-C50C-407E-A947-70E740481C1C}">
+                                <a14:useLocalDpi xmlns:a14="http://schemas.microsoft.com/office/drawing/2010/main" val="0"/>
+                              </a:ext>
+                            </a:extLst>
+                          </a:blip>
+                          <a:stretch>
+                            <a:fillRect/>
+                          </a:stretch>
+                        </pic:blipFill>
+                        <pic:spPr>
+                          <a:xfrm>
+                            <a:off x="0" y="0"/>
+                            <a:ext cx="1000742" cy="1179913"/>
+                          </a:xfrm>
+                          <a:prstGeom prst="rect">
+                            <a:avLst/>
+                          </a:prstGeom>
+                        </pic:spPr>
+                      </pic:pic>
+                    </a:graphicData>
+                  </a:graphic>
+                </wp:inline>
+              </w:drawing>
+            </w:r>
+          </w:p>
+        </w:tc>
+        <w:tc>
+          <w:tcPr>
+            <w:tcW w:w="1921" w:type="dxa"/>
+          </w:tcPr>
+          <w:p>
+            <w:pPr>
+              <w:rPr>
+                <w:noProof/>
+                <w:sz w:val="22"/>
+                <w:szCs w:val="22"/>
+                <w:lang w:val="en-AU"/>
+              </w:rPr>
+            </w:pPr>
+            <w:r>
+              <w:rPr>
+                <w:noProof/>
+                <w:sz w:val="22"/>
+                <w:szCs w:val="22"/>
+                <w:lang w:val="en-AU"/>
+              </w:rPr>
+              <w:t>Pass</w:t>
+            </w:r>
+          </w:p>
+        </w:tc>
+      </w:tr>
+      <w:tr>
+        <w:tc>
+          <w:tcPr>
+            <w:tcW w:w="1752" w:type="dxa"/>
+          </w:tcPr>
+          <w:p>
+            <w:pPr>
+              <w:rPr>
+                <w:noProof/>
+                <w:sz w:val="22"/>
+                <w:szCs w:val="22"/>
+                <w:lang w:val="en-AU"/>
+              </w:rPr>
+            </w:pPr>
+            <w:r>
+              <w:rPr>
+                <w:noProof/>
+                <w:sz w:val="22"/>
+                <w:szCs w:val="22"/>
+                <w:lang w:val="en-AU"/>
+              </w:rPr>
+              <w:t>Transaction categories</w:t>
+            </w:r>
+          </w:p>
+        </w:tc>
+        <w:tc>
+          <w:tcPr>
+            <w:tcW w:w="1432" w:type="dxa"/>
+          </w:tcPr>
+          <w:p>
+            <w:pPr>
+              <w:rPr>
+                <w:noProof/>
+                <w:sz w:val="22"/>
+                <w:szCs w:val="22"/>
+                <w:lang w:val="en-AU"/>
+              </w:rPr>
+            </w:pPr>
+            <w:r>
+              <w:rPr>
+                <w:noProof/>
+                <w:sz w:val="22"/>
+                <w:szCs w:val="22"/>
+                <w:lang w:val="en-AU"/>
+              </w:rPr>
+              <w:t>Check Food, Transport, Tuck shop, Entertainment and Other</w:t>
+            </w:r>
+          </w:p>
+        </w:tc>
+        <w:tc>
+          <w:tcPr>
+            <w:tcW w:w="1298" w:type="dxa"/>
+          </w:tcPr>
+          <w:p>
+            <w:pPr>
+              <w:rPr>
+                <w:noProof/>
+                <w:sz w:val="22"/>
+                <w:szCs w:val="22"/>
+                <w:lang w:val="en-AU"/>
+              </w:rPr>
+            </w:pPr>
+            <w:r>
+              <w:rPr>
+                <w:noProof/>
+                <w:sz w:val="22"/>
+                <w:szCs w:val="22"/>
+                <w:lang w:val="en-AU"/>
+              </w:rPr>
+              <w:t>Transactions are placed into the correct category</w:t>
+            </w:r>
+          </w:p>
+        </w:tc>
+        <w:tc>
+          <w:tcPr>
+            <w:tcW w:w="2613" w:type="dxa"/>
+          </w:tcPr>
+          <w:p>
+            <w:pPr>
+              <w:rPr>
+                <w:noProof/>
+                <w:sz w:val="22"/>
+                <w:szCs w:val="22"/>
+                <w:lang w:val="en-AU"/>
+              </w:rPr>
+            </w:pPr>
+            <w:r>
+              <w:rPr>
+                <w:noProof/>
+                <w:sz w:val="22"/>
+                <w:szCs w:val="22"/>
+                <w:lang w:val="en-AU"/>
+              </w:rPr>
+              <w:drawing>
+                <wp:inline distT="0" distB="0" distL="0" distR="0" wp14:anchorId="4C72C371" wp14:editId="69F0D546">
+                  <wp:extent cx="720439" cy="1685096"/>
+                  <wp:effectExtent l="0" t="0" r="3810" b="4445"/>
+                  <wp:docPr id="2084411918" name="Picture 5"/>
+                  <wp:cNvGraphicFramePr>
+                    <a:graphicFrameLocks xmlns:a="http://schemas.openxmlformats.org/drawingml/2006/main" noChangeAspect="1"/>
+                  </wp:cNvGraphicFramePr>
+                  <a:graphic xmlns:a="http://schemas.openxmlformats.org/drawingml/2006/main">
+                    <a:graphicData uri="http://schemas.openxmlformats.org/drawingml/2006/picture">
+                      <pic:pic xmlns:pic="http://schemas.openxmlformats.org/drawingml/2006/picture">
+                        <pic:nvPicPr>
+                          <pic:cNvPr id="2084411918" name="Picture 2084411918"/>
+                          <pic:cNvPicPr/>
+                        </pic:nvPicPr>
+                        <pic:blipFill>
+                          <a:blip r:embed="rId36" cstate="print">
+                            <a:extLst>
+                              <a:ext uri="{28A0092B-C50C-407E-A947-70E740481C1C}">
+                                <a14:useLocalDpi xmlns:a14="http://schemas.microsoft.com/office/drawing/2010/main" val="0"/>
+                              </a:ext>
+                            </a:extLst>
+                          </a:blip>
+                          <a:stretch>
+                            <a:fillRect/>
+                          </a:stretch>
+                        </pic:blipFill>
+                        <pic:spPr>
+                          <a:xfrm>
+                            <a:off x="0" y="0"/>
+                            <a:ext cx="731166" cy="1710187"/>
+                          </a:xfrm>
+                          <a:prstGeom prst="rect">
+                            <a:avLst/>
+                          </a:prstGeom>
+                        </pic:spPr>
+                      </pic:pic>
+                    </a:graphicData>
+                  </a:graphic>
+                </wp:inline>
+              </w:drawing>
+            </w:r>
+          </w:p>
+        </w:tc>
+        <w:tc>
+          <w:tcPr>
+            <w:tcW w:w="1921" w:type="dxa"/>
+          </w:tcPr>
+          <w:p>
+            <w:pPr>
+              <w:rPr>
+                <w:noProof/>
+                <w:sz w:val="22"/>
+                <w:szCs w:val="22"/>
+                <w:lang w:val="en-AU"/>
+              </w:rPr>
+            </w:pPr>
+            <w:r>
+              <w:rPr>
+                <w:noProof/>
+                <w:sz w:val="22"/>
+                <w:szCs w:val="22"/>
+                <w:lang w:val="en-AU"/>
+              </w:rPr>
+              <w:t>Pass</w:t>
+            </w:r>
+          </w:p>
+        </w:tc>
+      </w:tr>
+      <w:tr>
+        <w:tc>
+          <w:tcPr>
+            <w:tcW w:w="1752" w:type="dxa"/>
+          </w:tcPr>
+          <w:p>
+            <w:pPr>
+              <w:rPr>
+                <w:noProof/>
+                <w:sz w:val="22"/>
+                <w:szCs w:val="22"/>
+                <w:lang w:val="en-AU"/>
+              </w:rPr>
+            </w:pPr>
+            <w:r>
+              <w:rPr>
+                <w:noProof/>
+                <w:sz w:val="22"/>
+                <w:szCs w:val="22"/>
+                <w:lang w:val="en-AU"/>
+              </w:rPr>
+              <w:t>Money coming in</w:t>
+            </w:r>
+          </w:p>
+        </w:tc>
+        <w:tc>
+          <w:tcPr>
+            <w:tcW w:w="1432" w:type="dxa"/>
+          </w:tcPr>
+          <w:p>
+            <w:pPr>
+              <w:rPr>
+                <w:noProof/>
+                <w:sz w:val="22"/>
+                <w:szCs w:val="22"/>
+                <w:lang w:val="en-AU"/>
+              </w:rPr>
+            </w:pPr>
+            <w:r>
+              <w:rPr>
+                <w:noProof/>
+                <w:sz w:val="22"/>
+                <w:szCs w:val="22"/>
+                <w:lang w:val="en-AU"/>
+              </w:rPr>
+              <w:t>Test a positive amount</w:t>
+            </w:r>
+          </w:p>
+        </w:tc>
+        <w:tc>
+          <w:tcPr>
+            <w:tcW w:w="1298" w:type="dxa"/>
+          </w:tcPr>
+          <w:p>
+            <w:pPr>
+              <w:rPr>
+                <w:noProof/>
+                <w:sz w:val="22"/>
+                <w:szCs w:val="22"/>
+                <w:lang w:val="en-AU"/>
+              </w:rPr>
+            </w:pPr>
+            <w:r>
+              <w:rPr>
+                <w:noProof/>
+                <w:sz w:val="22"/>
+                <w:szCs w:val="22"/>
+                <w:lang w:val="en-AU"/>
+              </w:rPr>
+              <w:t>Transaction is recognised as money coming in</w:t>
+            </w:r>
+          </w:p>
+        </w:tc>
+        <w:tc>
+          <w:tcPr>
+            <w:tcW w:w="2613" w:type="dxa"/>
+          </w:tcPr>
+          <w:p>
+            <w:pPr>
+              <w:rPr>
+                <w:noProof/>
+                <w:sz w:val="22"/>
+                <w:szCs w:val="22"/>
+                <w:lang w:val="en-AU"/>
+              </w:rPr>
+            </w:pPr>
+            <w:r>
+              <w:rPr>
+                <w:noProof/>
+                <w:sz w:val="22"/>
+                <w:szCs w:val="22"/>
+                <w:lang w:val="en-AU"/>
+              </w:rPr>
+              <w:drawing>
+                <wp:inline distT="0" distB="0" distL="0" distR="0" wp14:anchorId="7095AA44" wp14:editId="0BB2EB12">
+                  <wp:extent cx="95139" cy="927052"/>
+                  <wp:effectExtent l="0" t="0" r="0" b="635"/>
+                  <wp:docPr id="883001088" name="Picture 6"/>
+                  <wp:cNvGraphicFramePr>
+                    <a:graphicFrameLocks xmlns:a="http://schemas.openxmlformats.org/drawingml/2006/main" noChangeAspect="1"/>
+                  </wp:cNvGraphicFramePr>
+                  <a:graphic xmlns:a="http://schemas.openxmlformats.org/drawingml/2006/main">
+                    <a:graphicData uri="http://schemas.openxmlformats.org/drawingml/2006/picture">
+                      <pic:pic xmlns:pic="http://schemas.openxmlformats.org/drawingml/2006/picture">
+                        <pic:nvPicPr>
+                          <pic:cNvPr id="883001088" name="Picture 883001088"/>
+                          <pic:cNvPicPr/>
+                        </pic:nvPicPr>
+                        <pic:blipFill>
+                          <a:blip r:embed="rId37" cstate="print">
+                            <a:extLst>
+                              <a:ext uri="{28A0092B-C50C-407E-A947-70E740481C1C}">
+                                <a14:useLocalDpi xmlns:a14="http://schemas.microsoft.com/office/drawing/2010/main" val="0"/>
+                              </a:ext>
+                            </a:extLst>
+                          </a:blip>
+                          <a:stretch>
+                            <a:fillRect/>
+                          </a:stretch>
+                        </pic:blipFill>
+                        <pic:spPr>
+                          <a:xfrm>
+                            <a:off x="0" y="0"/>
+                            <a:ext cx="138470" cy="1349274"/>
+                          </a:xfrm>
+                          <a:prstGeom prst="rect">
+                            <a:avLst/>
+                          </a:prstGeom>
+                        </pic:spPr>
+                      </pic:pic>
+                    </a:graphicData>
+                  </a:graphic>
+                </wp:inline>
+              </w:drawing>
+            </w:r>
+          </w:p>
+        </w:tc>
+        <w:tc>
+          <w:tcPr>
+            <w:tcW w:w="1921" w:type="dxa"/>
+          </w:tcPr>
+          <w:p>
+            <w:pPr>
+              <w:rPr>
+                <w:noProof/>
+                <w:sz w:val="22"/>
+                <w:szCs w:val="22"/>
+                <w:lang w:val="en-AU"/>
+              </w:rPr>
+            </w:pPr>
+            <w:r>
+              <w:rPr>
+                <w:noProof/>
+                <w:sz w:val="22"/>
+                <w:szCs w:val="22"/>
+                <w:lang w:val="en-AU"/>
+              </w:rPr>
+              <w:t>Pass</w:t>
+            </w:r>
+          </w:p>
+        </w:tc>
+      </w:tr>
+      <w:tr>
+        <w:tc>
+          <w:tcPr>
+            <w:tcW w:w="1752" w:type="dxa"/>
+          </w:tcPr>
+          <w:p>
+            <w:pPr>
+              <w:rPr>
+                <w:noProof/>
+                <w:sz w:val="22"/>
+                <w:szCs w:val="22"/>
+                <w:lang w:val="en-AU"/>
+              </w:rPr>
+            </w:pPr>
+            <w:r>
+              <w:rPr>
+                <w:noProof/>
+                <w:sz w:val="22"/>
+                <w:szCs w:val="22"/>
+                <w:lang w:val="en-AU"/>
+              </w:rPr>
+              <w:t xml:space="preserve">Money coming out </w:t>
+            </w:r>
+          </w:p>
+        </w:tc>
+        <w:tc>
+          <w:tcPr>
+            <w:tcW w:w="1432" w:type="dxa"/>
+          </w:tcPr>
+          <w:p>
+            <w:pPr>
+              <w:rPr>
+                <w:noProof/>
+                <w:sz w:val="22"/>
+                <w:szCs w:val="22"/>
+                <w:lang w:val="en-AU"/>
+              </w:rPr>
+            </w:pPr>
+            <w:r>
+              <w:rPr>
+                <w:noProof/>
+                <w:sz w:val="22"/>
+                <w:szCs w:val="22"/>
+                <w:lang w:val="en-AU"/>
+              </w:rPr>
+              <w:t>Test a Negative amount</w:t>
+            </w:r>
+          </w:p>
+        </w:tc>
+        <w:tc>
+          <w:tcPr>
+            <w:tcW w:w="1298" w:type="dxa"/>
+          </w:tcPr>
+          <w:p>
+            <w:pPr>
+              <w:rPr>
+                <w:noProof/>
+                <w:sz w:val="22"/>
+                <w:szCs w:val="22"/>
+                <w:lang w:val="en-AU"/>
+              </w:rPr>
+            </w:pPr>
+            <w:r>
+              <w:rPr>
+                <w:noProof/>
+                <w:sz w:val="22"/>
+                <w:szCs w:val="22"/>
+                <w:lang w:val="en-AU"/>
+              </w:rPr>
+              <w:t>Transaction is recognised as money going out</w:t>
+            </w:r>
+          </w:p>
+        </w:tc>
+        <w:tc>
+          <w:tcPr>
+            <w:tcW w:w="2613" w:type="dxa"/>
+          </w:tcPr>
+          <w:p>
+            <w:pPr>
+              <w:rPr>
+                <w:noProof/>
+                <w:sz w:val="22"/>
+                <w:szCs w:val="22"/>
+                <w:lang w:val="en-AU"/>
+              </w:rPr>
+            </w:pPr>
+            <w:r>
+              <w:rPr>
+                <w:noProof/>
+                <w:sz w:val="22"/>
+                <w:szCs w:val="22"/>
+                <w:lang w:val="en-AU"/>
+              </w:rPr>
+              <w:t>(Same imagie above)</w:t>
+            </w:r>
+          </w:p>
+        </w:tc>
+        <w:tc>
+          <w:tcPr>
+            <w:tcW w:w="1921" w:type="dxa"/>
+          </w:tcPr>
+          <w:p>
+            <w:pPr>
+              <w:rPr>
+                <w:noProof/>
+                <w:sz w:val="22"/>
+                <w:szCs w:val="22"/>
+                <w:lang w:val="en-AU"/>
+              </w:rPr>
+            </w:pPr>
+            <w:r>
+              <w:rPr>
+                <w:noProof/>
+                <w:sz w:val="22"/>
+                <w:szCs w:val="22"/>
+                <w:lang w:val="en-AU"/>
+              </w:rPr>
+              <w:t>Pass</w:t>
+            </w:r>
+          </w:p>
+        </w:tc>
+      </w:tr>
+      <w:tr>
+        <w:tc>
+          <w:tcPr>
+            <w:tcW w:w="1752" w:type="dxa"/>
+          </w:tcPr>
+          <w:p>
+            <w:pPr>
+              <w:rPr>
+                <w:noProof/>
+                <w:sz w:val="22"/>
+                <w:szCs w:val="22"/>
+                <w:lang w:val="en-AU"/>
+              </w:rPr>
+            </w:pPr>
+            <w:r>
+              <w:rPr>
+                <w:noProof/>
+                <w:sz w:val="22"/>
+                <w:szCs w:val="22"/>
+                <w:lang w:val="en-AU"/>
+              </w:rPr>
+              <w:t>Pie chart</w:t>
+            </w:r>
+          </w:p>
+        </w:tc>
+        <w:tc>
+          <w:tcPr>
+            <w:tcW w:w="1432" w:type="dxa"/>
+          </w:tcPr>
+          <w:p>
+            <w:pPr>
+              <w:rPr>
+                <w:noProof/>
+                <w:sz w:val="22"/>
+                <w:szCs w:val="22"/>
+                <w:lang w:val="en-AU"/>
+              </w:rPr>
+            </w:pPr>
+            <w:r>
+              <w:rPr>
+                <w:noProof/>
+                <w:sz w:val="22"/>
+                <w:szCs w:val="22"/>
+                <w:lang w:val="en-AU"/>
+              </w:rPr>
+              <w:t>Displays the correct way</w:t>
+            </w:r>
+          </w:p>
+        </w:tc>
+        <w:tc>
+          <w:tcPr>
+            <w:tcW w:w="1298" w:type="dxa"/>
+          </w:tcPr>
+          <w:p>
+            <w:pPr>
+              <w:rPr>
+                <w:noProof/>
+                <w:sz w:val="22"/>
+                <w:szCs w:val="22"/>
+                <w:lang w:val="en-AU"/>
+              </w:rPr>
+            </w:pPr>
+            <w:r>
+              <w:rPr>
+                <w:noProof/>
+                <w:sz w:val="22"/>
+                <w:szCs w:val="22"/>
+                <w:lang w:val="en-AU"/>
+              </w:rPr>
+              <w:t>Pie chart appears above the transaction table</w:t>
+            </w:r>
+          </w:p>
+        </w:tc>
+        <w:tc>
+          <w:tcPr>
+            <w:tcW w:w="2613" w:type="dxa"/>
+          </w:tcPr>
+          <w:p>
+            <w:pPr>
+              <w:rPr>
+                <w:noProof/>
+                <w:sz w:val="22"/>
+                <w:szCs w:val="22"/>
+                <w:lang w:val="en-AU"/>
+              </w:rPr>
+            </w:pPr>
+            <w:r>
+              <w:rPr>
+                <w:noProof/>
+                <w:sz w:val="22"/>
+                <w:szCs w:val="22"/>
+                <w:lang w:val="en-AU"/>
+              </w:rPr>
+              <w:drawing>
+                <wp:inline distT="0" distB="0" distL="0" distR="0" wp14:anchorId="7E1074A4" wp14:editId="65305ED5">
+                  <wp:extent cx="784321" cy="806107"/>
+                  <wp:effectExtent l="0" t="0" r="3175" b="0"/>
+                  <wp:docPr id="1133490551" name="Picture 7"/>
+                  <wp:cNvGraphicFramePr>
+                    <a:graphicFrameLocks xmlns:a="http://schemas.openxmlformats.org/drawingml/2006/main" noChangeAspect="1"/>
+                  </wp:cNvGraphicFramePr>
+                  <a:graphic xmlns:a="http://schemas.openxmlformats.org/drawingml/2006/main">
+                    <a:graphicData uri="http://schemas.openxmlformats.org/drawingml/2006/picture">
+                      <pic:pic xmlns:pic="http://schemas.openxmlformats.org/drawingml/2006/picture">
+                        <pic:nvPicPr>
+                          <pic:cNvPr id="1133490551" name="Picture 1133490551"/>
+                          <pic:cNvPicPr/>
+                        </pic:nvPicPr>
+                        <pic:blipFill>
+                          <a:blip r:embed="rId38" cstate="print">
+                            <a:extLst>
+                              <a:ext uri="{28A0092B-C50C-407E-A947-70E740481C1C}">
+                                <a14:useLocalDpi xmlns:a14="http://schemas.microsoft.com/office/drawing/2010/main" val="0"/>
+                              </a:ext>
+                            </a:extLst>
+                          </a:blip>
+                          <a:stretch>
+                            <a:fillRect/>
+                          </a:stretch>
+                        </pic:blipFill>
+                        <pic:spPr>
+                          <a:xfrm>
+                            <a:off x="0" y="0"/>
+                            <a:ext cx="809773" cy="832265"/>
+                          </a:xfrm>
+                          <a:prstGeom prst="rect">
+                            <a:avLst/>
+                          </a:prstGeom>
+                        </pic:spPr>
+                      </pic:pic>
+                    </a:graphicData>
+                  </a:graphic>
+                </wp:inline>
+              </w:drawing>
+            </w:r>
+          </w:p>
+        </w:tc>
+        <w:tc>
+          <w:tcPr>
+            <w:tcW w:w="1921" w:type="dxa"/>
+          </w:tcPr>
+          <w:p>
+            <w:pPr>
+              <w:rPr>
+                <w:noProof/>
+                <w:sz w:val="22"/>
+                <w:szCs w:val="22"/>
+                <w:lang w:val="en-AU"/>
+              </w:rPr>
+            </w:pPr>
+            <w:r>
+              <w:rPr>
+                <w:noProof/>
+                <w:sz w:val="22"/>
+                <w:szCs w:val="22"/>
+                <w:lang w:val="en-AU"/>
+              </w:rPr>
+              <w:t>Pass</w:t>
+            </w:r>
+          </w:p>
+        </w:tc>
+      </w:tr>
+      <w:tr>
+        <w:tc>
+          <w:tcPr>
+            <w:tcW w:w="1752" w:type="dxa"/>
+          </w:tcPr>
+          <w:p>
+            <w:pPr>
+              <w:rPr>
+                <w:noProof/>
+                <w:sz w:val="22"/>
+                <w:szCs w:val="22"/>
+                <w:lang w:val="en-AU"/>
+              </w:rPr>
+            </w:pPr>
+            <w:r>
+              <w:rPr>
+                <w:noProof/>
+                <w:sz w:val="22"/>
+                <w:szCs w:val="22"/>
+                <w:lang w:val="en-AU"/>
+              </w:rPr>
+              <w:t>Tutorial button</w:t>
+            </w:r>
+          </w:p>
+        </w:tc>
+        <w:tc>
+          <w:tcPr>
+            <w:tcW w:w="1432" w:type="dxa"/>
+          </w:tcPr>
+          <w:p>
+            <w:pPr>
+              <w:rPr>
+                <w:noProof/>
+                <w:sz w:val="22"/>
+                <w:szCs w:val="22"/>
+                <w:lang w:val="en-AU"/>
+              </w:rPr>
+            </w:pPr>
+            <w:r>
+              <w:rPr>
+                <w:noProof/>
+                <w:sz w:val="22"/>
+                <w:szCs w:val="22"/>
+                <w:lang w:val="en-AU"/>
+              </w:rPr>
+              <w:t>Click “Click Here to learn how to use”</w:t>
+            </w:r>
+          </w:p>
+        </w:tc>
+        <w:tc>
+          <w:tcPr>
+            <w:tcW w:w="1298" w:type="dxa"/>
+          </w:tcPr>
+          <w:p>
+            <w:pPr>
+              <w:rPr>
+                <w:noProof/>
+                <w:sz w:val="22"/>
+                <w:szCs w:val="22"/>
+                <w:lang w:val="en-AU"/>
+              </w:rPr>
+            </w:pPr>
+            <w:r>
+              <w:rPr>
+                <w:noProof/>
+                <w:sz w:val="22"/>
+                <w:szCs w:val="22"/>
+                <w:lang w:val="en-AU"/>
+              </w:rPr>
+              <w:t>Tutorial popup appears</w:t>
+            </w:r>
+          </w:p>
+        </w:tc>
+        <w:tc>
+          <w:tcPr>
+            <w:tcW w:w="2613" w:type="dxa"/>
+          </w:tcPr>
+          <w:p>
+            <w:pPr>
+              <w:rPr>
+                <w:noProof/>
+                <w:sz w:val="22"/>
+                <w:szCs w:val="22"/>
+                <w:lang w:val="en-AU"/>
+              </w:rPr>
+            </w:pPr>
+            <w:r>
+              <w:rPr>
+                <w:noProof/>
+                <w:sz w:val="22"/>
+                <w:szCs w:val="22"/>
+                <w:lang w:val="en-AU"/>
+              </w:rPr>
+              <w:drawing>
+                <wp:inline distT="0" distB="0" distL="0" distR="0" wp14:anchorId="487E257E" wp14:editId="0D9340FA">
+                  <wp:extent cx="1202737" cy="1388624"/>
+                  <wp:effectExtent l="0" t="0" r="3810" b="0"/>
+                  <wp:docPr id="966398362" name="Picture 8"/>
+                  <wp:cNvGraphicFramePr>
+                    <a:graphicFrameLocks xmlns:a="http://schemas.openxmlformats.org/drawingml/2006/main" noChangeAspect="1"/>
+                  </wp:cNvGraphicFramePr>
+                  <a:graphic xmlns:a="http://schemas.openxmlformats.org/drawingml/2006/main">
+                    <a:graphicData uri="http://schemas.openxmlformats.org/drawingml/2006/picture">
+                      <pic:pic xmlns:pic="http://schemas.openxmlformats.org/drawingml/2006/picture">
+                        <pic:nvPicPr>
+                          <pic:cNvPr id="966398362" name="Picture 966398362"/>
+                          <pic:cNvPicPr/>
+                        </pic:nvPicPr>
+                        <pic:blipFill>
+                          <a:blip r:embed="rId39" cstate="print">
+                            <a:extLst>
+                              <a:ext uri="{28A0092B-C50C-407E-A947-70E740481C1C}">
+                                <a14:useLocalDpi xmlns:a14="http://schemas.microsoft.com/office/drawing/2010/main" val="0"/>
+                              </a:ext>
+                            </a:extLst>
+                          </a:blip>
+                          <a:stretch>
+                            <a:fillRect/>
+                          </a:stretch>
+                        </pic:blipFill>
+                        <pic:spPr>
+                          <a:xfrm>
+                            <a:off x="0" y="0"/>
+                            <a:ext cx="1223086" cy="1412118"/>
+                          </a:xfrm>
+                          <a:prstGeom prst="rect">
+                            <a:avLst/>
+                          </a:prstGeom>
+                        </pic:spPr>
+                      </pic:pic>
+                    </a:graphicData>
+                  </a:graphic>
+                </wp:inline>
+              </w:drawing>
+            </w:r>
+          </w:p>
+        </w:tc>
+        <w:tc>
+          <w:tcPr>
+            <w:tcW w:w="1921" w:type="dxa"/>
+          </w:tcPr>
+          <w:p>
+            <w:pPr>
+              <w:rPr>
+                <w:noProof/>
+                <w:sz w:val="22"/>
+                <w:szCs w:val="22"/>
+                <w:lang w:val="en-AU"/>
+              </w:rPr>
+            </w:pPr>
+            <w:r>
+              <w:rPr>
+                <w:noProof/>
+                <w:sz w:val="22"/>
+                <w:szCs w:val="22"/>
+                <w:lang w:val="en-AU"/>
+              </w:rPr>
+              <w:t>Pass</w:t>
+            </w:r>
+          </w:p>
+        </w:tc>
+      </w:tr>
+      <w:tr>
+        <w:tc>
+          <w:tcPr>
+            <w:tcW w:w="1752" w:type="dxa"/>
+          </w:tcPr>
+          <w:p>
+            <w:pPr>
+              <w:rPr>
+                <w:noProof/>
+                <w:sz w:val="22"/>
+                <w:szCs w:val="22"/>
+                <w:lang w:val="en-AU"/>
+              </w:rPr>
+            </w:pPr>
+            <w:r>
+              <w:rPr>
+                <w:noProof/>
+                <w:sz w:val="22"/>
+                <w:szCs w:val="22"/>
+                <w:lang w:val="en-AU"/>
+              </w:rPr>
+              <w:lastRenderedPageBreak/>
+              <w:t>Tutorial close button</w:t>
+            </w:r>
+          </w:p>
+        </w:tc>
+        <w:tc>
+          <w:tcPr>
+            <w:tcW w:w="1432" w:type="dxa"/>
+          </w:tcPr>
+          <w:p>
+            <w:pPr>
+              <w:rPr>
+                <w:noProof/>
+                <w:sz w:val="22"/>
+                <w:szCs w:val="22"/>
+                <w:lang w:val="en-AU"/>
+              </w:rPr>
+            </w:pPr>
+            <w:r>
+              <w:rPr>
+                <w:noProof/>
+                <w:sz w:val="22"/>
+                <w:szCs w:val="22"/>
+                <w:lang w:val="en-AU"/>
+              </w:rPr>
+              <w:t>Click the X on the popup</w:t>
+            </w:r>
+          </w:p>
+        </w:tc>
+        <w:tc>
+          <w:tcPr>
+            <w:tcW w:w="1298" w:type="dxa"/>
+          </w:tcPr>
+          <w:p>
+            <w:pPr>
+              <w:jc w:val="center"/>
+              <w:rPr>
+                <w:noProof/>
+                <w:sz w:val="22"/>
+                <w:szCs w:val="22"/>
+                <w:lang w:val="en-AU"/>
+              </w:rPr>
+            </w:pPr>
+            <w:r>
+              <w:rPr>
+                <w:noProof/>
+                <w:sz w:val="22"/>
+                <w:szCs w:val="22"/>
+                <w:lang w:val="en-AU"/>
+              </w:rPr>
+              <w:t>Tutorial closes</w:t>
+            </w:r>
+          </w:p>
+        </w:tc>
+        <w:tc>
+          <w:tcPr>
+            <w:tcW w:w="2613" w:type="dxa"/>
+          </w:tcPr>
+          <w:p>
+            <w:pPr>
+              <w:rPr>
+                <w:noProof/>
+                <w:sz w:val="22"/>
+                <w:szCs w:val="22"/>
+                <w:lang w:val="en-AU"/>
+              </w:rPr>
+            </w:pPr>
+            <w:r>
+              <w:rPr>
+                <w:noProof/>
+                <w:sz w:val="22"/>
+                <w:szCs w:val="22"/>
+                <w:lang w:val="en-AU"/>
+              </w:rPr>
+              <w:t>Worked</w:t>
+            </w:r>
+          </w:p>
+        </w:tc>
+        <w:tc>
+          <w:tcPr>
+            <w:tcW w:w="1921" w:type="dxa"/>
+          </w:tcPr>
+          <w:p>
+            <w:pPr>
+              <w:rPr>
+                <w:noProof/>
+                <w:sz w:val="22"/>
+                <w:szCs w:val="22"/>
+                <w:lang w:val="en-AU"/>
+              </w:rPr>
+            </w:pPr>
+            <w:r>
+              <w:rPr>
+                <w:noProof/>
+                <w:sz w:val="22"/>
+                <w:szCs w:val="22"/>
+                <w:lang w:val="en-AU"/>
+              </w:rPr>
+              <w:t>Pass</w:t>
+            </w:r>
+          </w:p>
+        </w:tc>
+      </w:tr>
+      <w:tr>
+        <w:tc>
+          <w:tcPr>
+            <w:tcW w:w="1752" w:type="dxa"/>
+          </w:tcPr>
+          <w:p>
+            <w:pPr>
+              <w:rPr>
+                <w:noProof/>
+                <w:sz w:val="22"/>
+                <w:szCs w:val="22"/>
+                <w:lang w:val="en-AU"/>
+              </w:rPr>
+            </w:pPr>
+            <w:r>
+              <w:rPr>
+                <w:noProof/>
+                <w:sz w:val="22"/>
+                <w:szCs w:val="22"/>
+                <w:lang w:val="en-AU"/>
+              </w:rPr>
+              <w:t>Home navigation</w:t>
+            </w:r>
+          </w:p>
+        </w:tc>
+        <w:tc>
+          <w:tcPr>
+            <w:tcW w:w="1432" w:type="dxa"/>
+          </w:tcPr>
+          <w:p>
+            <w:pPr>
+              <w:rPr>
+                <w:noProof/>
+                <w:sz w:val="22"/>
+                <w:szCs w:val="22"/>
+                <w:lang w:val="en-AU"/>
+              </w:rPr>
+            </w:pPr>
+            <w:r>
+              <w:rPr>
+                <w:noProof/>
+                <w:sz w:val="22"/>
+                <w:szCs w:val="22"/>
+                <w:lang w:val="en-AU"/>
+              </w:rPr>
+              <w:t>Click Home</w:t>
+            </w:r>
+          </w:p>
+        </w:tc>
+        <w:tc>
+          <w:tcPr>
+            <w:tcW w:w="1298" w:type="dxa"/>
+          </w:tcPr>
+          <w:p>
+            <w:pPr>
+              <w:rPr>
+                <w:noProof/>
+                <w:sz w:val="22"/>
+                <w:szCs w:val="22"/>
+                <w:lang w:val="en-AU"/>
+              </w:rPr>
+            </w:pPr>
+            <w:r>
+              <w:rPr>
+                <w:noProof/>
+                <w:sz w:val="22"/>
+                <w:szCs w:val="22"/>
+                <w:lang w:val="en-AU"/>
+              </w:rPr>
+              <w:t>Home page opens</w:t>
+            </w:r>
+          </w:p>
+        </w:tc>
+        <w:tc>
+          <w:tcPr>
+            <w:tcW w:w="2613" w:type="dxa"/>
+          </w:tcPr>
+          <w:p>
+            <w:pPr>
+              <w:rPr>
+                <w:noProof/>
+                <w:sz w:val="22"/>
+                <w:szCs w:val="22"/>
+                <w:lang w:val="en-AU"/>
+              </w:rPr>
+            </w:pPr>
+            <w:r>
+              <w:rPr>
+                <w:noProof/>
+                <w:sz w:val="22"/>
+                <w:szCs w:val="22"/>
+                <w:lang w:val="en-AU"/>
+              </w:rPr>
+              <w:drawing>
+                <wp:inline distT="0" distB="0" distL="0" distR="0" wp14:anchorId="1E0387C1" wp14:editId="1B5D81D2">
+                  <wp:extent cx="1166586" cy="1393932"/>
+                  <wp:effectExtent l="0" t="0" r="1905" b="3175"/>
+                  <wp:docPr id="1980018692" name="Picture 9"/>
+                  <wp:cNvGraphicFramePr>
+                    <a:graphicFrameLocks xmlns:a="http://schemas.openxmlformats.org/drawingml/2006/main" noChangeAspect="1"/>
+                  </wp:cNvGraphicFramePr>
+                  <a:graphic xmlns:a="http://schemas.openxmlformats.org/drawingml/2006/main">
+                    <a:graphicData uri="http://schemas.openxmlformats.org/drawingml/2006/picture">
+                      <pic:pic xmlns:pic="http://schemas.openxmlformats.org/drawingml/2006/picture">
+                        <pic:nvPicPr>
+                          <pic:cNvPr id="1980018692" name="Picture 1980018692"/>
+                          <pic:cNvPicPr/>
+                        </pic:nvPicPr>
+                        <pic:blipFill>
+                          <a:blip r:embed="rId40" cstate="print">
+                            <a:extLst>
+                              <a:ext uri="{28A0092B-C50C-407E-A947-70E740481C1C}">
+                                <a14:useLocalDpi xmlns:a14="http://schemas.microsoft.com/office/drawing/2010/main" val="0"/>
+                              </a:ext>
+                            </a:extLst>
+                          </a:blip>
+                          <a:stretch>
+                            <a:fillRect/>
+                          </a:stretch>
+                        </pic:blipFill>
+                        <pic:spPr>
+                          <a:xfrm>
+                            <a:off x="0" y="0"/>
+                            <a:ext cx="1180002" cy="1409963"/>
+                          </a:xfrm>
+                          <a:prstGeom prst="rect">
+                            <a:avLst/>
+                          </a:prstGeom>
+                        </pic:spPr>
+                      </pic:pic>
+                    </a:graphicData>
+                  </a:graphic>
+                </wp:inline>
+              </w:drawing>
+            </w:r>
+          </w:p>
+        </w:tc>
+        <w:tc>
+          <w:tcPr>
+            <w:tcW w:w="1921" w:type="dxa"/>
+          </w:tcPr>
+          <w:p>
+            <w:pPr>
+              <w:rPr>
+                <w:noProof/>
+                <w:sz w:val="22"/>
+                <w:szCs w:val="22"/>
+                <w:lang w:val="en-AU"/>
+              </w:rPr>
+            </w:pPr>
+            <w:r>
+              <w:rPr>
+                <w:noProof/>
+                <w:sz w:val="22"/>
+                <w:szCs w:val="22"/>
+                <w:lang w:val="en-AU"/>
+              </w:rPr>
+              <w:t>Pass</w:t>
+            </w:r>
+          </w:p>
+        </w:tc>
+      </w:tr>
+      <w:tr>
+        <w:tc>
+          <w:tcPr>
+            <w:tcW w:w="1752" w:type="dxa"/>
+          </w:tcPr>
+          <w:p>
+            <w:pPr>
+              <w:rPr>
+                <w:noProof/>
+                <w:sz w:val="22"/>
+                <w:szCs w:val="22"/>
+                <w:lang w:val="en-AU"/>
+              </w:rPr>
+            </w:pPr>
+            <w:r>
+              <w:rPr>
+                <w:noProof/>
+                <w:sz w:val="22"/>
+                <w:szCs w:val="22"/>
+                <w:lang w:val="en-AU"/>
+              </w:rPr>
+              <w:t>Search navigation</w:t>
+            </w:r>
+          </w:p>
+        </w:tc>
+        <w:tc>
+          <w:tcPr>
+            <w:tcW w:w="1432" w:type="dxa"/>
+          </w:tcPr>
+          <w:p>
+            <w:pPr>
+              <w:rPr>
+                <w:noProof/>
+                <w:sz w:val="22"/>
+                <w:szCs w:val="22"/>
+                <w:lang w:val="en-AU"/>
+              </w:rPr>
+            </w:pPr>
+            <w:r>
+              <w:rPr>
+                <w:noProof/>
+                <w:sz w:val="22"/>
+                <w:szCs w:val="22"/>
+                <w:lang w:val="en-AU"/>
+              </w:rPr>
+              <w:t>Click Search</w:t>
+            </w:r>
+          </w:p>
+        </w:tc>
+        <w:tc>
+          <w:tcPr>
+            <w:tcW w:w="1298" w:type="dxa"/>
+          </w:tcPr>
+          <w:p>
+            <w:pPr>
+              <w:jc w:val="center"/>
+              <w:rPr>
+                <w:noProof/>
+                <w:sz w:val="22"/>
+                <w:szCs w:val="22"/>
+                <w:lang w:val="en-AU"/>
+              </w:rPr>
+            </w:pPr>
+            <w:r>
+              <w:rPr>
+                <w:noProof/>
+                <w:sz w:val="22"/>
+                <w:szCs w:val="22"/>
+                <w:lang w:val="en-AU"/>
+              </w:rPr>
+              <w:t>Search page opens</w:t>
+            </w:r>
+          </w:p>
+        </w:tc>
+        <w:tc>
+          <w:tcPr>
+            <w:tcW w:w="2613" w:type="dxa"/>
+          </w:tcPr>
+          <w:p>
+            <w:pPr>
+              <w:rPr>
+                <w:noProof/>
+                <w:sz w:val="22"/>
+                <w:szCs w:val="22"/>
+                <w:lang w:val="en-AU"/>
+              </w:rPr>
+            </w:pPr>
+            <w:r>
+              <w:rPr>
+                <w:noProof/>
+                <w:sz w:val="22"/>
+                <w:szCs w:val="22"/>
+                <w:lang w:val="en-AU"/>
+              </w:rPr>
+              <w:drawing>
+                <wp:inline distT="0" distB="0" distL="0" distR="0" wp14:anchorId="5DA11AD8" wp14:editId="122E757A">
+                  <wp:extent cx="1538515" cy="545111"/>
+                  <wp:effectExtent l="0" t="0" r="0" b="1270"/>
+                  <wp:docPr id="183351233" name="Picture 10"/>
+                  <wp:cNvGraphicFramePr>
+                    <a:graphicFrameLocks xmlns:a="http://schemas.openxmlformats.org/drawingml/2006/main" noChangeAspect="1"/>
+                  </wp:cNvGraphicFramePr>
+                  <a:graphic xmlns:a="http://schemas.openxmlformats.org/drawingml/2006/main">
+                    <a:graphicData uri="http://schemas.openxmlformats.org/drawingml/2006/picture">
+                      <pic:pic xmlns:pic="http://schemas.openxmlformats.org/drawingml/2006/picture">
+                        <pic:nvPicPr>
+                          <pic:cNvPr id="183351233" name="Picture 183351233"/>
+                          <pic:cNvPicPr/>
+                        </pic:nvPicPr>
+                        <pic:blipFill>
+                          <a:blip r:embed="rId41" cstate="print">
+                            <a:extLst>
+                              <a:ext uri="{28A0092B-C50C-407E-A947-70E740481C1C}">
+                                <a14:useLocalDpi xmlns:a14="http://schemas.microsoft.com/office/drawing/2010/main" val="0"/>
+                              </a:ext>
+                            </a:extLst>
+                          </a:blip>
+                          <a:stretch>
+                            <a:fillRect/>
+                          </a:stretch>
+                        </pic:blipFill>
+                        <pic:spPr>
+                          <a:xfrm>
+                            <a:off x="0" y="0"/>
+                            <a:ext cx="1559234" cy="552452"/>
+                          </a:xfrm>
+                          <a:prstGeom prst="rect">
+                            <a:avLst/>
+                          </a:prstGeom>
+                        </pic:spPr>
+                      </pic:pic>
+                    </a:graphicData>
+                  </a:graphic>
+                </wp:inline>
+              </w:drawing>
+            </w:r>
+          </w:p>
+        </w:tc>
+        <w:tc>
+          <w:tcPr>
+            <w:tcW w:w="1921" w:type="dxa"/>
+          </w:tcPr>
+          <w:p>
+            <w:pPr>
+              <w:rPr>
+                <w:noProof/>
+                <w:sz w:val="22"/>
+                <w:szCs w:val="22"/>
+                <w:lang w:val="en-AU"/>
+              </w:rPr>
+            </w:pPr>
+            <w:r>
+              <w:rPr>
+                <w:noProof/>
+                <w:sz w:val="22"/>
+                <w:szCs w:val="22"/>
+                <w:lang w:val="en-AU"/>
+              </w:rPr>
+              <w:t>Pass</w:t>
+            </w:r>
+          </w:p>
+        </w:tc>
+      </w:tr>
+      <w:tr>
+        <w:tc>
+          <w:tcPr>
+            <w:tcW w:w="1752" w:type="dxa"/>
+          </w:tcPr>
+          <w:p>
+            <w:pPr>
+              <w:rPr>
+                <w:noProof/>
+                <w:sz w:val="22"/>
+                <w:szCs w:val="22"/>
+                <w:lang w:val="en-AU"/>
+              </w:rPr>
+            </w:pPr>
+            <w:r>
+              <w:rPr>
+                <w:noProof/>
+                <w:sz w:val="22"/>
+                <w:szCs w:val="22"/>
+                <w:lang w:val="en-AU"/>
+              </w:rPr>
+              <w:t>Settings navigation</w:t>
+            </w:r>
+          </w:p>
+        </w:tc>
+        <w:tc>
+          <w:tcPr>
+            <w:tcW w:w="1432" w:type="dxa"/>
+          </w:tcPr>
+          <w:p>
+            <w:pPr>
+              <w:rPr>
+                <w:noProof/>
+                <w:sz w:val="22"/>
+                <w:szCs w:val="22"/>
+                <w:lang w:val="en-AU"/>
+              </w:rPr>
+            </w:pPr>
+            <w:r>
+              <w:rPr>
+                <w:noProof/>
+                <w:sz w:val="22"/>
+                <w:szCs w:val="22"/>
+                <w:lang w:val="en-AU"/>
+              </w:rPr>
+              <w:t>Click Settings</w:t>
+            </w:r>
+          </w:p>
+        </w:tc>
+        <w:tc>
+          <w:tcPr>
+            <w:tcW w:w="1298" w:type="dxa"/>
+          </w:tcPr>
+          <w:p>
+            <w:pPr>
+              <w:rPr>
+                <w:noProof/>
+                <w:sz w:val="22"/>
+                <w:szCs w:val="22"/>
+                <w:lang w:val="en-AU"/>
+              </w:rPr>
+            </w:pPr>
+            <w:r>
+              <w:rPr>
+                <w:noProof/>
+                <w:sz w:val="22"/>
+                <w:szCs w:val="22"/>
+                <w:lang w:val="en-AU"/>
+              </w:rPr>
+              <w:t>Settings page opens</w:t>
+            </w:r>
+          </w:p>
+        </w:tc>
+        <w:tc>
+          <w:tcPr>
+            <w:tcW w:w="2613" w:type="dxa"/>
+          </w:tcPr>
+          <w:p>
+            <w:pPr>
+              <w:rPr>
+                <w:noProof/>
+                <w:sz w:val="22"/>
+                <w:szCs w:val="22"/>
+                <w:lang w:val="en-AU"/>
+              </w:rPr>
+            </w:pPr>
+            <w:r>
+              <w:rPr>
+                <w:noProof/>
+                <w:sz w:val="22"/>
+                <w:szCs w:val="22"/>
+                <w:lang w:val="en-AU"/>
+              </w:rPr>
+              <w:drawing>
+                <wp:inline distT="0" distB="0" distL="0" distR="0" wp14:anchorId="21DDF033" wp14:editId="02BC7057">
+                  <wp:extent cx="1703795" cy="1278507"/>
+                  <wp:effectExtent l="0" t="0" r="0" b="4445"/>
+                  <wp:docPr id="228536910" name="Picture 11"/>
+                  <wp:cNvGraphicFramePr>
+                    <a:graphicFrameLocks xmlns:a="http://schemas.openxmlformats.org/drawingml/2006/main" noChangeAspect="1"/>
+                  </wp:cNvGraphicFramePr>
+                  <a:graphic xmlns:a="http://schemas.openxmlformats.org/drawingml/2006/main">
+                    <a:graphicData uri="http://schemas.openxmlformats.org/drawingml/2006/picture">
+                      <pic:pic xmlns:pic="http://schemas.openxmlformats.org/drawingml/2006/picture">
+                        <pic:nvPicPr>
+                          <pic:cNvPr id="228536910" name="Picture 228536910"/>
+                          <pic:cNvPicPr/>
+                        </pic:nvPicPr>
+                        <pic:blipFill>
+                          <a:blip r:embed="rId42" cstate="print">
+                            <a:extLst>
+                              <a:ext uri="{28A0092B-C50C-407E-A947-70E740481C1C}">
+                                <a14:useLocalDpi xmlns:a14="http://schemas.microsoft.com/office/drawing/2010/main" val="0"/>
+                              </a:ext>
+                            </a:extLst>
+                          </a:blip>
+                          <a:stretch>
+                            <a:fillRect/>
+                          </a:stretch>
+                        </pic:blipFill>
+                        <pic:spPr>
+                          <a:xfrm>
+                            <a:off x="0" y="0"/>
+                            <a:ext cx="1722313" cy="1292403"/>
+                          </a:xfrm>
+                          <a:prstGeom prst="rect">
+                            <a:avLst/>
+                          </a:prstGeom>
+                        </pic:spPr>
+                      </pic:pic>
+                    </a:graphicData>
+                  </a:graphic>
+                </wp:inline>
+              </w:drawing>
+            </w:r>
+          </w:p>
+        </w:tc>
+        <w:tc>
+          <w:tcPr>
+            <w:tcW w:w="1921" w:type="dxa"/>
+          </w:tcPr>
+          <w:p>
+            <w:pPr>
+              <w:rPr>
+                <w:noProof/>
+                <w:sz w:val="22"/>
+                <w:szCs w:val="22"/>
+                <w:lang w:val="en-AU"/>
+              </w:rPr>
+            </w:pPr>
+            <w:r>
+              <w:rPr>
+                <w:noProof/>
+                <w:sz w:val="22"/>
+                <w:szCs w:val="22"/>
+                <w:lang w:val="en-AU"/>
+              </w:rPr>
+              <w:t>Pass</w:t>
+            </w:r>
+          </w:p>
+        </w:tc>
+      </w:tr>
+      <w:tr>
+        <w:tc>
+          <w:tcPr>
+            <w:tcW w:w="1752" w:type="dxa"/>
+          </w:tcPr>
+          <w:p>
+            <w:pPr>
+              <w:rPr>
+                <w:noProof/>
+                <w:sz w:val="22"/>
+                <w:szCs w:val="22"/>
+                <w:lang w:val="en-AU"/>
+              </w:rPr>
+            </w:pPr>
+            <w:r>
+              <w:rPr>
+                <w:noProof/>
+                <w:sz w:val="22"/>
+                <w:szCs w:val="22"/>
+                <w:lang w:val="en-AU"/>
+              </w:rPr>
+              <w:t>Mobile layout</w:t>
+            </w:r>
+          </w:p>
+        </w:tc>
+        <w:tc>
+          <w:tcPr>
+            <w:tcW w:w="1432" w:type="dxa"/>
+          </w:tcPr>
+          <w:p>
+            <w:pPr>
+              <w:rPr>
+                <w:noProof/>
+                <w:sz w:val="22"/>
+                <w:szCs w:val="22"/>
+                <w:lang w:val="en-AU"/>
+              </w:rPr>
+            </w:pPr>
+            <w:r>
+              <w:rPr>
+                <w:noProof/>
+                <w:sz w:val="22"/>
+                <w:szCs w:val="22"/>
+                <w:lang w:val="en-AU"/>
+              </w:rPr>
+              <w:t>View website at phone width</w:t>
+            </w:r>
+          </w:p>
+        </w:tc>
+        <w:tc>
+          <w:tcPr>
+            <w:tcW w:w="1298" w:type="dxa"/>
+          </w:tcPr>
+          <w:p>
+            <w:pPr>
+              <w:rPr>
+                <w:noProof/>
+                <w:sz w:val="22"/>
+                <w:szCs w:val="22"/>
+                <w:lang w:val="en-AU"/>
+              </w:rPr>
+            </w:pPr>
+            <w:r>
+              <w:rPr>
+                <w:noProof/>
+                <w:sz w:val="22"/>
+                <w:szCs w:val="22"/>
+                <w:lang w:val="en-AU"/>
+              </w:rPr>
+              <w:t>Content fits screen without unwanted horizontal scrolling</w:t>
+            </w:r>
+          </w:p>
+        </w:tc>
+        <w:tc>
+          <w:tcPr>
+            <w:tcW w:w="2613" w:type="dxa"/>
+          </w:tcPr>
+          <w:p>
+            <w:pPr>
+              <w:rPr>
+                <w:noProof/>
+                <w:sz w:val="22"/>
+                <w:szCs w:val="22"/>
+                <w:lang w:val="en-AU"/>
+              </w:rPr>
+            </w:pPr>
+            <w:r>
+              <w:rPr>
+                <w:noProof/>
+                <w:sz w:val="22"/>
+                <w:szCs w:val="22"/>
+                <w:lang w:val="en-AU"/>
+              </w:rPr>
+              <w:drawing>
+                <wp:inline distT="0" distB="0" distL="0" distR="0" wp14:anchorId="6562F592" wp14:editId="1DCAA8DA">
+                  <wp:extent cx="846884" cy="1872343"/>
+                  <wp:effectExtent l="0" t="0" r="4445" b="0"/>
+                  <wp:docPr id="29965481" name="Picture 12"/>
+                  <wp:cNvGraphicFramePr>
+                    <a:graphicFrameLocks xmlns:a="http://schemas.openxmlformats.org/drawingml/2006/main" noChangeAspect="1"/>
+                  </wp:cNvGraphicFramePr>
+                  <a:graphic xmlns:a="http://schemas.openxmlformats.org/drawingml/2006/main">
+                    <a:graphicData uri="http://schemas.openxmlformats.org/drawingml/2006/picture">
+                      <pic:pic xmlns:pic="http://schemas.openxmlformats.org/drawingml/2006/picture">
+                        <pic:nvPicPr>
+                          <pic:cNvPr id="29965481" name="Picture 29965481"/>
+                          <pic:cNvPicPr/>
+                        </pic:nvPicPr>
+                        <pic:blipFill>
+                          <a:blip r:embed="rId43" cstate="print">
+                            <a:extLst>
+                              <a:ext uri="{28A0092B-C50C-407E-A947-70E740481C1C}">
+                                <a14:useLocalDpi xmlns:a14="http://schemas.microsoft.com/office/drawing/2010/main" val="0"/>
+                              </a:ext>
+                            </a:extLst>
+                          </a:blip>
+                          <a:stretch>
+                            <a:fillRect/>
+                          </a:stretch>
+                        </pic:blipFill>
+                        <pic:spPr>
+                          <a:xfrm>
+                            <a:off x="0" y="0"/>
+                            <a:ext cx="864689" cy="1911707"/>
+                          </a:xfrm>
+                          <a:prstGeom prst="rect">
+                            <a:avLst/>
+                          </a:prstGeom>
+                        </pic:spPr>
+                      </pic:pic>
+                    </a:graphicData>
+                  </a:graphic>
+                </wp:inline>
+              </w:drawing>
+            </w:r>
+          </w:p>
+        </w:tc>
+        <w:tc>
+          <w:tcPr>
+            <w:tcW w:w="1921" w:type="dxa"/>
+          </w:tcPr>
+          <w:p>
+            <w:pPr>
+              <w:rPr>
+                <w:noProof/>
+                <w:sz w:val="22"/>
+                <w:szCs w:val="22"/>
+                <w:lang w:val="en-AU"/>
+              </w:rPr>
+            </w:pPr>
+            <w:r>
+              <w:rPr>
+                <w:noProof/>
+                <w:sz w:val="22"/>
+                <w:szCs w:val="22"/>
+                <w:lang w:val="en-AU"/>
+              </w:rPr>
+              <w:t>Pass</w:t>
+            </w:r>
+          </w:p>
+        </w:tc>
+      </w:tr>
+      <w:tr>
+        <w:tc>
+          <w:tcPr>
+            <w:tcW w:w="1752" w:type="dxa"/>
+          </w:tcPr>
+          <w:p>
+            <w:pPr>
+              <w:rPr>
+                <w:noProof/>
+                <w:sz w:val="22"/>
+                <w:szCs w:val="22"/>
+                <w:lang w:val="en-AU"/>
+              </w:rPr>
+            </w:pPr>
+            <w:r>
+              <w:rPr>
+                <w:noProof/>
+                <w:sz w:val="22"/>
+                <w:szCs w:val="22"/>
+                <w:lang w:val="en-AU"/>
+              </w:rPr>
+              <w:t>Navigation on mobile</w:t>
+            </w:r>
+          </w:p>
+        </w:tc>
+        <w:tc>
+          <w:tcPr>
+            <w:tcW w:w="1432" w:type="dxa"/>
+          </w:tcPr>
+          <w:p>
+            <w:pPr>
+              <w:rPr>
+                <w:noProof/>
+                <w:sz w:val="22"/>
+                <w:szCs w:val="22"/>
+                <w:lang w:val="en-AU"/>
+              </w:rPr>
+            </w:pPr>
+            <w:r>
+              <w:rPr>
+                <w:noProof/>
+                <w:sz w:val="22"/>
+                <w:szCs w:val="22"/>
+                <w:lang w:val="en-AU"/>
+              </w:rPr>
+              <w:t>View bottom menu on phone width</w:t>
+            </w:r>
+          </w:p>
+        </w:tc>
+        <w:tc>
+          <w:tcPr>
+            <w:tcW w:w="1298" w:type="dxa"/>
+          </w:tcPr>
+          <w:p>
+            <w:pPr>
+              <w:rPr>
+                <w:noProof/>
+                <w:sz w:val="22"/>
+                <w:szCs w:val="22"/>
+                <w:lang w:val="en-AU"/>
+              </w:rPr>
+            </w:pPr>
+            <w:r>
+              <w:rPr>
+                <w:noProof/>
+                <w:sz w:val="22"/>
+                <w:szCs w:val="22"/>
+                <w:lang w:val="en-AU"/>
+              </w:rPr>
+              <w:t>View bottom menu on phone width</w:t>
+            </w:r>
+          </w:p>
+        </w:tc>
+        <w:tc>
+          <w:tcPr>
+            <w:tcW w:w="2613" w:type="dxa"/>
+          </w:tcPr>
+          <w:p>
+            <w:pPr>
+              <w:rPr>
+                <w:noProof/>
+                <w:sz w:val="22"/>
+                <w:szCs w:val="22"/>
+                <w:lang w:val="en-AU"/>
+              </w:rPr>
+            </w:pPr>
+            <w:r>
+              <w:rPr>
+                <w:noProof/>
+                <w:sz w:val="22"/>
+                <w:szCs w:val="22"/>
+                <w:lang w:val="en-AU"/>
+              </w:rPr>
+              <w:t>Worked</w:t>
+            </w:r>
+          </w:p>
+        </w:tc>
+        <w:tc>
+          <w:tcPr>
+            <w:tcW w:w="1921" w:type="dxa"/>
+          </w:tcPr>
+          <w:p>
+            <w:pPr>
+              <w:rPr>
+                <w:noProof/>
+                <w:sz w:val="22"/>
+                <w:szCs w:val="22"/>
+                <w:lang w:val="en-AU"/>
+              </w:rPr>
+            </w:pPr>
+            <w:r>
+              <w:rPr>
+                <w:noProof/>
+                <w:sz w:val="22"/>
+                <w:szCs w:val="22"/>
+                <w:lang w:val="en-AU"/>
+              </w:rPr>
+              <w:t>Pass</w:t>
+            </w:r>
+          </w:p>
+        </w:tc>
+      </w:tr>
+      <w:tr>
+        <w:tc>
+          <w:tcPr>
+            <w:tcW w:w="1752" w:type="dxa"/>
+          </w:tcPr>
+          <w:p>
+            <w:pPr>
+              <w:rPr>
+                <w:noProof/>
+                <w:sz w:val="22"/>
+                <w:szCs w:val="22"/>
+                <w:lang w:val="en-AU"/>
+              </w:rPr>
+            </w:pPr>
+            <w:r>
+              <w:rPr>
+                <w:noProof/>
+                <w:sz w:val="22"/>
+                <w:szCs w:val="22"/>
+                <w:lang w:val="en-AU"/>
+              </w:rPr>
+              <w:t>Text readability</w:t>
+            </w:r>
+            <w:r>
+              <w:rPr>
+                <w:noProof/>
+                <w:sz w:val="22"/>
+                <w:szCs w:val="22"/>
+                <w:lang w:val="en-AU"/>
+              </w:rPr>
+              <w:t>/</w:t>
+            </w:r>
+            <w:r>
+              <w:rPr>
+                <w:noProof/>
+                <w:sz w:val="22"/>
+                <w:szCs w:val="22"/>
+                <w:lang w:val="en-AU"/>
+              </w:rPr>
+              <w:t>Colour contrast</w:t>
+            </w:r>
+          </w:p>
+        </w:tc>
+        <w:tc>
+          <w:tcPr>
+            <w:tcW w:w="1432" w:type="dxa"/>
+          </w:tcPr>
+          <w:p>
+            <w:pPr>
+              <w:rPr>
+                <w:noProof/>
+                <w:sz w:val="22"/>
+                <w:szCs w:val="22"/>
+                <w:lang w:val="en-AU"/>
+              </w:rPr>
+            </w:pPr>
+            <w:r>
+              <w:rPr>
+                <w:noProof/>
+                <w:sz w:val="22"/>
+                <w:szCs w:val="22"/>
+                <w:lang w:val="en-AU"/>
+              </w:rPr>
+              <w:t>Check text against blue/dark backgrounds</w:t>
+            </w:r>
+          </w:p>
+        </w:tc>
+        <w:tc>
+          <w:tcPr>
+            <w:tcW w:w="1298" w:type="dxa"/>
+          </w:tcPr>
+          <w:p>
+            <w:pPr>
+              <w:ind w:left="720" w:hanging="720"/>
+              <w:rPr>
+                <w:noProof/>
+                <w:sz w:val="22"/>
+                <w:szCs w:val="22"/>
+                <w:lang w:val="en-AU"/>
+              </w:rPr>
+            </w:pPr>
+            <w:r>
+              <w:rPr>
+                <w:noProof/>
+                <w:sz w:val="22"/>
+                <w:szCs w:val="22"/>
+                <w:lang w:val="en-AU"/>
+              </w:rPr>
+              <w:t>Text is easy</w:t>
+            </w:r>
+            <w:r>
+              <w:rPr>
+                <w:noProof/>
+                <w:sz w:val="22"/>
+                <w:szCs w:val="22"/>
+                <w:lang w:val="en-AU"/>
+              </w:rPr>
+              <w:t xml:space="preserve"> to read</w:t>
+            </w:r>
+          </w:p>
+        </w:tc>
+        <w:tc>
+          <w:tcPr>
+            <w:tcW w:w="2613" w:type="dxa"/>
+          </w:tcPr>
+          <w:p>
+            <w:pPr>
+              <w:rPr>
+                <w:noProof/>
+                <w:sz w:val="22"/>
+                <w:szCs w:val="22"/>
+                <w:lang w:val="en-AU"/>
+              </w:rPr>
+            </w:pPr>
+            <w:r>
+              <w:rPr>
+                <w:noProof/>
+                <w:sz w:val="22"/>
+                <w:szCs w:val="22"/>
+                <w:lang w:val="en-AU"/>
+              </w:rPr>
+              <w:drawing>
+                <wp:inline distT="0" distB="0" distL="0" distR="0" wp14:anchorId="53C08EC1" wp14:editId="431BD517">
+                  <wp:extent cx="1567026" cy="1057126"/>
+                  <wp:effectExtent l="0" t="0" r="0" b="0"/>
+                  <wp:docPr id="967802238" name="Picture 13"/>
+                  <wp:cNvGraphicFramePr>
+                    <a:graphicFrameLocks xmlns:a="http://schemas.openxmlformats.org/drawingml/2006/main" noChangeAspect="1"/>
+                  </wp:cNvGraphicFramePr>
+                  <a:graphic xmlns:a="http://schemas.openxmlformats.org/drawingml/2006/main">
+                    <a:graphicData uri="http://schemas.openxmlformats.org/drawingml/2006/picture">
+                      <pic:pic xmlns:pic="http://schemas.openxmlformats.org/drawingml/2006/picture">
+                        <pic:nvPicPr>
+                          <pic:cNvPr id="967802238" name="Picture 967802238"/>
+                          <pic:cNvPicPr/>
+                        </pic:nvPicPr>
+                        <pic:blipFill>
+                          <a:blip r:embed="rId44" cstate="print">
+                            <a:extLst>
+                              <a:ext uri="{28A0092B-C50C-407E-A947-70E740481C1C}">
+                                <a14:useLocalDpi xmlns:a14="http://schemas.microsoft.com/office/drawing/2010/main" val="0"/>
+                              </a:ext>
+                            </a:extLst>
+                          </a:blip>
+                          <a:stretch>
+                            <a:fillRect/>
+                          </a:stretch>
+                        </pic:blipFill>
+                        <pic:spPr>
+                          <a:xfrm>
+                            <a:off x="0" y="0"/>
+                            <a:ext cx="1591720" cy="1073785"/>
+                          </a:xfrm>
+                          <a:prstGeom prst="rect">
+                            <a:avLst/>
+                          </a:prstGeom>
+                        </pic:spPr>
+                      </pic:pic>
+                    </a:graphicData>
+                  </a:graphic>
+                </wp:inline>
+              </w:drawing>
+            </w:r>
+          </w:p>
+        </w:tc>
+        <w:tc>
+          <w:tcPr>
+            <w:tcW w:w="1921" w:type="dxa"/>
+          </w:tcPr>
+          <w:p>
+            <w:pPr>
+              <w:rPr>
+                <w:noProof/>
+                <w:sz w:val="22"/>
+                <w:szCs w:val="22"/>
+                <w:lang w:val="en-AU"/>
+              </w:rPr>
+            </w:pPr>
+            <w:r>
+              <w:rPr>
+                <w:noProof/>
+                <w:sz w:val="22"/>
+                <w:szCs w:val="22"/>
+                <w:lang w:val="en-AU"/>
+              </w:rPr>
+              <w:t>Pass</w:t>
+            </w:r>
+          </w:p>
+        </w:tc>
+      </w:tr>
+      <w:tr>
+        <w:tc>
+          <w:tcPr>
+            <w:tcW w:w="1752" w:type="dxa"/>
+          </w:tcPr>
+          <w:p>
+            <w:pPr>
+              <w:rPr>
+                <w:noProof/>
+                <w:sz w:val="22"/>
+                <w:szCs w:val="22"/>
+                <w:lang w:val="en-AU"/>
+              </w:rPr>
+            </w:pPr>
+            <w:r>
+              <w:rPr>
+                <w:noProof/>
+                <w:sz w:val="22"/>
+                <w:szCs w:val="22"/>
+                <w:lang w:val="en-AU"/>
+              </w:rPr>
+              <w:t>HTML validation</w:t>
+            </w:r>
+          </w:p>
+        </w:tc>
+        <w:tc>
+          <w:tcPr>
+            <w:tcW w:w="1432" w:type="dxa"/>
+          </w:tcPr>
+          <w:p>
+            <w:pPr>
+              <w:rPr>
+                <w:noProof/>
+                <w:sz w:val="22"/>
+                <w:szCs w:val="22"/>
+                <w:lang w:val="en-AU"/>
+              </w:rPr>
+            </w:pPr>
+            <w:r>
+              <w:rPr>
+                <w:noProof/>
+                <w:sz w:val="22"/>
+                <w:szCs w:val="22"/>
+                <w:lang w:val="en-AU"/>
+              </w:rPr>
+              <w:t>Run each HTML page through a validator</w:t>
+            </w:r>
+          </w:p>
+        </w:tc>
+        <w:tc>
+          <w:tcPr>
+            <w:tcW w:w="1298" w:type="dxa"/>
+          </w:tcPr>
+          <w:p>
+            <w:pPr>
+              <w:rPr>
+                <w:noProof/>
+                <w:sz w:val="22"/>
+                <w:szCs w:val="22"/>
+                <w:lang w:val="en-AU"/>
+              </w:rPr>
+            </w:pPr>
+            <w:r>
+              <w:rPr>
+                <w:noProof/>
+                <w:sz w:val="22"/>
+                <w:szCs w:val="22"/>
+                <w:lang w:val="en-AU"/>
+              </w:rPr>
+              <w:t>No HTML errors</w:t>
+            </w:r>
+          </w:p>
+        </w:tc>
+        <w:tc>
+          <w:tcPr>
+            <w:tcW w:w="2613" w:type="dxa"/>
+          </w:tcPr>
+          <w:p>
+            <w:pPr>
+              <w:rPr>
+                <w:noProof/>
+                <w:sz w:val="22"/>
+                <w:szCs w:val="22"/>
+                <w:lang w:val="en-AU"/>
+              </w:rPr>
+            </w:pPr>
+            <w:r>
+              <w:rPr>
+                <w:noProof/>
+                <w:sz w:val="22"/>
+                <w:szCs w:val="22"/>
+                <w:lang w:val="en-AU"/>
+              </w:rPr>
+              <w:drawing>
+                <wp:inline distT="0" distB="0" distL="0" distR="0" wp14:anchorId="32D215EC" wp14:editId="59D7B3DC">
+                  <wp:extent cx="1981726" cy="771525"/>
+                  <wp:effectExtent l="0" t="0" r="0" b="3175"/>
+                  <wp:docPr id="799970162" name="Picture 14"/>
+                  <wp:cNvGraphicFramePr>
+                    <a:graphicFrameLocks xmlns:a="http://schemas.openxmlformats.org/drawingml/2006/main" noChangeAspect="1"/>
+                  </wp:cNvGraphicFramePr>
+                  <a:graphic xmlns:a="http://schemas.openxmlformats.org/drawingml/2006/main">
+                    <a:graphicData uri="http://schemas.openxmlformats.org/drawingml/2006/picture">
+                      <pic:pic xmlns:pic="http://schemas.openxmlformats.org/drawingml/2006/picture">
+                        <pic:nvPicPr>
+                          <pic:cNvPr id="799970162" name="Picture 799970162"/>
+                          <pic:cNvPicPr/>
+                        </pic:nvPicPr>
+                        <pic:blipFill>
+                          <a:blip r:embed="rId45" cstate="print">
+                            <a:extLst>
+                              <a:ext uri="{28A0092B-C50C-407E-A947-70E740481C1C}">
+                                <a14:useLocalDpi xmlns:a14="http://schemas.microsoft.com/office/drawing/2010/main" val="0"/>
+                              </a:ext>
+                            </a:extLst>
+                          </a:blip>
+                          <a:stretch>
+                            <a:fillRect/>
+                          </a:stretch>
+                        </pic:blipFill>
+                        <pic:spPr>
+                          <a:xfrm flipV="1">
+                            <a:off x="0" y="0"/>
+                            <a:ext cx="1987847" cy="773908"/>
+                          </a:xfrm>
+                          <a:prstGeom prst="rect">
+                            <a:avLst/>
+                          </a:prstGeom>
+                        </pic:spPr>
+                      </pic:pic>
+                    </a:graphicData>
+                  </a:graphic>
+                </wp:inline>
+              </w:drawing>
+            </w:r>
+          </w:p>
+        </w:tc>
+        <w:tc>
+          <w:tcPr>
+            <w:tcW w:w="1921" w:type="dxa"/>
+          </w:tcPr>
+          <w:p>
+            <w:pPr>
+              <w:rPr>
+                <w:noProof/>
+                <w:sz w:val="22"/>
+                <w:szCs w:val="22"/>
+                <w:lang w:val="en-AU"/>
+              </w:rPr>
+            </w:pPr>
+            <w:r>
+              <w:rPr>
+                <w:noProof/>
+                <w:sz w:val="22"/>
+                <w:szCs w:val="22"/>
+                <w:lang w:val="en-AU"/>
+              </w:rPr>
+              <w:t>Pass on all HTML pages</w:t>
+            </w:r>
+          </w:p>
+        </w:tc>
+      </w:tr>
+      <w:tr>
+        <w:tc>
+          <w:tcPr>
+            <w:tcW w:w="1752" w:type="dxa"/>
+          </w:tcPr>
+          <w:p>
+            <w:pPr>
+              <w:rPr>
+                <w:noProof/>
+                <w:sz w:val="22"/>
+                <w:szCs w:val="22"/>
+                <w:lang w:val="en-AU"/>
+              </w:rPr>
+            </w:pPr>
+            <w:r>
+              <w:rPr>
+                <w:noProof/>
+                <w:sz w:val="22"/>
+                <w:szCs w:val="22"/>
+                <w:lang w:val="en-AU"/>
+              </w:rPr>
+              <w:t>CSS vaildation</w:t>
+            </w:r>
+          </w:p>
+        </w:tc>
+        <w:tc>
+          <w:tcPr>
+            <w:tcW w:w="1432" w:type="dxa"/>
+          </w:tcPr>
+          <w:p>
+            <w:pPr>
+              <w:rPr>
+                <w:noProof/>
+                <w:sz w:val="22"/>
+                <w:szCs w:val="22"/>
+                <w:lang w:val="en-AU"/>
+              </w:rPr>
+            </w:pPr>
+          </w:p>
+        </w:tc>
+        <w:tc>
+          <w:tcPr>
+            <w:tcW w:w="1298" w:type="dxa"/>
+          </w:tcPr>
+          <w:p>
+            <w:pPr>
+              <w:rPr>
+                <w:noProof/>
+                <w:sz w:val="22"/>
+                <w:szCs w:val="22"/>
+                <w:lang w:val="en-AU"/>
+              </w:rPr>
+            </w:pPr>
+            <w:r>
+              <w:rPr>
+                <w:noProof/>
+                <w:sz w:val="22"/>
+                <w:szCs w:val="22"/>
+                <w:lang w:val="en-AU"/>
+              </w:rPr>
+              <w:t>No CSS errors</w:t>
+            </w:r>
+          </w:p>
+        </w:tc>
+        <w:tc>
+          <w:tcPr>
+            <w:tcW w:w="2613" w:type="dxa"/>
+          </w:tcPr>
+          <w:p>
+            <w:pPr>
+              <w:rPr>
+                <w:noProof/>
+                <w:sz w:val="22"/>
+                <w:szCs w:val="22"/>
+                <w:lang w:val="en-AU"/>
+              </w:rPr>
+            </w:pPr>
+          </w:p>
+        </w:tc>
+        <w:tc>
+          <w:tcPr>
+            <w:tcW w:w="1921" w:type="dxa"/>
+          </w:tcPr>
+          <w:p>
+            <w:pPr>
+              <w:rPr>
+                <w:noProof/>
+                <w:sz w:val="22"/>
+                <w:szCs w:val="22"/>
+                <w:lang w:val="en-AU"/>
+              </w:rPr>
+            </w:pPr>
+          </w:p>
+        </w:tc>
+      </w:tr>
+      <w:tr>
+        <w:tc>
+          <w:tcPr>
+            <w:tcW w:w="1752" w:type="dxa"/>
+          </w:tcPr>
+          <w:p>
+            <w:pPr>
+              <w:rPr>
+                <w:noProof/>
+                <w:sz w:val="22"/>
+                <w:szCs w:val="22"/>
+                <w:lang w:val="en-AU"/>
+              </w:rPr>
+            </w:pPr>
+          </w:p>
+        </w:tc>
+        <w:tc>
+          <w:tcPr>
+            <w:tcW w:w="1432" w:type="dxa"/>
+          </w:tcPr>
+          <w:p>
+            <w:pPr>
+              <w:rPr>
+                <w:noProof/>
+                <w:sz w:val="22"/>
+                <w:szCs w:val="22"/>
+                <w:lang w:val="en-AU"/>
+              </w:rPr>
+            </w:pPr>
+          </w:p>
+        </w:tc>
+        <w:tc>
+          <w:tcPr>
+            <w:tcW w:w="1298" w:type="dxa"/>
+          </w:tcPr>
+          <w:p>
+            <w:pPr>
+              <w:rPr>
+                <w:noProof/>
+                <w:sz w:val="22"/>
+                <w:szCs w:val="22"/>
+                <w:lang w:val="en-AU"/>
+              </w:rPr>
+            </w:pPr>
+          </w:p>
+        </w:tc>
+        <w:tc>
+          <w:tcPr>
+            <w:tcW w:w="2613" w:type="dxa"/>
+          </w:tcPr>
+          <w:p>
+            <w:pPr>
+              <w:rPr>
+                <w:noProof/>
+                <w:sz w:val="22"/>
+                <w:szCs w:val="22"/>
+                <w:lang w:val="en-AU"/>
+              </w:rPr>
+            </w:pPr>
+          </w:p>
+        </w:tc>
+        <w:tc>
+          <w:tcPr>
+            <w:tcW w:w="1921" w:type="dxa"/>
+          </w:tcPr>
+          <w:p>
+            <w:pPr>
+              <w:rPr>
+                <w:noProof/>
+                <w:sz w:val="22"/>
+                <w:szCs w:val="22"/>
+                <w:lang w:val="en-AU"/>
+              </w:rPr>
+            </w:pPr>
+          </w:p>
+        </w:tc>
+      </w:tr>
+      <w:tr>
+        <w:tc>
+          <w:tcPr>
+            <w:tcW w:w="1752" w:type="dxa"/>
+          </w:tcPr>
+          <w:p>
+            <w:pPr>
+              <w:rPr>
+                <w:noProof/>
+                <w:sz w:val="22"/>
+                <w:szCs w:val="22"/>
+                <w:lang w:val="en-AU"/>
+              </w:rPr>
+            </w:pPr>
+          </w:p>
+        </w:tc>
+        <w:tc>
+          <w:tcPr>
+            <w:tcW w:w="1432" w:type="dxa"/>
+          </w:tcPr>
+          <w:p>
+            <w:pPr>
+              <w:rPr>
+                <w:noProof/>
+                <w:sz w:val="22"/>
+                <w:szCs w:val="22"/>
+                <w:lang w:val="en-AU"/>
+              </w:rPr>
+            </w:pPr>
+          </w:p>
+        </w:tc>
+        <w:tc>
+          <w:tcPr>
+            <w:tcW w:w="1298" w:type="dxa"/>
+          </w:tcPr>
+          <w:p>
+            <w:pPr>
+              <w:rPr>
+                <w:noProof/>
+                <w:sz w:val="22"/>
+                <w:szCs w:val="22"/>
+                <w:lang w:val="en-AU"/>
+              </w:rPr>
+            </w:pPr>
+          </w:p>
+        </w:tc>
+        <w:tc>
+          <w:tcPr>
+            <w:tcW w:w="2613" w:type="dxa"/>
+          </w:tcPr>
+          <w:p>
+            <w:pPr>
+              <w:rPr>
+                <w:noProof/>
+                <w:sz w:val="22"/>
+                <w:szCs w:val="22"/>
+                <w:lang w:val="en-AU"/>
+              </w:rPr>
+            </w:pPr>
+          </w:p>
+        </w:tc>
+        <w:tc>
+          <w:tcPr>
+            <w:tcW w:w="1921" w:type="dxa"/>
+          </w:tcPr>
+          <w:p>
+            <w:pPr>
+              <w:rPr>
+                <w:noProof/>
+                <w:sz w:val="22"/>
+                <w:szCs w:val="22"/>
+                <w:lang w:val="en-AU"/>
+              </w:rPr>
+            </w:pPr>
+          </w:p>
+        </w:tc>
+      </w:tr>
+      <w:tr>
+        <w:tc>
+          <w:tcPr>
+            <w:tcW w:w="1752" w:type="dxa"/>
+          </w:tcPr>
+          <w:p>
+            <w:pPr>
+              <w:rPr>
+                <w:noProof/>
+                <w:sz w:val="22"/>
+                <w:szCs w:val="22"/>
+                <w:lang w:val="en-AU"/>
+              </w:rPr>
+            </w:pPr>
+          </w:p>
+        </w:tc>
+        <w:tc>
+          <w:tcPr>
+            <w:tcW w:w="1432" w:type="dxa"/>
+          </w:tcPr>
+          <w:p>
+            <w:pPr>
+              <w:rPr>
+                <w:noProof/>
+                <w:sz w:val="22"/>
+                <w:szCs w:val="22"/>
+                <w:lang w:val="en-AU"/>
+              </w:rPr>
+            </w:pPr>
+          </w:p>
+        </w:tc>
+        <w:tc>
+          <w:tcPr>
+            <w:tcW w:w="1298" w:type="dxa"/>
+          </w:tcPr>
+          <w:p>
+            <w:pPr>
+              <w:rPr>
+                <w:noProof/>
+                <w:sz w:val="22"/>
+                <w:szCs w:val="22"/>
+                <w:lang w:val="en-AU"/>
+              </w:rPr>
+            </w:pPr>
+          </w:p>
+        </w:tc>
+        <w:tc>
+          <w:tcPr>
+            <w:tcW w:w="2613" w:type="dxa"/>
+          </w:tcPr>
+          <w:p>
+            <w:pPr>
+              <w:rPr>
+                <w:noProof/>
+                <w:sz w:val="22"/>
+                <w:szCs w:val="22"/>
+                <w:lang w:val="en-AU"/>
+              </w:rPr>
+            </w:pPr>
+          </w:p>
+        </w:tc>
+        <w:tc>
+          <w:tcPr>
+            <w:tcW w:w="1921" w:type="dxa"/>
+          </w:tcPr>
+          <w:p>
+            <w:pPr>
+              <w:rPr>
+                <w:noProof/>
+                <w:sz w:val="22"/>
+                <w:szCs w:val="22"/>
+                <w:lang w:val="en-AU"/>
+              </w:rPr>
+            </w:pPr>
+          </w:p>
+        </w:tc>
+      </w:tr>
+    </w:tbl>
+    <w:p>
+      <w:pPr>
+        <w:rPr>
+          <w:noProof/>
+          <w:sz w:val="22"/>
+          <w:szCs w:val="22"/>
+          <w:lang w:val="en-AU"/>
+        </w:rPr>
+      </w:pPr>
     </w:p>
     <w:sectPr>
       <w:pgSz w:w="11906" w:h="16838"/>
@@ -4827,6 +8112,25 @@
       <w:u w:val="single"/>
     </w:rPr>
   </w:style>
+  <w:style w:type="table" w:styleId="TableGrid">
+    <w:name w:val="Table Grid"/>
+    <w:basedOn w:val="TableNormal"/>
+    <w:uiPriority w:val="39"/>
+    <w:rsid w:val="009A0569"/>
+    <w:pPr>
+      <w:spacing w:after="0" w:line="240" w:lineRule="auto"/>
+    </w:pPr>
+    <w:tblPr>
+      <w:tblBorders>
+        <w:top w:val="single" w:sz="4" w:space="0" w:color="auto"/>
+        <w:left w:val="single" w:sz="4" w:space="0" w:color="auto"/>
+        <w:bottom w:val="single" w:sz="4" w:space="0" w:color="auto"/>
+        <w:right w:val="single" w:sz="4" w:space="0" w:color="auto"/>
+        <w:insideH w:val="single" w:sz="4" w:space="0" w:color="auto"/>
+        <w:insideV w:val="single" w:sz="4" w:space="0" w:color="auto"/>
+      </w:tblBorders>
+    </w:tblPr>
+  </w:style>
 </w:styles>
 </file>
 

</xml_diff>

<commit_message>
Changes made during testing 1
</commit_message>
<xml_diff>
--- a/Comp sci.docx
+++ b/Comp sci.docx
@@ -67,18 +67,910 @@
           <w:szCs w:val="22"/>
           <w:lang w:val="en-AU"/>
         </w:rPr>
-        <w:t>I am making a bank budgeting app. It works locally on the device, so there is less security risk. The user uploads the Excel file of their bank statement, and the program then gives a breakdown of their spending. It also has accessibility features such asdark mode, and possibly currency and language options.</w:t>
-      </w:r>
-    </w:p>
-    <w:p>
-      <w:pPr>
-        <w:rPr>
-          <w:noProof/>
-          <w:sz w:val="22"/>
-          <w:szCs w:val="22"/>
-          <w:lang w:val="en-AU"/>
-        </w:rPr>
-      </w:pPr>
+        <w:t>I am creating a bank budgeting web app that helps users understand where their money is going. The user can upload a CSV file exported from their bank account, and the website reads the transactions and sorts spending into categories such as Food, Transport, Tuck Shop and Entertainment. It also identifies whether money is coming in or going out and displays spending in a pie chart.</w:t>
+      </w:r>
+      <w:r>
+        <w:rPr>
+          <w:noProof/>
+          <w:sz w:val="22"/>
+          <w:szCs w:val="22"/>
+          <w:lang w:val="en-AU"/>
+        </w:rPr>
+        <w:t xml:space="preserve"> </w:t>
+      </w:r>
+      <w:r>
+        <w:rPr>
+          <w:noProof/>
+          <w:sz w:val="22"/>
+          <w:szCs w:val="22"/>
+          <w:lang w:val="en-AU"/>
+        </w:rPr>
+        <w:t>My main end users are people who want a simple way to understand their spending without having to manually go through their bank statement. I want the app to be simple to use on both computers and phones.</w:t>
+      </w:r>
+    </w:p>
+    <w:p>
+      <w:pPr>
+        <w:rPr>
+          <w:noProof/>
+          <w:sz w:val="22"/>
+          <w:szCs w:val="22"/>
+          <w:lang w:val="en-AU"/>
+        </w:rPr>
+      </w:pPr>
+      <w:r>
+        <w:rPr>
+          <w:noProof/>
+          <w:sz w:val="22"/>
+          <w:szCs w:val="22"/>
+          <w:lang w:val="en-AU"/>
+        </w:rPr>
+        <w:t>For my minimal functioning prototype, I want the user to be able to upload a valid CSV bank statement, have the transactions displayed and automatically categorised, and see a visual breakdown of their spending. I also want basic navigation and a tutorial explaining how to export and upload a CSV file.</w:t>
+      </w:r>
+      <w:r>
+        <w:rPr>
+          <w:noProof/>
+          <w:sz w:val="22"/>
+          <w:szCs w:val="22"/>
+          <w:lang w:val="en-AU"/>
+        </w:rPr>
+        <w:br/>
+      </w:r>
+      <w:r>
+        <w:rPr>
+          <w:noProof/>
+          <w:sz w:val="22"/>
+          <w:szCs w:val="22"/>
+          <w:lang w:val="en-AU"/>
+        </w:rPr>
+        <w:br/>
+      </w:r>
+      <w:r>
+        <w:rPr>
+          <w:noProof/>
+          <w:sz w:val="22"/>
+          <w:szCs w:val="22"/>
+          <w:lang w:val="en-AU"/>
+        </w:rPr>
+        <w:br/>
+      </w:r>
+      <w:r>
+        <w:rPr>
+          <w:b/>
+          <w:bCs/>
+          <w:noProof/>
+          <w:sz w:val="22"/>
+          <w:szCs w:val="22"/>
+          <w:u w:val="single"/>
+          <w:lang w:val="en-AU"/>
+        </w:rPr>
+        <w:t>Final Submission files and links:</w:t>
+      </w:r>
+    </w:p>
+    <w:p>
+      <w:pPr>
+        <w:rPr>
+          <w:noProof/>
+          <w:sz w:val="22"/>
+          <w:szCs w:val="22"/>
+          <w:lang w:val="en-AU"/>
+        </w:rPr>
+      </w:pPr>
+      <w:r>
+        <w:rPr>
+          <w:noProof/>
+          <w:sz w:val="22"/>
+          <w:szCs w:val="22"/>
+          <w:lang w:val="en-AU"/>
+        </w:rPr>
+        <w:t>Trello:</w:t>
+      </w:r>
+      <w:r>
+        <w:rPr>
+          <w:noProof/>
+          <w:sz w:val="22"/>
+          <w:szCs w:val="22"/>
+          <w:lang w:val="en-AU"/>
+        </w:rPr>
+        <w:br/>
+        <w:t>Github:</w:t>
+      </w:r>
+      <w:r>
+        <w:rPr>
+          <w:noProof/>
+          <w:sz w:val="22"/>
+          <w:szCs w:val="22"/>
+          <w:lang w:val="en-AU"/>
+        </w:rPr>
+        <w:br/>
+      </w:r>
+      <w:r>
+        <w:rPr>
+          <w:noProof/>
+          <w:sz w:val="22"/>
+          <w:szCs w:val="22"/>
+          <w:lang w:val="en-AU"/>
+        </w:rPr>
+        <w:br/>
+      </w:r>
+      <w:r>
+        <w:rPr>
+          <w:noProof/>
+          <w:sz w:val="22"/>
+          <w:szCs w:val="22"/>
+          <w:lang w:val="en-AU"/>
+        </w:rPr>
+        <w:br/>
+      </w:r>
+      <w:r>
+        <w:rPr>
+          <w:b/>
+          <w:bCs/>
+          <w:noProof/>
+          <w:sz w:val="32"/>
+          <w:szCs w:val="32"/>
+          <w:u w:val="single"/>
+          <w:lang w:val="en-AU"/>
+        </w:rPr>
+        <w:t>Advance Techniqes</w:t>
+      </w:r>
+      <w:r>
+        <w:rPr>
+          <w:noProof/>
+          <w:sz w:val="32"/>
+          <w:szCs w:val="32"/>
+          <w:lang w:val="en-AU"/>
+        </w:rPr>
+        <w:t xml:space="preserve"> </w:t>
+      </w:r>
+    </w:p>
+    <w:p>
+      <w:pPr>
+        <w:pStyle w:val="ListParagraph"/>
+        <w:numPr>
+          <w:ilvl w:val="0"/>
+          <w:numId w:val="1"/>
+        </w:numPr>
+        <w:rPr>
+          <w:noProof/>
+          <w:sz w:val="22"/>
+          <w:szCs w:val="22"/>
+          <w:lang w:val="en-AU"/>
+        </w:rPr>
+      </w:pPr>
+      <w:r>
+        <w:rPr>
+          <w:noProof/>
+          <w:sz w:val="22"/>
+          <w:szCs w:val="22"/>
+          <w:lang w:val="en-AU"/>
+        </w:rPr>
+        <w:drawing>
+          <wp:anchor distT="0" distB="0" distL="114300" distR="114300" simplePos="0" relativeHeight="251674624" behindDoc="0" locked="0" layoutInCell="1" allowOverlap="1" wp14:anchorId="0F62A145" wp14:editId="75C260B0">
+            <wp:simplePos x="0" y="0"/>
+            <wp:positionH relativeFrom="column">
+              <wp:posOffset>2998694</wp:posOffset>
+            </wp:positionH>
+            <wp:positionV relativeFrom="paragraph">
+              <wp:posOffset>758750</wp:posOffset>
+            </wp:positionV>
+            <wp:extent cx="3505835" cy="784225"/>
+            <wp:effectExtent l="0" t="0" r="0" b="3175"/>
+            <wp:wrapSquare wrapText="bothSides"/>
+            <wp:docPr id="316515092" name="Picture 19"/>
+            <wp:cNvGraphicFramePr>
+              <a:graphicFrameLocks xmlns:a="http://schemas.openxmlformats.org/drawingml/2006/main" noChangeAspect="1"/>
+            </wp:cNvGraphicFramePr>
+            <a:graphic xmlns:a="http://schemas.openxmlformats.org/drawingml/2006/main">
+              <a:graphicData uri="http://schemas.openxmlformats.org/drawingml/2006/picture">
+                <pic:pic xmlns:pic="http://schemas.openxmlformats.org/drawingml/2006/picture">
+                  <pic:nvPicPr>
+                    <pic:cNvPr id="316515092" name="Picture 316515092"/>
+                    <pic:cNvPicPr/>
+                  </pic:nvPicPr>
+                  <pic:blipFill>
+                    <a:blip r:embed="rId5" cstate="print">
+                      <a:extLst>
+                        <a:ext uri="{28A0092B-C50C-407E-A947-70E740481C1C}">
+                          <a14:useLocalDpi xmlns:a14="http://schemas.microsoft.com/office/drawing/2010/main" val="0"/>
+                        </a:ext>
+                      </a:extLst>
+                    </a:blip>
+                    <a:stretch>
+                      <a:fillRect/>
+                    </a:stretch>
+                  </pic:blipFill>
+                  <pic:spPr>
+                    <a:xfrm>
+                      <a:off x="0" y="0"/>
+                      <a:ext cx="3505835" cy="784225"/>
+                    </a:xfrm>
+                    <a:prstGeom prst="rect">
+                      <a:avLst/>
+                    </a:prstGeom>
+                  </pic:spPr>
+                </pic:pic>
+              </a:graphicData>
+            </a:graphic>
+            <wp14:sizeRelH relativeFrom="page">
+              <wp14:pctWidth>0</wp14:pctWidth>
+            </wp14:sizeRelH>
+            <wp14:sizeRelV relativeFrom="page">
+              <wp14:pctHeight>0</wp14:pctHeight>
+            </wp14:sizeRelV>
+          </wp:anchor>
+        </w:drawing>
+      </w:r>
+      <w:r>
+        <w:rPr>
+          <w:noProof/>
+          <w:sz w:val="22"/>
+          <w:szCs w:val="22"/>
+          <w:lang w:val="en-AU"/>
+        </w:rPr>
+        <w:drawing>
+          <wp:anchor distT="0" distB="0" distL="114300" distR="114300" simplePos="0" relativeHeight="251673600" behindDoc="0" locked="0" layoutInCell="1" allowOverlap="1" wp14:anchorId="21FA4F16" wp14:editId="08EC8BF8">
+            <wp:simplePos x="0" y="0"/>
+            <wp:positionH relativeFrom="column">
+              <wp:posOffset>1377390</wp:posOffset>
+            </wp:positionH>
+            <wp:positionV relativeFrom="paragraph">
+              <wp:posOffset>690992</wp:posOffset>
+            </wp:positionV>
+            <wp:extent cx="1558925" cy="1023620"/>
+            <wp:effectExtent l="0" t="0" r="3175" b="5080"/>
+            <wp:wrapSquare wrapText="bothSides"/>
+            <wp:docPr id="1416493849" name="Picture 20"/>
+            <wp:cNvGraphicFramePr>
+              <a:graphicFrameLocks xmlns:a="http://schemas.openxmlformats.org/drawingml/2006/main" noChangeAspect="1"/>
+            </wp:cNvGraphicFramePr>
+            <a:graphic xmlns:a="http://schemas.openxmlformats.org/drawingml/2006/main">
+              <a:graphicData uri="http://schemas.openxmlformats.org/drawingml/2006/picture">
+                <pic:pic xmlns:pic="http://schemas.openxmlformats.org/drawingml/2006/picture">
+                  <pic:nvPicPr>
+                    <pic:cNvPr id="1416493849" name="Picture 1416493849"/>
+                    <pic:cNvPicPr/>
+                  </pic:nvPicPr>
+                  <pic:blipFill>
+                    <a:blip r:embed="rId6" cstate="print">
+                      <a:extLst>
+                        <a:ext uri="{28A0092B-C50C-407E-A947-70E740481C1C}">
+                          <a14:useLocalDpi xmlns:a14="http://schemas.microsoft.com/office/drawing/2010/main" val="0"/>
+                        </a:ext>
+                      </a:extLst>
+                    </a:blip>
+                    <a:stretch>
+                      <a:fillRect/>
+                    </a:stretch>
+                  </pic:blipFill>
+                  <pic:spPr>
+                    <a:xfrm>
+                      <a:off x="0" y="0"/>
+                      <a:ext cx="1558925" cy="1023620"/>
+                    </a:xfrm>
+                    <a:prstGeom prst="rect">
+                      <a:avLst/>
+                    </a:prstGeom>
+                  </pic:spPr>
+                </pic:pic>
+              </a:graphicData>
+            </a:graphic>
+            <wp14:sizeRelH relativeFrom="page">
+              <wp14:pctWidth>0</wp14:pctWidth>
+            </wp14:sizeRelH>
+            <wp14:sizeRelV relativeFrom="page">
+              <wp14:pctHeight>0</wp14:pctHeight>
+            </wp14:sizeRelV>
+          </wp:anchor>
+        </w:drawing>
+      </w:r>
+      <w:r>
+        <w:rPr>
+          <w:noProof/>
+          <w:sz w:val="22"/>
+          <w:szCs w:val="22"/>
+          <w:lang w:val="en-AU"/>
+        </w:rPr>
+        <w:t>CSV parsing using JavaScript</w:t>
+      </w:r>
+      <w:r>
+        <w:rPr>
+          <w:noProof/>
+          <w:sz w:val="22"/>
+          <w:szCs w:val="22"/>
+          <w:lang w:val="en-AU"/>
+        </w:rPr>
+        <w:t>: U</w:t>
+      </w:r>
+      <w:r>
+        <w:rPr>
+          <w:noProof/>
+          <w:sz w:val="22"/>
+          <w:szCs w:val="22"/>
+          <w:lang w:val="en-AU"/>
+        </w:rPr>
+        <w:t>se</w:t>
+      </w:r>
+      <w:r>
+        <w:rPr>
+          <w:noProof/>
+          <w:sz w:val="22"/>
+          <w:szCs w:val="22"/>
+          <w:lang w:val="en-AU"/>
+        </w:rPr>
+        <w:t>ing</w:t>
+      </w:r>
+      <w:r>
+        <w:rPr>
+          <w:noProof/>
+          <w:sz w:val="22"/>
+          <w:szCs w:val="22"/>
+          <w:lang w:val="en-AU"/>
+        </w:rPr>
+        <w:t xml:space="preserve"> File</w:t>
+      </w:r>
+      <w:r>
+        <w:rPr>
+          <w:noProof/>
+          <w:sz w:val="22"/>
+          <w:szCs w:val="22"/>
+          <w:lang w:val="en-AU"/>
+        </w:rPr>
+        <w:t>r</w:t>
+      </w:r>
+      <w:r>
+        <w:rPr>
+          <w:noProof/>
+          <w:sz w:val="22"/>
+          <w:szCs w:val="22"/>
+          <w:lang w:val="en-AU"/>
+        </w:rPr>
+        <w:t>eader and Java</w:t>
+      </w:r>
+      <w:r>
+        <w:rPr>
+          <w:noProof/>
+          <w:sz w:val="22"/>
+          <w:szCs w:val="22"/>
+          <w:lang w:val="en-AU"/>
+        </w:rPr>
+        <w:t>s</w:t>
+      </w:r>
+      <w:r>
+        <w:rPr>
+          <w:noProof/>
+          <w:sz w:val="22"/>
+          <w:szCs w:val="22"/>
+          <w:lang w:val="en-AU"/>
+        </w:rPr>
+        <w:t>cript to read an uploaded bank CSV, separate the columns, identify incoming</w:t>
+      </w:r>
+      <w:r>
+        <w:rPr>
+          <w:noProof/>
+          <w:sz w:val="22"/>
+          <w:szCs w:val="22"/>
+          <w:lang w:val="en-AU"/>
+        </w:rPr>
+        <w:t xml:space="preserve"> or </w:t>
+      </w:r>
+      <w:r>
+        <w:rPr>
+          <w:noProof/>
+          <w:sz w:val="22"/>
+          <w:szCs w:val="22"/>
+          <w:lang w:val="en-AU"/>
+        </w:rPr>
+        <w:t>outgoing transactions, automatically categorise spending, and calculate category totals</w:t>
+      </w:r>
+      <w:r>
+        <w:rPr>
+          <w:noProof/>
+          <w:sz w:val="22"/>
+          <w:szCs w:val="22"/>
+          <w:lang w:val="en-AU"/>
+        </w:rPr>
+        <w:br/>
+        <w:t xml:space="preserve">Snapshots : </w:t>
+      </w:r>
+      <w:r>
+        <w:rPr>
+          <w:noProof/>
+          <w:sz w:val="22"/>
+          <w:szCs w:val="22"/>
+          <w:lang w:val="en-AU"/>
+        </w:rPr>
+        <w:br/>
+      </w:r>
+    </w:p>
+    <w:p>
+      <w:pPr>
+        <w:rPr>
+          <w:noProof/>
+          <w:sz w:val="22"/>
+          <w:szCs w:val="22"/>
+          <w:lang w:val="en-AU"/>
+        </w:rPr>
+      </w:pPr>
+    </w:p>
+    <w:p>
+      <w:pPr>
+        <w:rPr>
+          <w:noProof/>
+          <w:sz w:val="22"/>
+          <w:szCs w:val="22"/>
+          <w:lang w:val="en-AU"/>
+        </w:rPr>
+      </w:pPr>
+    </w:p>
+    <w:p>
+      <w:pPr>
+        <w:rPr>
+          <w:noProof/>
+          <w:sz w:val="22"/>
+          <w:szCs w:val="22"/>
+          <w:lang w:val="en-AU"/>
+        </w:rPr>
+      </w:pPr>
+    </w:p>
+    <w:p>
+      <w:pPr>
+        <w:pStyle w:val="ListParagraph"/>
+        <w:numPr>
+          <w:ilvl w:val="0"/>
+          <w:numId w:val="1"/>
+        </w:numPr>
+        <w:rPr>
+          <w:noProof/>
+          <w:sz w:val="22"/>
+          <w:szCs w:val="22"/>
+          <w:lang w:val="en-AU"/>
+        </w:rPr>
+      </w:pPr>
+      <w:r>
+        <w:rPr>
+          <w:noProof/>
+          <w:sz w:val="22"/>
+          <w:szCs w:val="22"/>
+          <w:lang w:val="en-AU"/>
+        </w:rPr>
+        <w:t>U</w:t>
+      </w:r>
+      <w:r>
+        <w:rPr>
+          <w:noProof/>
+          <w:sz w:val="22"/>
+          <w:szCs w:val="22"/>
+          <w:lang w:val="en-AU"/>
+        </w:rPr>
+        <w:t>sing CSS Media Queries</w:t>
+      </w:r>
+      <w:r>
+        <w:rPr>
+          <w:noProof/>
+          <w:sz w:val="22"/>
+          <w:szCs w:val="22"/>
+          <w:lang w:val="en-AU"/>
+        </w:rPr>
+        <w:t xml:space="preserve">: </w:t>
+      </w:r>
+      <w:r>
+        <w:rPr>
+          <w:noProof/>
+          <w:sz w:val="22"/>
+          <w:szCs w:val="22"/>
+          <w:lang w:val="en-AU"/>
+        </w:rPr>
+        <w:t>CSS changes the layout depending on screen size so the app works properly on mobile devices.</w:t>
+      </w:r>
+    </w:p>
+    <w:p>
+      <w:pPr>
+        <w:pStyle w:val="ListParagraph"/>
+        <w:rPr>
+          <w:noProof/>
+          <w:sz w:val="22"/>
+          <w:szCs w:val="22"/>
+          <w:lang w:val="en-AU"/>
+        </w:rPr>
+      </w:pPr>
+      <w:r>
+        <w:rPr>
+          <w:noProof/>
+          <w:sz w:val="22"/>
+          <w:szCs w:val="22"/>
+          <w:lang w:val="en-AU"/>
+        </w:rPr>
+        <w:drawing>
+          <wp:anchor distT="0" distB="0" distL="114300" distR="114300" simplePos="0" relativeHeight="251675648" behindDoc="0" locked="0" layoutInCell="1" allowOverlap="1" wp14:anchorId="36B14C3A" wp14:editId="2F292EAA">
+            <wp:simplePos x="0" y="0"/>
+            <wp:positionH relativeFrom="column">
+              <wp:posOffset>1617748</wp:posOffset>
+            </wp:positionH>
+            <wp:positionV relativeFrom="paragraph">
+              <wp:posOffset>194310</wp:posOffset>
+            </wp:positionV>
+            <wp:extent cx="1017905" cy="1239520"/>
+            <wp:effectExtent l="0" t="0" r="0" b="5080"/>
+            <wp:wrapSquare wrapText="bothSides"/>
+            <wp:docPr id="1286444827" name="Picture 21"/>
+            <wp:cNvGraphicFramePr>
+              <a:graphicFrameLocks xmlns:a="http://schemas.openxmlformats.org/drawingml/2006/main" noChangeAspect="1"/>
+            </wp:cNvGraphicFramePr>
+            <a:graphic xmlns:a="http://schemas.openxmlformats.org/drawingml/2006/main">
+              <a:graphicData uri="http://schemas.openxmlformats.org/drawingml/2006/picture">
+                <pic:pic xmlns:pic="http://schemas.openxmlformats.org/drawingml/2006/picture">
+                  <pic:nvPicPr>
+                    <pic:cNvPr id="1286444827" name="Picture 1286444827"/>
+                    <pic:cNvPicPr/>
+                  </pic:nvPicPr>
+                  <pic:blipFill>
+                    <a:blip r:embed="rId7" cstate="print">
+                      <a:extLst>
+                        <a:ext uri="{28A0092B-C50C-407E-A947-70E740481C1C}">
+                          <a14:useLocalDpi xmlns:a14="http://schemas.microsoft.com/office/drawing/2010/main" val="0"/>
+                        </a:ext>
+                      </a:extLst>
+                    </a:blip>
+                    <a:stretch>
+                      <a:fillRect/>
+                    </a:stretch>
+                  </pic:blipFill>
+                  <pic:spPr>
+                    <a:xfrm>
+                      <a:off x="0" y="0"/>
+                      <a:ext cx="1017905" cy="1239520"/>
+                    </a:xfrm>
+                    <a:prstGeom prst="rect">
+                      <a:avLst/>
+                    </a:prstGeom>
+                  </pic:spPr>
+                </pic:pic>
+              </a:graphicData>
+            </a:graphic>
+            <wp14:sizeRelH relativeFrom="page">
+              <wp14:pctWidth>0</wp14:pctWidth>
+            </wp14:sizeRelH>
+            <wp14:sizeRelV relativeFrom="page">
+              <wp14:pctHeight>0</wp14:pctHeight>
+            </wp14:sizeRelV>
+          </wp:anchor>
+        </w:drawing>
+      </w:r>
+      <w:r>
+        <w:rPr>
+          <w:noProof/>
+          <w:sz w:val="22"/>
+          <w:szCs w:val="22"/>
+          <w:lang w:val="en-AU"/>
+        </w:rPr>
+        <w:t xml:space="preserve">Snapshots: </w:t>
+      </w:r>
+      <w:r>
+        <w:rPr>
+          <w:noProof/>
+          <w:sz w:val="22"/>
+          <w:szCs w:val="22"/>
+          <w:lang w:val="en-AU"/>
+        </w:rPr>
+        <w:br/>
+      </w:r>
+      <w:r>
+        <w:rPr>
+          <w:noProof/>
+          <w:sz w:val="22"/>
+          <w:szCs w:val="22"/>
+          <w:lang w:val="en-AU"/>
+        </w:rPr>
+        <w:br/>
+      </w:r>
+      <w:r>
+        <w:rPr>
+          <w:noProof/>
+          <w:sz w:val="22"/>
+          <w:szCs w:val="22"/>
+          <w:lang w:val="en-AU"/>
+        </w:rPr>
+        <w:br/>
+      </w:r>
+      <w:r>
+        <w:rPr>
+          <w:noProof/>
+          <w:sz w:val="22"/>
+          <w:szCs w:val="22"/>
+          <w:lang w:val="en-AU"/>
+        </w:rPr>
+        <w:br/>
+      </w:r>
+      <w:r>
+        <w:rPr>
+          <w:noProof/>
+          <w:sz w:val="22"/>
+          <w:szCs w:val="22"/>
+          <w:lang w:val="en-AU"/>
+        </w:rPr>
+        <w:br/>
+      </w:r>
+      <w:r>
+        <w:rPr>
+          <w:noProof/>
+          <w:sz w:val="22"/>
+          <w:szCs w:val="22"/>
+          <w:lang w:val="en-AU"/>
+        </w:rPr>
+        <w:br/>
+      </w:r>
+      <w:r>
+        <w:rPr>
+          <w:noProof/>
+          <w:sz w:val="22"/>
+          <w:szCs w:val="22"/>
+          <w:lang w:val="en-AU"/>
+        </w:rPr>
+        <w:br/>
+      </w:r>
+      <w:r>
+        <w:rPr>
+          <w:noProof/>
+          <w:sz w:val="22"/>
+          <w:szCs w:val="22"/>
+          <w:lang w:val="en-AU"/>
+        </w:rPr>
+        <w:br/>
+      </w:r>
+      <w:r>
+        <w:rPr>
+          <w:noProof/>
+          <w:sz w:val="22"/>
+          <w:szCs w:val="22"/>
+          <w:lang w:val="en-AU"/>
+        </w:rPr>
+        <w:br/>
+      </w:r>
+      <w:r>
+        <w:rPr>
+          <w:noProof/>
+          <w:sz w:val="22"/>
+          <w:szCs w:val="22"/>
+          <w:lang w:val="en-AU"/>
+        </w:rPr>
+        <w:br/>
+      </w:r>
+      <w:r>
+        <w:rPr>
+          <w:noProof/>
+          <w:sz w:val="22"/>
+          <w:szCs w:val="22"/>
+          <w:lang w:val="en-AU"/>
+        </w:rPr>
+        <w:br/>
+      </w:r>
+      <w:r>
+        <w:rPr>
+          <w:noProof/>
+          <w:sz w:val="22"/>
+          <w:szCs w:val="22"/>
+          <w:lang w:val="en-AU"/>
+        </w:rPr>
+        <w:br/>
+      </w:r>
+    </w:p>
+    <w:p>
+      <w:pPr>
+        <w:pStyle w:val="ListParagraph"/>
+        <w:numPr>
+          <w:ilvl w:val="0"/>
+          <w:numId w:val="1"/>
+        </w:numPr>
+        <w:rPr>
+          <w:noProof/>
+          <w:sz w:val="22"/>
+          <w:szCs w:val="22"/>
+          <w:lang w:val="en-AU"/>
+        </w:rPr>
+      </w:pPr>
+      <w:r>
+        <w:rPr>
+          <w:noProof/>
+          <w:sz w:val="22"/>
+          <w:szCs w:val="22"/>
+          <w:lang w:val="en-AU"/>
+        </w:rPr>
+        <w:lastRenderedPageBreak/>
+        <w:t xml:space="preserve">Google Charts </w:t>
+      </w:r>
+      <w:r>
+        <w:rPr>
+          <w:noProof/>
+          <w:sz w:val="22"/>
+          <w:szCs w:val="22"/>
+          <w:lang w:val="en-AU"/>
+        </w:rPr>
+        <w:t>(</w:t>
+      </w:r>
+      <w:r>
+        <w:rPr>
+          <w:noProof/>
+          <w:sz w:val="22"/>
+          <w:szCs w:val="22"/>
+          <w:lang w:val="en-AU"/>
+        </w:rPr>
+        <w:t>third</w:t>
+      </w:r>
+      <w:r>
+        <w:rPr>
+          <w:noProof/>
+          <w:sz w:val="22"/>
+          <w:szCs w:val="22"/>
+          <w:lang w:val="en-AU"/>
+        </w:rPr>
+        <w:t xml:space="preserve"> </w:t>
+      </w:r>
+      <w:r>
+        <w:rPr>
+          <w:noProof/>
+          <w:sz w:val="22"/>
+          <w:szCs w:val="22"/>
+          <w:lang w:val="en-AU"/>
+        </w:rPr>
+        <w:t>party library</w:t>
+      </w:r>
+      <w:r>
+        <w:rPr>
+          <w:noProof/>
+          <w:sz w:val="22"/>
+          <w:szCs w:val="22"/>
+          <w:lang w:val="en-AU"/>
+        </w:rPr>
+        <w:t>): U</w:t>
+      </w:r>
+      <w:r>
+        <w:rPr>
+          <w:noProof/>
+          <w:sz w:val="22"/>
+          <w:szCs w:val="22"/>
+          <w:lang w:val="en-AU"/>
+        </w:rPr>
+        <w:t xml:space="preserve">sing JavaScript with Google Charts to take the totals calculated from the CSV and dynamically generate </w:t>
+      </w:r>
+      <w:r>
+        <w:rPr>
+          <w:noProof/>
+          <w:sz w:val="22"/>
+          <w:szCs w:val="22"/>
+          <w:lang w:val="en-AU"/>
+        </w:rPr>
+        <w:t xml:space="preserve">a </w:t>
+      </w:r>
+      <w:r>
+        <w:rPr>
+          <w:noProof/>
+          <w:sz w:val="22"/>
+          <w:szCs w:val="22"/>
+          <w:lang w:val="en-AU"/>
+        </w:rPr>
+        <w:t>spending pie chart</w:t>
+      </w:r>
+      <w:r>
+        <w:rPr>
+          <w:noProof/>
+          <w:sz w:val="22"/>
+          <w:szCs w:val="22"/>
+          <w:lang w:val="en-AU"/>
+        </w:rPr>
+        <w:t>.</w:t>
+      </w:r>
+      <w:r>
+        <w:rPr>
+          <w:noProof/>
+          <w:sz w:val="22"/>
+          <w:szCs w:val="22"/>
+          <w:lang w:val="en-AU"/>
+        </w:rPr>
+        <w:br/>
+      </w:r>
+      <w:r>
+        <w:rPr>
+          <w:noProof/>
+          <w:sz w:val="22"/>
+          <w:szCs w:val="22"/>
+          <w:lang w:val="en-AU"/>
+        </w:rPr>
+        <w:br/>
+      </w:r>
+      <w:r>
+        <w:rPr>
+          <w:noProof/>
+          <w:sz w:val="22"/>
+          <w:szCs w:val="22"/>
+          <w:lang w:val="en-AU"/>
+        </w:rPr>
+        <w:drawing>
+          <wp:inline distT="0" distB="0" distL="0" distR="0" wp14:anchorId="3758CB7E" wp14:editId="02346591">
+            <wp:extent cx="1945828" cy="522782"/>
+            <wp:effectExtent l="0" t="0" r="0" b="0"/>
+            <wp:docPr id="1868578173" name="Picture 22"/>
+            <wp:cNvGraphicFramePr>
+              <a:graphicFrameLocks xmlns:a="http://schemas.openxmlformats.org/drawingml/2006/main" noChangeAspect="1"/>
+            </wp:cNvGraphicFramePr>
+            <a:graphic xmlns:a="http://schemas.openxmlformats.org/drawingml/2006/main">
+              <a:graphicData uri="http://schemas.openxmlformats.org/drawingml/2006/picture">
+                <pic:pic xmlns:pic="http://schemas.openxmlformats.org/drawingml/2006/picture">
+                  <pic:nvPicPr>
+                    <pic:cNvPr id="1868578173" name="Picture 1868578173"/>
+                    <pic:cNvPicPr/>
+                  </pic:nvPicPr>
+                  <pic:blipFill>
+                    <a:blip r:embed="rId8" cstate="print">
+                      <a:extLst>
+                        <a:ext uri="{28A0092B-C50C-407E-A947-70E740481C1C}">
+                          <a14:useLocalDpi xmlns:a14="http://schemas.microsoft.com/office/drawing/2010/main" val="0"/>
+                        </a:ext>
+                      </a:extLst>
+                    </a:blip>
+                    <a:stretch>
+                      <a:fillRect/>
+                    </a:stretch>
+                  </pic:blipFill>
+                  <pic:spPr>
+                    <a:xfrm>
+                      <a:off x="0" y="0"/>
+                      <a:ext cx="2061072" cy="553744"/>
+                    </a:xfrm>
+                    <a:prstGeom prst="rect">
+                      <a:avLst/>
+                    </a:prstGeom>
+                  </pic:spPr>
+                </pic:pic>
+              </a:graphicData>
+            </a:graphic>
+          </wp:inline>
+        </w:drawing>
+      </w:r>
+      <w:r>
+        <w:rPr>
+          <w:noProof/>
+          <w:sz w:val="22"/>
+          <w:szCs w:val="22"/>
+          <w:lang w:val="en-AU"/>
+        </w:rPr>
+        <w:br/>
+      </w:r>
+      <w:r>
+        <w:rPr>
+          <w:noProof/>
+          <w:sz w:val="22"/>
+          <w:szCs w:val="22"/>
+          <w:lang w:val="en-AU"/>
+        </w:rPr>
+        <w:br/>
+      </w:r>
+      <w:r>
+        <w:rPr>
+          <w:noProof/>
+          <w:sz w:val="22"/>
+          <w:szCs w:val="22"/>
+          <w:lang w:val="en-AU"/>
+        </w:rPr>
+        <w:br/>
+      </w:r>
+      <w:r>
+        <w:rPr>
+          <w:noProof/>
+          <w:sz w:val="22"/>
+          <w:szCs w:val="22"/>
+          <w:lang w:val="en-AU"/>
+        </w:rPr>
+        <w:br/>
+      </w:r>
+      <w:r>
+        <w:rPr>
+          <w:noProof/>
+          <w:sz w:val="22"/>
+          <w:szCs w:val="22"/>
+          <w:lang w:val="en-AU"/>
+        </w:rPr>
+        <w:br/>
+      </w:r>
     </w:p>
     <w:p>
       <w:pPr>
@@ -140,7 +1032,7 @@
                     <pic:cNvPicPr/>
                   </pic:nvPicPr>
                   <pic:blipFill>
-                    <a:blip r:embed="rId4" cstate="print">
+                    <a:blip r:embed="rId9" cstate="print">
                       <a:extLst>
                         <a:ext uri="{28A0092B-C50C-407E-A947-70E740481C1C}">
                           <a14:useLocalDpi xmlns:a14="http://schemas.microsoft.com/office/drawing/2010/main" val="0"/>
@@ -189,7 +1081,7 @@
                     <pic:cNvPicPr/>
                   </pic:nvPicPr>
                   <pic:blipFill>
-                    <a:blip r:embed="rId5" cstate="print">
+                    <a:blip r:embed="rId10" cstate="print">
                       <a:extLst>
                         <a:ext uri="{28A0092B-C50C-407E-A947-70E740481C1C}">
                           <a14:useLocalDpi xmlns:a14="http://schemas.microsoft.com/office/drawing/2010/main" val="0"/>
@@ -238,7 +1130,7 @@
                     <pic:cNvPicPr/>
                   </pic:nvPicPr>
                   <pic:blipFill>
-                    <a:blip r:embed="rId6" cstate="print">
+                    <a:blip r:embed="rId11" cstate="print">
                       <a:extLst>
                         <a:ext uri="{28A0092B-C50C-407E-A947-70E740481C1C}">
                           <a14:useLocalDpi xmlns:a14="http://schemas.microsoft.com/office/drawing/2010/main" val="0"/>
@@ -287,7 +1179,7 @@
                     <pic:cNvPicPr/>
                   </pic:nvPicPr>
                   <pic:blipFill>
-                    <a:blip r:embed="rId7" cstate="print">
+                    <a:blip r:embed="rId12" cstate="print">
                       <a:extLst>
                         <a:ext uri="{28A0092B-C50C-407E-A947-70E740481C1C}">
                           <a14:useLocalDpi xmlns:a14="http://schemas.microsoft.com/office/drawing/2010/main" val="0"/>
@@ -420,7 +1312,7 @@
                     <pic:cNvPicPr/>
                   </pic:nvPicPr>
                   <pic:blipFill>
-                    <a:blip r:embed="rId8" cstate="print">
+                    <a:blip r:embed="rId13" cstate="print">
                       <a:extLst>
                         <a:ext uri="{28A0092B-C50C-407E-A947-70E740481C1C}">
                           <a14:useLocalDpi xmlns:a14="http://schemas.microsoft.com/office/drawing/2010/main" val="0"/>
@@ -620,7 +1512,7 @@
                     <pic:cNvPicPr/>
                   </pic:nvPicPr>
                   <pic:blipFill>
-                    <a:blip r:embed="rId9" cstate="print">
+                    <a:blip r:embed="rId14" cstate="print">
                       <a:extLst>
                         <a:ext uri="{28A0092B-C50C-407E-A947-70E740481C1C}">
                           <a14:useLocalDpi xmlns:a14="http://schemas.microsoft.com/office/drawing/2010/main" val="0"/>
@@ -823,7 +1715,7 @@
                     <pic:cNvPicPr/>
                   </pic:nvPicPr>
                   <pic:blipFill>
-                    <a:blip r:embed="rId10" cstate="print">
+                    <a:blip r:embed="rId15" cstate="print">
                       <a:extLst>
                         <a:ext uri="{28A0092B-C50C-407E-A947-70E740481C1C}">
                           <a14:useLocalDpi xmlns:a14="http://schemas.microsoft.com/office/drawing/2010/main" val="0"/>
@@ -884,7 +1776,7 @@
         </w:rPr>
         <w:t xml:space="preserve">Loved the theme on this </w:t>
       </w:r>
-      <w:hyperlink r:id="rId11" w:history="1">
+      <w:hyperlink r:id="rId16" w:history="1">
         <w:r>
           <w:rPr>
             <w:rStyle w:val="Hyperlink"/>
@@ -930,7 +1822,7 @@
         </w:rPr>
         <w:t>C</w:t>
       </w:r>
-      <w:hyperlink r:id="rId12" w:history="1">
+      <w:hyperlink r:id="rId17" w:history="1">
         <w:r>
           <w:rPr>
             <w:rStyle w:val="Hyperlink"/>
@@ -979,7 +1871,7 @@
         </w:rPr>
         <w:t xml:space="preserve">Font is from </w:t>
       </w:r>
-      <w:hyperlink r:id="rId13" w:history="1">
+      <w:hyperlink r:id="rId18" w:history="1">
         <w:r>
           <w:rPr>
             <w:rStyle w:val="Hyperlink"/>
@@ -1282,7 +2174,7 @@
         </w:rPr>
         <w:t>before I changed my idea, I would still like to use the mobile Menu form UI verse (</w:t>
       </w:r>
-      <w:hyperlink r:id="rId14" w:history="1">
+      <w:hyperlink r:id="rId19" w:history="1">
         <w:r>
           <w:rPr>
             <w:rStyle w:val="Hyperlink"/>
@@ -1379,7 +2271,7 @@
                     <pic:cNvPicPr/>
                   </pic:nvPicPr>
                   <pic:blipFill>
-                    <a:blip r:embed="rId15" cstate="print">
+                    <a:blip r:embed="rId20" cstate="print">
                       <a:extLst>
                         <a:ext uri="{28A0092B-C50C-407E-A947-70E740481C1C}">
                           <a14:useLocalDpi xmlns:a14="http://schemas.microsoft.com/office/drawing/2010/main" val="0"/>
@@ -1451,7 +2343,7 @@
                     <pic:cNvPicPr/>
                   </pic:nvPicPr>
                   <pic:blipFill>
-                    <a:blip r:embed="rId16" cstate="print">
+                    <a:blip r:embed="rId21" cstate="print">
                       <a:extLst>
                         <a:ext uri="{28A0092B-C50C-407E-A947-70E740481C1C}">
                           <a14:useLocalDpi xmlns:a14="http://schemas.microsoft.com/office/drawing/2010/main" val="0"/>
@@ -1611,7 +2503,7 @@
                     <pic:cNvPicPr/>
                   </pic:nvPicPr>
                   <pic:blipFill>
-                    <a:blip r:embed="rId17" cstate="print">
+                    <a:blip r:embed="rId22" cstate="print">
                       <a:extLst>
                         <a:ext uri="{28A0092B-C50C-407E-A947-70E740481C1C}">
                           <a14:useLocalDpi xmlns:a14="http://schemas.microsoft.com/office/drawing/2010/main" val="0"/>
@@ -1833,7 +2725,7 @@
                     <pic:cNvPicPr/>
                   </pic:nvPicPr>
                   <pic:blipFill>
-                    <a:blip r:embed="rId18" cstate="print">
+                    <a:blip r:embed="rId23" cstate="print">
                       <a:extLst>
                         <a:ext uri="{28A0092B-C50C-407E-A947-70E740481C1C}">
                           <a14:useLocalDpi xmlns:a14="http://schemas.microsoft.com/office/drawing/2010/main" val="0"/>
@@ -2034,7 +2926,7 @@
                     <pic:cNvPicPr/>
                   </pic:nvPicPr>
                   <pic:blipFill>
-                    <a:blip r:embed="rId19" cstate="print">
+                    <a:blip r:embed="rId24" cstate="print">
                       <a:extLst>
                         <a:ext uri="{28A0092B-C50C-407E-A947-70E740481C1C}">
                           <a14:useLocalDpi xmlns:a14="http://schemas.microsoft.com/office/drawing/2010/main" val="0"/>
@@ -2187,7 +3079,7 @@
                     <pic:cNvPicPr/>
                   </pic:nvPicPr>
                   <pic:blipFill>
-                    <a:blip r:embed="rId20" cstate="print">
+                    <a:blip r:embed="rId25" cstate="print">
                       <a:extLst>
                         <a:ext uri="{28A0092B-C50C-407E-A947-70E740481C1C}">
                           <a14:useLocalDpi xmlns:a14="http://schemas.microsoft.com/office/drawing/2010/main" val="0"/>
@@ -2295,7 +3187,7 @@
                     <pic:cNvPicPr/>
                   </pic:nvPicPr>
                   <pic:blipFill>
-                    <a:blip r:embed="rId21" cstate="print">
+                    <a:blip r:embed="rId26" cstate="print">
                       <a:extLst>
                         <a:ext uri="{28A0092B-C50C-407E-A947-70E740481C1C}">
                           <a14:useLocalDpi xmlns:a14="http://schemas.microsoft.com/office/drawing/2010/main" val="0"/>
@@ -2726,7 +3618,7 @@
                     <pic:cNvPicPr/>
                   </pic:nvPicPr>
                   <pic:blipFill>
-                    <a:blip r:embed="rId22" cstate="print">
+                    <a:blip r:embed="rId27" cstate="print">
                       <a:extLst>
                         <a:ext uri="{28A0092B-C50C-407E-A947-70E740481C1C}">
                           <a14:useLocalDpi xmlns:a14="http://schemas.microsoft.com/office/drawing/2010/main" val="0"/>
@@ -3021,7 +3913,7 @@
                     <pic:cNvPicPr/>
                   </pic:nvPicPr>
                   <pic:blipFill>
-                    <a:blip r:embed="rId23" cstate="print">
+                    <a:blip r:embed="rId28" cstate="print">
                       <a:extLst>
                         <a:ext uri="{28A0092B-C50C-407E-A947-70E740481C1C}">
                           <a14:useLocalDpi xmlns:a14="http://schemas.microsoft.com/office/drawing/2010/main" val="0"/>
@@ -3117,7 +4009,7 @@
                     <pic:cNvPicPr/>
                   </pic:nvPicPr>
                   <pic:blipFill>
-                    <a:blip r:embed="rId24" cstate="print">
+                    <a:blip r:embed="rId29" cstate="print">
                       <a:extLst>
                         <a:ext uri="{28A0092B-C50C-407E-A947-70E740481C1C}">
                           <a14:useLocalDpi xmlns:a14="http://schemas.microsoft.com/office/drawing/2010/main" val="0"/>
@@ -3195,7 +4087,7 @@
         </w:rPr>
         <w:t xml:space="preserve">I am using Java scipt to read the file, following a toutioal on </w:t>
       </w:r>
-      <w:hyperlink r:id="rId25" w:history="1">
+      <w:hyperlink r:id="rId30" w:history="1">
         <w:r>
           <w:rPr>
             <w:rStyle w:val="Hyperlink"/>
@@ -3347,7 +4239,7 @@
                     <pic:cNvPicPr/>
                   </pic:nvPicPr>
                   <pic:blipFill>
-                    <a:blip r:embed="rId26" cstate="print">
+                    <a:blip r:embed="rId31" cstate="print">
                       <a:extLst>
                         <a:ext uri="{28A0092B-C50C-407E-A947-70E740481C1C}">
                           <a14:useLocalDpi xmlns:a14="http://schemas.microsoft.com/office/drawing/2010/main" val="0"/>
@@ -3498,7 +4390,7 @@
                     <pic:cNvPicPr/>
                   </pic:nvPicPr>
                   <pic:blipFill>
-                    <a:blip r:embed="rId27" cstate="print">
+                    <a:blip r:embed="rId32" cstate="print">
                       <a:extLst>
                         <a:ext uri="{28A0092B-C50C-407E-A947-70E740481C1C}">
                           <a14:useLocalDpi xmlns:a14="http://schemas.microsoft.com/office/drawing/2010/main" val="0"/>
@@ -3599,7 +4491,7 @@
                     <pic:cNvPicPr/>
                   </pic:nvPicPr>
                   <pic:blipFill>
-                    <a:blip r:embed="rId28" cstate="print">
+                    <a:blip r:embed="rId33" cstate="print">
                       <a:extLst>
                         <a:ext uri="{28A0092B-C50C-407E-A947-70E740481C1C}">
                           <a14:useLocalDpi xmlns:a14="http://schemas.microsoft.com/office/drawing/2010/main" val="0"/>
@@ -3732,7 +4624,7 @@
                     <pic:cNvPicPr/>
                   </pic:nvPicPr>
                   <pic:blipFill>
-                    <a:blip r:embed="rId29" cstate="print">
+                    <a:blip r:embed="rId34" cstate="print">
                       <a:extLst>
                         <a:ext uri="{28A0092B-C50C-407E-A947-70E740481C1C}">
                           <a14:useLocalDpi xmlns:a14="http://schemas.microsoft.com/office/drawing/2010/main" val="0"/>
@@ -3810,7 +4702,7 @@
                     <pic:cNvPicPr/>
                   </pic:nvPicPr>
                   <pic:blipFill>
-                    <a:blip r:embed="rId30" cstate="print">
+                    <a:blip r:embed="rId35" cstate="print">
                       <a:extLst>
                         <a:ext uri="{28A0092B-C50C-407E-A947-70E740481C1C}">
                           <a14:useLocalDpi xmlns:a14="http://schemas.microsoft.com/office/drawing/2010/main" val="0"/>
@@ -3888,7 +4780,7 @@
                     <pic:cNvPicPr/>
                   </pic:nvPicPr>
                   <pic:blipFill>
-                    <a:blip r:embed="rId31" cstate="print">
+                    <a:blip r:embed="rId36" cstate="print">
                       <a:extLst>
                         <a:ext uri="{28A0092B-C50C-407E-A947-70E740481C1C}">
                           <a14:useLocalDpi xmlns:a14="http://schemas.microsoft.com/office/drawing/2010/main" val="0"/>
@@ -4005,7 +4897,7 @@
                     <pic:cNvPicPr/>
                   </pic:nvPicPr>
                   <pic:blipFill>
-                    <a:blip r:embed="rId32" cstate="print">
+                    <a:blip r:embed="rId37" cstate="print">
                       <a:extLst>
                         <a:ext uri="{28A0092B-C50C-407E-A947-70E740481C1C}">
                           <a14:useLocalDpi xmlns:a14="http://schemas.microsoft.com/office/drawing/2010/main" val="0"/>
@@ -4078,7 +4970,7 @@
         <w:br/>
         <w:t xml:space="preserve">The button used was from </w:t>
       </w:r>
-      <w:hyperlink r:id="rId33" w:history="1">
+      <w:hyperlink r:id="rId38" w:history="1">
         <w:r>
           <w:rPr>
             <w:rStyle w:val="Hyperlink"/>
@@ -4189,7 +5081,7 @@
                     <pic:cNvPicPr/>
                   </pic:nvPicPr>
                   <pic:blipFill>
-                    <a:blip r:embed="rId34" cstate="print">
+                    <a:blip r:embed="rId39" cstate="print">
                       <a:extLst>
                         <a:ext uri="{28A0092B-C50C-407E-A947-70E740481C1C}">
                           <a14:useLocalDpi xmlns:a14="http://schemas.microsoft.com/office/drawing/2010/main" val="0"/>
@@ -4506,16 +5398,16 @@
         <w:tblLook w:val="04A0" w:firstRow="1" w:lastRow="0" w:firstColumn="1" w:lastColumn="0" w:noHBand="0" w:noVBand="1"/>
       </w:tblPr>
       <w:tblGrid>
-        <w:gridCol w:w="1680"/>
-        <w:gridCol w:w="1375"/>
-        <w:gridCol w:w="1247"/>
-        <w:gridCol w:w="2873"/>
-        <w:gridCol w:w="1841"/>
+        <w:gridCol w:w="1476"/>
+        <w:gridCol w:w="1213"/>
+        <w:gridCol w:w="1103"/>
+        <w:gridCol w:w="2502"/>
+        <w:gridCol w:w="2722"/>
       </w:tblGrid>
       <w:tr>
         <w:tc>
           <w:tcPr>
-            <w:tcW w:w="1752" w:type="dxa"/>
+            <w:tcW w:w="1476" w:type="dxa"/>
           </w:tcPr>
           <w:p>
             <w:pPr>
@@ -4539,7 +5431,7 @@
         </w:tc>
         <w:tc>
           <w:tcPr>
-            <w:tcW w:w="1432" w:type="dxa"/>
+            <w:tcW w:w="1213" w:type="dxa"/>
           </w:tcPr>
           <w:p>
             <w:pPr>
@@ -4563,7 +5455,7 @@
         </w:tc>
         <w:tc>
           <w:tcPr>
-            <w:tcW w:w="1298" w:type="dxa"/>
+            <w:tcW w:w="1103" w:type="dxa"/>
           </w:tcPr>
           <w:p>
             <w:pPr>
@@ -4587,7 +5479,7 @@
         </w:tc>
         <w:tc>
           <w:tcPr>
-            <w:tcW w:w="2613" w:type="dxa"/>
+            <w:tcW w:w="2502" w:type="dxa"/>
           </w:tcPr>
           <w:p>
             <w:pPr>
@@ -4611,7 +5503,7 @@
         </w:tc>
         <w:tc>
           <w:tcPr>
-            <w:tcW w:w="1921" w:type="dxa"/>
+            <w:tcW w:w="2722" w:type="dxa"/>
           </w:tcPr>
           <w:p>
             <w:pPr>
@@ -4637,7 +5529,7 @@
       <w:tr>
         <w:tc>
           <w:tcPr>
-            <w:tcW w:w="1752" w:type="dxa"/>
+            <w:tcW w:w="1476" w:type="dxa"/>
           </w:tcPr>
           <w:p>
             <w:pPr>
@@ -4661,7 +5553,7 @@
         </w:tc>
         <w:tc>
           <w:tcPr>
-            <w:tcW w:w="1432" w:type="dxa"/>
+            <w:tcW w:w="1213" w:type="dxa"/>
           </w:tcPr>
           <w:p>
             <w:pPr>
@@ -4685,7 +5577,7 @@
         </w:tc>
         <w:tc>
           <w:tcPr>
-            <w:tcW w:w="1298" w:type="dxa"/>
+            <w:tcW w:w="1103" w:type="dxa"/>
           </w:tcPr>
           <w:p>
             <w:pPr>
@@ -4709,7 +5601,7 @@
         </w:tc>
         <w:tc>
           <w:tcPr>
-            <w:tcW w:w="2613" w:type="dxa"/>
+            <w:tcW w:w="2502" w:type="dxa"/>
           </w:tcPr>
           <w:p>
             <w:pPr>
@@ -4743,7 +5635,7 @@
                           <pic:cNvPicPr/>
                         </pic:nvPicPr>
                         <pic:blipFill>
-                          <a:blip r:embed="rId35" cstate="print">
+                          <a:blip r:embed="rId40" cstate="print">
                             <a:extLst>
                               <a:ext uri="{28A0092B-C50C-407E-A947-70E740481C1C}">
                                 <a14:useLocalDpi xmlns:a14="http://schemas.microsoft.com/office/drawing/2010/main" val="0"/>
@@ -4773,7 +5665,7 @@
         </w:tc>
         <w:tc>
           <w:tcPr>
-            <w:tcW w:w="1921" w:type="dxa"/>
+            <w:tcW w:w="2722" w:type="dxa"/>
           </w:tcPr>
           <w:p>
             <w:pPr>
@@ -4799,7 +5691,7 @@
       <w:tr>
         <w:tc>
           <w:tcPr>
-            <w:tcW w:w="1752" w:type="dxa"/>
+            <w:tcW w:w="1476" w:type="dxa"/>
           </w:tcPr>
           <w:p>
             <w:pPr>
@@ -4823,7 +5715,7 @@
         </w:tc>
         <w:tc>
           <w:tcPr>
-            <w:tcW w:w="1432" w:type="dxa"/>
+            <w:tcW w:w="1213" w:type="dxa"/>
           </w:tcPr>
           <w:p>
             <w:pPr>
@@ -4847,7 +5739,7 @@
         </w:tc>
         <w:tc>
           <w:tcPr>
-            <w:tcW w:w="1298" w:type="dxa"/>
+            <w:tcW w:w="1103" w:type="dxa"/>
           </w:tcPr>
           <w:p>
             <w:pPr>
@@ -4871,7 +5763,7 @@
         </w:tc>
         <w:tc>
           <w:tcPr>
-            <w:tcW w:w="2613" w:type="dxa"/>
+            <w:tcW w:w="2502" w:type="dxa"/>
           </w:tcPr>
           <w:p>
             <w:pPr>
@@ -4905,7 +5797,7 @@
                           <pic:cNvPicPr/>
                         </pic:nvPicPr>
                         <pic:blipFill>
-                          <a:blip r:embed="rId36" cstate="print">
+                          <a:blip r:embed="rId41" cstate="print">
                             <a:extLst>
                               <a:ext uri="{28A0092B-C50C-407E-A947-70E740481C1C}">
                                 <a14:useLocalDpi xmlns:a14="http://schemas.microsoft.com/office/drawing/2010/main" val="0"/>
@@ -4935,7 +5827,7 @@
         </w:tc>
         <w:tc>
           <w:tcPr>
-            <w:tcW w:w="1921" w:type="dxa"/>
+            <w:tcW w:w="2722" w:type="dxa"/>
           </w:tcPr>
           <w:p>
             <w:pPr>
@@ -4961,7 +5853,7 @@
       <w:tr>
         <w:tc>
           <w:tcPr>
-            <w:tcW w:w="1752" w:type="dxa"/>
+            <w:tcW w:w="1476" w:type="dxa"/>
           </w:tcPr>
           <w:p>
             <w:pPr>
@@ -4985,7 +5877,7 @@
         </w:tc>
         <w:tc>
           <w:tcPr>
-            <w:tcW w:w="1432" w:type="dxa"/>
+            <w:tcW w:w="1213" w:type="dxa"/>
           </w:tcPr>
           <w:p>
             <w:pPr>
@@ -5009,7 +5901,7 @@
         </w:tc>
         <w:tc>
           <w:tcPr>
-            <w:tcW w:w="1298" w:type="dxa"/>
+            <w:tcW w:w="1103" w:type="dxa"/>
           </w:tcPr>
           <w:p>
             <w:pPr>
@@ -5033,7 +5925,7 @@
         </w:tc>
         <w:tc>
           <w:tcPr>
-            <w:tcW w:w="2613" w:type="dxa"/>
+            <w:tcW w:w="2502" w:type="dxa"/>
           </w:tcPr>
           <w:p>
             <w:pPr>
@@ -5067,7 +5959,7 @@
                           <pic:cNvPicPr/>
                         </pic:nvPicPr>
                         <pic:blipFill>
-                          <a:blip r:embed="rId37" cstate="print">
+                          <a:blip r:embed="rId42" cstate="print">
                             <a:extLst>
                               <a:ext uri="{28A0092B-C50C-407E-A947-70E740481C1C}">
                                 <a14:useLocalDpi xmlns:a14="http://schemas.microsoft.com/office/drawing/2010/main" val="0"/>
@@ -5097,7 +5989,7 @@
         </w:tc>
         <w:tc>
           <w:tcPr>
-            <w:tcW w:w="1921" w:type="dxa"/>
+            <w:tcW w:w="2722" w:type="dxa"/>
           </w:tcPr>
           <w:p>
             <w:pPr>
@@ -5123,7 +6015,7 @@
       <w:tr>
         <w:tc>
           <w:tcPr>
-            <w:tcW w:w="1752" w:type="dxa"/>
+            <w:tcW w:w="1476" w:type="dxa"/>
           </w:tcPr>
           <w:p>
             <w:pPr>
@@ -5147,7 +6039,7 @@
         </w:tc>
         <w:tc>
           <w:tcPr>
-            <w:tcW w:w="1432" w:type="dxa"/>
+            <w:tcW w:w="1213" w:type="dxa"/>
           </w:tcPr>
           <w:p>
             <w:pPr>
@@ -5171,7 +6063,7 @@
         </w:tc>
         <w:tc>
           <w:tcPr>
-            <w:tcW w:w="1298" w:type="dxa"/>
+            <w:tcW w:w="1103" w:type="dxa"/>
           </w:tcPr>
           <w:p>
             <w:pPr>
@@ -5195,7 +6087,7 @@
         </w:tc>
         <w:tc>
           <w:tcPr>
-            <w:tcW w:w="2613" w:type="dxa"/>
+            <w:tcW w:w="2502" w:type="dxa"/>
           </w:tcPr>
           <w:p>
             <w:pPr>
@@ -5219,7 +6111,7 @@
         </w:tc>
         <w:tc>
           <w:tcPr>
-            <w:tcW w:w="1921" w:type="dxa"/>
+            <w:tcW w:w="2722" w:type="dxa"/>
           </w:tcPr>
           <w:p>
             <w:pPr>
@@ -5245,7 +6137,7 @@
       <w:tr>
         <w:tc>
           <w:tcPr>
-            <w:tcW w:w="1752" w:type="dxa"/>
+            <w:tcW w:w="1476" w:type="dxa"/>
           </w:tcPr>
           <w:p>
             <w:pPr>
@@ -5269,7 +6161,7 @@
         </w:tc>
         <w:tc>
           <w:tcPr>
-            <w:tcW w:w="1432" w:type="dxa"/>
+            <w:tcW w:w="1213" w:type="dxa"/>
           </w:tcPr>
           <w:p>
             <w:pPr>
@@ -5293,7 +6185,7 @@
         </w:tc>
         <w:tc>
           <w:tcPr>
-            <w:tcW w:w="1298" w:type="dxa"/>
+            <w:tcW w:w="1103" w:type="dxa"/>
           </w:tcPr>
           <w:p>
             <w:pPr>
@@ -5317,7 +6209,7 @@
         </w:tc>
         <w:tc>
           <w:tcPr>
-            <w:tcW w:w="2613" w:type="dxa"/>
+            <w:tcW w:w="2502" w:type="dxa"/>
           </w:tcPr>
           <w:p>
             <w:pPr>
@@ -5351,7 +6243,7 @@
                           <pic:cNvPicPr/>
                         </pic:nvPicPr>
                         <pic:blipFill>
-                          <a:blip r:embed="rId38" cstate="print">
+                          <a:blip r:embed="rId43" cstate="print">
                             <a:extLst>
                               <a:ext uri="{28A0092B-C50C-407E-A947-70E740481C1C}">
                                 <a14:useLocalDpi xmlns:a14="http://schemas.microsoft.com/office/drawing/2010/main" val="0"/>
@@ -5381,7 +6273,7 @@
         </w:tc>
         <w:tc>
           <w:tcPr>
-            <w:tcW w:w="1921" w:type="dxa"/>
+            <w:tcW w:w="2722" w:type="dxa"/>
           </w:tcPr>
           <w:p>
             <w:pPr>
@@ -5407,7 +6299,7 @@
       <w:tr>
         <w:tc>
           <w:tcPr>
-            <w:tcW w:w="1752" w:type="dxa"/>
+            <w:tcW w:w="1476" w:type="dxa"/>
           </w:tcPr>
           <w:p>
             <w:pPr>
@@ -5431,7 +6323,7 @@
         </w:tc>
         <w:tc>
           <w:tcPr>
-            <w:tcW w:w="1432" w:type="dxa"/>
+            <w:tcW w:w="1213" w:type="dxa"/>
           </w:tcPr>
           <w:p>
             <w:pPr>
@@ -5455,7 +6347,7 @@
         </w:tc>
         <w:tc>
           <w:tcPr>
-            <w:tcW w:w="1298" w:type="dxa"/>
+            <w:tcW w:w="1103" w:type="dxa"/>
           </w:tcPr>
           <w:p>
             <w:pPr>
@@ -5479,7 +6371,7 @@
         </w:tc>
         <w:tc>
           <w:tcPr>
-            <w:tcW w:w="2613" w:type="dxa"/>
+            <w:tcW w:w="2502" w:type="dxa"/>
           </w:tcPr>
           <w:p>
             <w:pPr>
@@ -5513,7 +6405,7 @@
                           <pic:cNvPicPr/>
                         </pic:nvPicPr>
                         <pic:blipFill>
-                          <a:blip r:embed="rId39" cstate="print">
+                          <a:blip r:embed="rId44" cstate="print">
                             <a:extLst>
                               <a:ext uri="{28A0092B-C50C-407E-A947-70E740481C1C}">
                                 <a14:useLocalDpi xmlns:a14="http://schemas.microsoft.com/office/drawing/2010/main" val="0"/>
@@ -5543,7 +6435,7 @@
         </w:tc>
         <w:tc>
           <w:tcPr>
-            <w:tcW w:w="1921" w:type="dxa"/>
+            <w:tcW w:w="2722" w:type="dxa"/>
           </w:tcPr>
           <w:p>
             <w:pPr>
@@ -5569,7 +6461,7 @@
       <w:tr>
         <w:tc>
           <w:tcPr>
-            <w:tcW w:w="1752" w:type="dxa"/>
+            <w:tcW w:w="1476" w:type="dxa"/>
           </w:tcPr>
           <w:p>
             <w:pPr>
@@ -5594,7 +6486,7 @@
         </w:tc>
         <w:tc>
           <w:tcPr>
-            <w:tcW w:w="1432" w:type="dxa"/>
+            <w:tcW w:w="1213" w:type="dxa"/>
           </w:tcPr>
           <w:p>
             <w:pPr>
@@ -5618,7 +6510,7 @@
         </w:tc>
         <w:tc>
           <w:tcPr>
-            <w:tcW w:w="1298" w:type="dxa"/>
+            <w:tcW w:w="1103" w:type="dxa"/>
           </w:tcPr>
           <w:p>
             <w:pPr>
@@ -5643,7 +6535,7 @@
         </w:tc>
         <w:tc>
           <w:tcPr>
-            <w:tcW w:w="2613" w:type="dxa"/>
+            <w:tcW w:w="2502" w:type="dxa"/>
           </w:tcPr>
           <w:p>
             <w:pPr>
@@ -5667,7 +6559,7 @@
         </w:tc>
         <w:tc>
           <w:tcPr>
-            <w:tcW w:w="1921" w:type="dxa"/>
+            <w:tcW w:w="2722" w:type="dxa"/>
           </w:tcPr>
           <w:p>
             <w:pPr>
@@ -5693,7 +6585,7 @@
       <w:tr>
         <w:tc>
           <w:tcPr>
-            <w:tcW w:w="1752" w:type="dxa"/>
+            <w:tcW w:w="1476" w:type="dxa"/>
           </w:tcPr>
           <w:p>
             <w:pPr>
@@ -5717,7 +6609,7 @@
         </w:tc>
         <w:tc>
           <w:tcPr>
-            <w:tcW w:w="1432" w:type="dxa"/>
+            <w:tcW w:w="1213" w:type="dxa"/>
           </w:tcPr>
           <w:p>
             <w:pPr>
@@ -5741,7 +6633,7 @@
         </w:tc>
         <w:tc>
           <w:tcPr>
-            <w:tcW w:w="1298" w:type="dxa"/>
+            <w:tcW w:w="1103" w:type="dxa"/>
           </w:tcPr>
           <w:p>
             <w:pPr>
@@ -5765,7 +6657,7 @@
         </w:tc>
         <w:tc>
           <w:tcPr>
-            <w:tcW w:w="2613" w:type="dxa"/>
+            <w:tcW w:w="2502" w:type="dxa"/>
           </w:tcPr>
           <w:p>
             <w:pPr>
@@ -5799,7 +6691,7 @@
                           <pic:cNvPicPr/>
                         </pic:nvPicPr>
                         <pic:blipFill>
-                          <a:blip r:embed="rId40" cstate="print">
+                          <a:blip r:embed="rId45" cstate="print">
                             <a:extLst>
                               <a:ext uri="{28A0092B-C50C-407E-A947-70E740481C1C}">
                                 <a14:useLocalDpi xmlns:a14="http://schemas.microsoft.com/office/drawing/2010/main" val="0"/>
@@ -5829,7 +6721,7 @@
         </w:tc>
         <w:tc>
           <w:tcPr>
-            <w:tcW w:w="1921" w:type="dxa"/>
+            <w:tcW w:w="2722" w:type="dxa"/>
           </w:tcPr>
           <w:p>
             <w:pPr>
@@ -5855,7 +6747,7 @@
       <w:tr>
         <w:tc>
           <w:tcPr>
-            <w:tcW w:w="1752" w:type="dxa"/>
+            <w:tcW w:w="1476" w:type="dxa"/>
           </w:tcPr>
           <w:p>
             <w:pPr>
@@ -5879,7 +6771,7 @@
         </w:tc>
         <w:tc>
           <w:tcPr>
-            <w:tcW w:w="1432" w:type="dxa"/>
+            <w:tcW w:w="1213" w:type="dxa"/>
           </w:tcPr>
           <w:p>
             <w:pPr>
@@ -5903,7 +6795,7 @@
         </w:tc>
         <w:tc>
           <w:tcPr>
-            <w:tcW w:w="1298" w:type="dxa"/>
+            <w:tcW w:w="1103" w:type="dxa"/>
           </w:tcPr>
           <w:p>
             <w:pPr>
@@ -5928,7 +6820,7 @@
         </w:tc>
         <w:tc>
           <w:tcPr>
-            <w:tcW w:w="2613" w:type="dxa"/>
+            <w:tcW w:w="2502" w:type="dxa"/>
           </w:tcPr>
           <w:p>
             <w:pPr>
@@ -5962,7 +6854,7 @@
                           <pic:cNvPicPr/>
                         </pic:nvPicPr>
                         <pic:blipFill>
-                          <a:blip r:embed="rId41" cstate="print">
+                          <a:blip r:embed="rId46" cstate="print">
                             <a:extLst>
                               <a:ext uri="{28A0092B-C50C-407E-A947-70E740481C1C}">
                                 <a14:useLocalDpi xmlns:a14="http://schemas.microsoft.com/office/drawing/2010/main" val="0"/>
@@ -5992,7 +6884,7 @@
         </w:tc>
         <w:tc>
           <w:tcPr>
-            <w:tcW w:w="1921" w:type="dxa"/>
+            <w:tcW w:w="2722" w:type="dxa"/>
           </w:tcPr>
           <w:p>
             <w:pPr>
@@ -6018,7 +6910,7 @@
       <w:tr>
         <w:tc>
           <w:tcPr>
-            <w:tcW w:w="1752" w:type="dxa"/>
+            <w:tcW w:w="1476" w:type="dxa"/>
           </w:tcPr>
           <w:p>
             <w:pPr>
@@ -6042,7 +6934,7 @@
         </w:tc>
         <w:tc>
           <w:tcPr>
-            <w:tcW w:w="1432" w:type="dxa"/>
+            <w:tcW w:w="1213" w:type="dxa"/>
           </w:tcPr>
           <w:p>
             <w:pPr>
@@ -6066,7 +6958,7 @@
         </w:tc>
         <w:tc>
           <w:tcPr>
-            <w:tcW w:w="1298" w:type="dxa"/>
+            <w:tcW w:w="1103" w:type="dxa"/>
           </w:tcPr>
           <w:p>
             <w:pPr>
@@ -6090,7 +6982,7 @@
         </w:tc>
         <w:tc>
           <w:tcPr>
-            <w:tcW w:w="2613" w:type="dxa"/>
+            <w:tcW w:w="2502" w:type="dxa"/>
           </w:tcPr>
           <w:p>
             <w:pPr>
@@ -6124,7 +7016,7 @@
                           <pic:cNvPicPr/>
                         </pic:nvPicPr>
                         <pic:blipFill>
-                          <a:blip r:embed="rId42" cstate="print">
+                          <a:blip r:embed="rId47" cstate="print">
                             <a:extLst>
                               <a:ext uri="{28A0092B-C50C-407E-A947-70E740481C1C}">
                                 <a14:useLocalDpi xmlns:a14="http://schemas.microsoft.com/office/drawing/2010/main" val="0"/>
@@ -6154,7 +7046,7 @@
         </w:tc>
         <w:tc>
           <w:tcPr>
-            <w:tcW w:w="1921" w:type="dxa"/>
+            <w:tcW w:w="2722" w:type="dxa"/>
           </w:tcPr>
           <w:p>
             <w:pPr>
@@ -6180,7 +7072,7 @@
       <w:tr>
         <w:tc>
           <w:tcPr>
-            <w:tcW w:w="1752" w:type="dxa"/>
+            <w:tcW w:w="1476" w:type="dxa"/>
           </w:tcPr>
           <w:p>
             <w:pPr>
@@ -6204,7 +7096,7 @@
         </w:tc>
         <w:tc>
           <w:tcPr>
-            <w:tcW w:w="1432" w:type="dxa"/>
+            <w:tcW w:w="1213" w:type="dxa"/>
           </w:tcPr>
           <w:p>
             <w:pPr>
@@ -6228,7 +7120,7 @@
         </w:tc>
         <w:tc>
           <w:tcPr>
-            <w:tcW w:w="1298" w:type="dxa"/>
+            <w:tcW w:w="1103" w:type="dxa"/>
           </w:tcPr>
           <w:p>
             <w:pPr>
@@ -6252,7 +7144,7 @@
         </w:tc>
         <w:tc>
           <w:tcPr>
-            <w:tcW w:w="2613" w:type="dxa"/>
+            <w:tcW w:w="2502" w:type="dxa"/>
           </w:tcPr>
           <w:p>
             <w:pPr>
@@ -6286,7 +7178,7 @@
                           <pic:cNvPicPr/>
                         </pic:nvPicPr>
                         <pic:blipFill>
-                          <a:blip r:embed="rId43" cstate="print">
+                          <a:blip r:embed="rId48" cstate="print">
                             <a:extLst>
                               <a:ext uri="{28A0092B-C50C-407E-A947-70E740481C1C}">
                                 <a14:useLocalDpi xmlns:a14="http://schemas.microsoft.com/office/drawing/2010/main" val="0"/>
@@ -6316,7 +7208,7 @@
         </w:tc>
         <w:tc>
           <w:tcPr>
-            <w:tcW w:w="1921" w:type="dxa"/>
+            <w:tcW w:w="2722" w:type="dxa"/>
           </w:tcPr>
           <w:p>
             <w:pPr>
@@ -6342,7 +7234,7 @@
       <w:tr>
         <w:tc>
           <w:tcPr>
-            <w:tcW w:w="1752" w:type="dxa"/>
+            <w:tcW w:w="1476" w:type="dxa"/>
           </w:tcPr>
           <w:p>
             <w:pPr>
@@ -6366,7 +7258,7 @@
         </w:tc>
         <w:tc>
           <w:tcPr>
-            <w:tcW w:w="1432" w:type="dxa"/>
+            <w:tcW w:w="1213" w:type="dxa"/>
           </w:tcPr>
           <w:p>
             <w:pPr>
@@ -6390,7 +7282,7 @@
         </w:tc>
         <w:tc>
           <w:tcPr>
-            <w:tcW w:w="1298" w:type="dxa"/>
+            <w:tcW w:w="1103" w:type="dxa"/>
           </w:tcPr>
           <w:p>
             <w:pPr>
@@ -6414,7 +7306,7 @@
         </w:tc>
         <w:tc>
           <w:tcPr>
-            <w:tcW w:w="2613" w:type="dxa"/>
+            <w:tcW w:w="2502" w:type="dxa"/>
           </w:tcPr>
           <w:p>
             <w:pPr>
@@ -6438,7 +7330,7 @@
         </w:tc>
         <w:tc>
           <w:tcPr>
-            <w:tcW w:w="1921" w:type="dxa"/>
+            <w:tcW w:w="2722" w:type="dxa"/>
           </w:tcPr>
           <w:p>
             <w:pPr>
@@ -6464,7 +7356,7 @@
       <w:tr>
         <w:tc>
           <w:tcPr>
-            <w:tcW w:w="1752" w:type="dxa"/>
+            <w:tcW w:w="1476" w:type="dxa"/>
           </w:tcPr>
           <w:p>
             <w:pPr>
@@ -6506,7 +7398,7 @@
         </w:tc>
         <w:tc>
           <w:tcPr>
-            <w:tcW w:w="1432" w:type="dxa"/>
+            <w:tcW w:w="1213" w:type="dxa"/>
           </w:tcPr>
           <w:p>
             <w:pPr>
@@ -6530,7 +7422,7 @@
         </w:tc>
         <w:tc>
           <w:tcPr>
-            <w:tcW w:w="1298" w:type="dxa"/>
+            <w:tcW w:w="1103" w:type="dxa"/>
           </w:tcPr>
           <w:p>
             <w:pPr>
@@ -6564,7 +7456,7 @@
         </w:tc>
         <w:tc>
           <w:tcPr>
-            <w:tcW w:w="2613" w:type="dxa"/>
+            <w:tcW w:w="2502" w:type="dxa"/>
           </w:tcPr>
           <w:p>
             <w:pPr>
@@ -6598,7 +7490,7 @@
                           <pic:cNvPicPr/>
                         </pic:nvPicPr>
                         <pic:blipFill>
-                          <a:blip r:embed="rId44" cstate="print">
+                          <a:blip r:embed="rId49" cstate="print">
                             <a:extLst>
                               <a:ext uri="{28A0092B-C50C-407E-A947-70E740481C1C}">
                                 <a14:useLocalDpi xmlns:a14="http://schemas.microsoft.com/office/drawing/2010/main" val="0"/>
@@ -6628,7 +7520,7 @@
         </w:tc>
         <w:tc>
           <w:tcPr>
-            <w:tcW w:w="1921" w:type="dxa"/>
+            <w:tcW w:w="2722" w:type="dxa"/>
           </w:tcPr>
           <w:p>
             <w:pPr>
@@ -6654,7 +7546,7 @@
       <w:tr>
         <w:tc>
           <w:tcPr>
-            <w:tcW w:w="1752" w:type="dxa"/>
+            <w:tcW w:w="1476" w:type="dxa"/>
           </w:tcPr>
           <w:p>
             <w:pPr>
@@ -6672,13 +7564,14 @@
                 <w:szCs w:val="22"/>
                 <w:lang w:val="en-AU"/>
               </w:rPr>
+              <w:lastRenderedPageBreak/>
               <w:t>HTML validation</w:t>
             </w:r>
           </w:p>
         </w:tc>
         <w:tc>
           <w:tcPr>
-            <w:tcW w:w="1432" w:type="dxa"/>
+            <w:tcW w:w="1213" w:type="dxa"/>
           </w:tcPr>
           <w:p>
             <w:pPr>
@@ -6702,7 +7595,7 @@
         </w:tc>
         <w:tc>
           <w:tcPr>
-            <w:tcW w:w="1298" w:type="dxa"/>
+            <w:tcW w:w="1103" w:type="dxa"/>
           </w:tcPr>
           <w:p>
             <w:pPr>
@@ -6726,7 +7619,7 @@
         </w:tc>
         <w:tc>
           <w:tcPr>
-            <w:tcW w:w="2613" w:type="dxa"/>
+            <w:tcW w:w="2502" w:type="dxa"/>
           </w:tcPr>
           <w:p>
             <w:pPr>
@@ -6760,7 +7653,7 @@
                           <pic:cNvPicPr/>
                         </pic:nvPicPr>
                         <pic:blipFill>
-                          <a:blip r:embed="rId45" cstate="print">
+                          <a:blip r:embed="rId50" cstate="print">
                             <a:extLst>
                               <a:ext uri="{28A0092B-C50C-407E-A947-70E740481C1C}">
                                 <a14:useLocalDpi xmlns:a14="http://schemas.microsoft.com/office/drawing/2010/main" val="0"/>
@@ -6790,7 +7683,7 @@
         </w:tc>
         <w:tc>
           <w:tcPr>
-            <w:tcW w:w="1921" w:type="dxa"/>
+            <w:tcW w:w="2722" w:type="dxa"/>
           </w:tcPr>
           <w:p>
             <w:pPr>
@@ -6816,7 +7709,7 @@
       <w:tr>
         <w:tc>
           <w:tcPr>
-            <w:tcW w:w="1752" w:type="dxa"/>
+            <w:tcW w:w="1476" w:type="dxa"/>
           </w:tcPr>
           <w:p>
             <w:pPr>
@@ -6840,7 +7733,7 @@
         </w:tc>
         <w:tc>
           <w:tcPr>
-            <w:tcW w:w="1432" w:type="dxa"/>
+            <w:tcW w:w="1213" w:type="dxa"/>
           </w:tcPr>
           <w:p>
             <w:pPr>
@@ -6851,11 +7744,20 @@
                 <w:lang w:val="en-AU"/>
               </w:rPr>
             </w:pPr>
+            <w:r>
+              <w:rPr>
+                <w:noProof/>
+                <w:sz w:val="22"/>
+                <w:szCs w:val="22"/>
+                <w:lang w:val="en-AU"/>
+              </w:rPr>
+              <w:t>Run stylesheet through a CSS validator</w:t>
+            </w:r>
           </w:p>
         </w:tc>
         <w:tc>
           <w:tcPr>
-            <w:tcW w:w="1298" w:type="dxa"/>
+            <w:tcW w:w="1103" w:type="dxa"/>
           </w:tcPr>
           <w:p>
             <w:pPr>
@@ -6879,7 +7781,7 @@
         </w:tc>
         <w:tc>
           <w:tcPr>
-            <w:tcW w:w="2613" w:type="dxa"/>
+            <w:tcW w:w="2502" w:type="dxa"/>
           </w:tcPr>
           <w:p>
             <w:pPr>
@@ -6890,11 +7792,69 @@
                 <w:lang w:val="en-AU"/>
               </w:rPr>
             </w:pPr>
+            <w:r>
+              <w:rPr>
+                <w:noProof/>
+                <w:sz w:val="22"/>
+                <w:szCs w:val="22"/>
+                <w:lang w:val="en-AU"/>
+              </w:rPr>
+              <w:drawing>
+                <wp:inline distT="0" distB="0" distL="0" distR="0" wp14:anchorId="71B80E8B" wp14:editId="476B8B76">
+                  <wp:extent cx="1109965" cy="600075"/>
+                  <wp:effectExtent l="0" t="0" r="0" b="0"/>
+                  <wp:docPr id="1256903118" name="Picture 15"/>
+                  <wp:cNvGraphicFramePr>
+                    <a:graphicFrameLocks xmlns:a="http://schemas.openxmlformats.org/drawingml/2006/main" noChangeAspect="1"/>
+                  </wp:cNvGraphicFramePr>
+                  <a:graphic xmlns:a="http://schemas.openxmlformats.org/drawingml/2006/main">
+                    <a:graphicData uri="http://schemas.openxmlformats.org/drawingml/2006/picture">
+                      <pic:pic xmlns:pic="http://schemas.openxmlformats.org/drawingml/2006/picture">
+                        <pic:nvPicPr>
+                          <pic:cNvPr id="1256903118" name="Picture 1256903118"/>
+                          <pic:cNvPicPr/>
+                        </pic:nvPicPr>
+                        <pic:blipFill rotWithShape="1">
+                          <a:blip r:embed="rId51" cstate="print">
+                            <a:extLst>
+                              <a:ext uri="{28A0092B-C50C-407E-A947-70E740481C1C}">
+                                <a14:useLocalDpi xmlns:a14="http://schemas.microsoft.com/office/drawing/2010/main" val="0"/>
+                              </a:ext>
+                            </a:extLst>
+                          </a:blip>
+                          <a:srcRect r="58132"/>
+                          <a:stretch>
+                            <a:fillRect/>
+                          </a:stretch>
+                        </pic:blipFill>
+                        <pic:spPr bwMode="auto">
+                          <a:xfrm>
+                            <a:off x="0" y="0"/>
+                            <a:ext cx="1133617" cy="612862"/>
+                          </a:xfrm>
+                          <a:prstGeom prst="rect">
+                            <a:avLst/>
+                          </a:prstGeom>
+                          <a:ln>
+                            <a:noFill/>
+                          </a:ln>
+                          <a:extLst>
+                            <a:ext uri="{53640926-AAD7-44D8-BBD7-CCE9431645EC}">
+                              <a14:shadowObscured xmlns:a14="http://schemas.microsoft.com/office/drawing/2010/main"/>
+                            </a:ext>
+                          </a:extLst>
+                        </pic:spPr>
+                      </pic:pic>
+                    </a:graphicData>
+                  </a:graphic>
+                </wp:inline>
+              </w:drawing>
+            </w:r>
           </w:p>
         </w:tc>
         <w:tc>
           <w:tcPr>
-            <w:tcW w:w="1921" w:type="dxa"/>
+            <w:tcW w:w="2722" w:type="dxa"/>
           </w:tcPr>
           <w:p>
             <w:pPr>
@@ -6905,13 +7865,80 @@
                 <w:lang w:val="en-AU"/>
               </w:rPr>
             </w:pPr>
+            <w:r>
+              <w:rPr>
+                <w:noProof/>
+                <w:sz w:val="22"/>
+                <w:szCs w:val="22"/>
+                <w:lang w:val="en-AU"/>
+              </w:rPr>
+              <w:t>Fail – improved by fixing the mistakes</w:t>
+            </w:r>
+            <w:r>
+              <w:rPr>
+                <w:noProof/>
+                <w:sz w:val="22"/>
+                <w:szCs w:val="22"/>
+                <w:lang w:val="en-AU"/>
+              </w:rPr>
+              <w:drawing>
+                <wp:inline distT="0" distB="0" distL="0" distR="0" wp14:anchorId="48D727A4" wp14:editId="791C22AF">
+                  <wp:extent cx="2171065" cy="337820"/>
+                  <wp:effectExtent l="0" t="0" r="635" b="5080"/>
+                  <wp:docPr id="255033106" name="Picture 16"/>
+                  <wp:cNvGraphicFramePr>
+                    <a:graphicFrameLocks xmlns:a="http://schemas.openxmlformats.org/drawingml/2006/main" noChangeAspect="1"/>
+                  </wp:cNvGraphicFramePr>
+                  <a:graphic xmlns:a="http://schemas.openxmlformats.org/drawingml/2006/main">
+                    <a:graphicData uri="http://schemas.openxmlformats.org/drawingml/2006/picture">
+                      <pic:pic xmlns:pic="http://schemas.openxmlformats.org/drawingml/2006/picture">
+                        <pic:nvPicPr>
+                          <pic:cNvPr id="255033106" name="Picture 255033106"/>
+                          <pic:cNvPicPr/>
+                        </pic:nvPicPr>
+                        <pic:blipFill rotWithShape="1">
+                          <a:blip r:embed="rId52" cstate="print">
+                            <a:extLst>
+                              <a:ext uri="{28A0092B-C50C-407E-A947-70E740481C1C}">
+                                <a14:useLocalDpi xmlns:a14="http://schemas.microsoft.com/office/drawing/2010/main" val="0"/>
+                              </a:ext>
+                            </a:extLst>
+                          </a:blip>
+                          <a:srcRect l="994" t="7803" r="-994" b="42325"/>
+                          <a:stretch>
+                            <a:fillRect/>
+                          </a:stretch>
+                        </pic:blipFill>
+                        <pic:spPr bwMode="auto">
+                          <a:xfrm>
+                            <a:off x="0" y="0"/>
+                            <a:ext cx="2195951" cy="341692"/>
+                          </a:xfrm>
+                          <a:prstGeom prst="rect">
+                            <a:avLst/>
+                          </a:prstGeom>
+                          <a:ln>
+                            <a:noFill/>
+                          </a:ln>
+                          <a:extLst>
+                            <a:ext uri="{53640926-AAD7-44D8-BBD7-CCE9431645EC}">
+                              <a14:shadowObscured xmlns:a14="http://schemas.microsoft.com/office/drawing/2010/main"/>
+                            </a:ext>
+                          </a:extLst>
+                        </pic:spPr>
+                      </pic:pic>
+                    </a:graphicData>
+                  </a:graphic>
+                </wp:inline>
+              </w:drawing>
+            </w:r>
           </w:p>
         </w:tc>
       </w:tr>
       <w:tr>
         <w:tc>
           <w:tcPr>
-            <w:tcW w:w="1752" w:type="dxa"/>
+            <w:tcW w:w="1476" w:type="dxa"/>
           </w:tcPr>
           <w:p>
             <w:pPr>
@@ -6922,11 +7949,20 @@
                 <w:lang w:val="en-AU"/>
               </w:rPr>
             </w:pPr>
+            <w:r>
+              <w:rPr>
+                <w:noProof/>
+                <w:sz w:val="22"/>
+                <w:szCs w:val="22"/>
+                <w:lang w:val="en-AU"/>
+              </w:rPr>
+              <w:t>Empty file test</w:t>
+            </w:r>
           </w:p>
         </w:tc>
         <w:tc>
           <w:tcPr>
-            <w:tcW w:w="1432" w:type="dxa"/>
+            <w:tcW w:w="1213" w:type="dxa"/>
           </w:tcPr>
           <w:p>
             <w:pPr>
@@ -6937,11 +7973,20 @@
                 <w:lang w:val="en-AU"/>
               </w:rPr>
             </w:pPr>
+            <w:r>
+              <w:rPr>
+                <w:noProof/>
+                <w:sz w:val="22"/>
+                <w:szCs w:val="22"/>
+                <w:lang w:val="en-AU"/>
+              </w:rPr>
+              <w:t>Upload an empty CSV</w:t>
+            </w:r>
           </w:p>
         </w:tc>
         <w:tc>
           <w:tcPr>
-            <w:tcW w:w="1298" w:type="dxa"/>
+            <w:tcW w:w="1103" w:type="dxa"/>
           </w:tcPr>
           <w:p>
             <w:pPr>
@@ -6952,11 +7997,40 @@
                 <w:lang w:val="en-AU"/>
               </w:rPr>
             </w:pPr>
+            <w:r>
+              <w:rPr>
+                <w:noProof/>
+                <w:sz w:val="22"/>
+                <w:szCs w:val="22"/>
+                <w:lang w:val="en-AU"/>
+              </w:rPr>
+              <w:t>Website does not crash</w:t>
+            </w:r>
+          </w:p>
+          <w:p>
+            <w:pPr>
+              <w:tabs>
+                <w:tab w:val="left" w:pos="823"/>
+              </w:tabs>
+              <w:rPr>
+                <w:sz w:val="22"/>
+                <w:szCs w:val="22"/>
+                <w:lang w:val="en-AU"/>
+              </w:rPr>
+            </w:pPr>
+            <w:r>
+              <w:rPr>
+                <w:sz w:val="22"/>
+                <w:szCs w:val="22"/>
+                <w:lang w:val="en-AU"/>
+              </w:rPr>
+              <w:tab/>
+            </w:r>
           </w:p>
         </w:tc>
         <w:tc>
           <w:tcPr>
-            <w:tcW w:w="2613" w:type="dxa"/>
+            <w:tcW w:w="2502" w:type="dxa"/>
           </w:tcPr>
           <w:p>
             <w:pPr>
@@ -6967,11 +8041,60 @@
                 <w:lang w:val="en-AU"/>
               </w:rPr>
             </w:pPr>
+            <w:r>
+              <w:rPr>
+                <w:noProof/>
+                <w:sz w:val="22"/>
+                <w:szCs w:val="22"/>
+                <w:lang w:val="en-AU"/>
+              </w:rPr>
+              <w:drawing>
+                <wp:inline distT="0" distB="0" distL="0" distR="0" wp14:anchorId="0C8EF2F4" wp14:editId="51E92ACF">
+                  <wp:extent cx="1543216" cy="1367283"/>
+                  <wp:effectExtent l="0" t="0" r="6350" b="4445"/>
+                  <wp:docPr id="1523007344" name="Picture 17"/>
+                  <wp:cNvGraphicFramePr>
+                    <a:graphicFrameLocks xmlns:a="http://schemas.openxmlformats.org/drawingml/2006/main" noChangeAspect="1"/>
+                  </wp:cNvGraphicFramePr>
+                  <a:graphic xmlns:a="http://schemas.openxmlformats.org/drawingml/2006/main">
+                    <a:graphicData uri="http://schemas.openxmlformats.org/drawingml/2006/picture">
+                      <pic:pic xmlns:pic="http://schemas.openxmlformats.org/drawingml/2006/picture">
+                        <pic:nvPicPr>
+                          <pic:cNvPr id="1523007344" name="Picture 1523007344"/>
+                          <pic:cNvPicPr/>
+                        </pic:nvPicPr>
+                        <pic:blipFill>
+                          <a:blip r:embed="rId53" cstate="print">
+                            <a:extLst>
+                              <a:ext uri="{28A0092B-C50C-407E-A947-70E740481C1C}">
+                                <a14:useLocalDpi xmlns:a14="http://schemas.microsoft.com/office/drawing/2010/main" val="0"/>
+                              </a:ext>
+                            </a:extLst>
+                          </a:blip>
+                          <a:stretch>
+                            <a:fillRect/>
+                          </a:stretch>
+                        </pic:blipFill>
+                        <pic:spPr>
+                          <a:xfrm>
+                            <a:off x="0" y="0"/>
+                            <a:ext cx="1556687" cy="1379219"/>
+                          </a:xfrm>
+                          <a:prstGeom prst="rect">
+                            <a:avLst/>
+                          </a:prstGeom>
+                        </pic:spPr>
+                      </pic:pic>
+                    </a:graphicData>
+                  </a:graphic>
+                </wp:inline>
+              </w:drawing>
+            </w:r>
           </w:p>
         </w:tc>
         <w:tc>
           <w:tcPr>
-            <w:tcW w:w="1921" w:type="dxa"/>
+            <w:tcW w:w="2722" w:type="dxa"/>
           </w:tcPr>
           <w:p>
             <w:pPr>
@@ -6982,13 +8105,22 @@
                 <w:lang w:val="en-AU"/>
               </w:rPr>
             </w:pPr>
+            <w:r>
+              <w:rPr>
+                <w:noProof/>
+                <w:sz w:val="22"/>
+                <w:szCs w:val="22"/>
+                <w:lang w:val="en-AU"/>
+              </w:rPr>
+              <w:t>Pass/fail although the website did not crash I was not happy with the result</w:t>
+            </w:r>
           </w:p>
         </w:tc>
       </w:tr>
       <w:tr>
         <w:tc>
           <w:tcPr>
-            <w:tcW w:w="1752" w:type="dxa"/>
+            <w:tcW w:w="1476" w:type="dxa"/>
           </w:tcPr>
           <w:p>
             <w:pPr>
@@ -6999,11 +8131,20 @@
                 <w:lang w:val="en-AU"/>
               </w:rPr>
             </w:pPr>
+            <w:r>
+              <w:rPr>
+                <w:noProof/>
+                <w:sz w:val="22"/>
+                <w:szCs w:val="22"/>
+                <w:lang w:val="en-AU"/>
+              </w:rPr>
+              <w:t>Empty file test</w:t>
+            </w:r>
           </w:p>
         </w:tc>
         <w:tc>
           <w:tcPr>
-            <w:tcW w:w="1432" w:type="dxa"/>
+            <w:tcW w:w="1213" w:type="dxa"/>
           </w:tcPr>
           <w:p>
             <w:pPr>
@@ -7014,11 +8155,20 @@
                 <w:lang w:val="en-AU"/>
               </w:rPr>
             </w:pPr>
+            <w:r>
+              <w:rPr>
+                <w:noProof/>
+                <w:sz w:val="22"/>
+                <w:szCs w:val="22"/>
+                <w:lang w:val="en-AU"/>
+              </w:rPr>
+              <w:t>Upload an empty CSV</w:t>
+            </w:r>
           </w:p>
         </w:tc>
         <w:tc>
           <w:tcPr>
-            <w:tcW w:w="1298" w:type="dxa"/>
+            <w:tcW w:w="1103" w:type="dxa"/>
           </w:tcPr>
           <w:p>
             <w:pPr>
@@ -7029,11 +8179,29 @@
                 <w:lang w:val="en-AU"/>
               </w:rPr>
             </w:pPr>
+            <w:r>
+              <w:rPr>
+                <w:noProof/>
+                <w:sz w:val="22"/>
+                <w:szCs w:val="22"/>
+                <w:lang w:val="en-AU"/>
+              </w:rPr>
+              <w:t xml:space="preserve">Does not allow </w:t>
+            </w:r>
+            <w:r>
+              <w:rPr>
+                <w:noProof/>
+                <w:sz w:val="22"/>
+                <w:szCs w:val="22"/>
+                <w:lang w:val="en-AU"/>
+              </w:rPr>
+              <w:t>to upload CVS file</w:t>
+            </w:r>
           </w:p>
         </w:tc>
         <w:tc>
           <w:tcPr>
-            <w:tcW w:w="2613" w:type="dxa"/>
+            <w:tcW w:w="2502" w:type="dxa"/>
           </w:tcPr>
           <w:p>
             <w:pPr>
@@ -7044,11 +8212,60 @@
                 <w:lang w:val="en-AU"/>
               </w:rPr>
             </w:pPr>
+            <w:r>
+              <w:rPr>
+                <w:noProof/>
+                <w:sz w:val="22"/>
+                <w:szCs w:val="22"/>
+                <w:lang w:val="en-AU"/>
+              </w:rPr>
+              <w:drawing>
+                <wp:inline distT="0" distB="0" distL="0" distR="0" wp14:anchorId="65860BC2" wp14:editId="432DDFA2">
+                  <wp:extent cx="905408" cy="245689"/>
+                  <wp:effectExtent l="0" t="0" r="0" b="0"/>
+                  <wp:docPr id="1193830649" name="Picture 18"/>
+                  <wp:cNvGraphicFramePr>
+                    <a:graphicFrameLocks xmlns:a="http://schemas.openxmlformats.org/drawingml/2006/main" noChangeAspect="1"/>
+                  </wp:cNvGraphicFramePr>
+                  <a:graphic xmlns:a="http://schemas.openxmlformats.org/drawingml/2006/main">
+                    <a:graphicData uri="http://schemas.openxmlformats.org/drawingml/2006/picture">
+                      <pic:pic xmlns:pic="http://schemas.openxmlformats.org/drawingml/2006/picture">
+                        <pic:nvPicPr>
+                          <pic:cNvPr id="1193830649" name="Picture 1193830649"/>
+                          <pic:cNvPicPr/>
+                        </pic:nvPicPr>
+                        <pic:blipFill>
+                          <a:blip r:embed="rId54" cstate="print">
+                            <a:extLst>
+                              <a:ext uri="{28A0092B-C50C-407E-A947-70E740481C1C}">
+                                <a14:useLocalDpi xmlns:a14="http://schemas.microsoft.com/office/drawing/2010/main" val="0"/>
+                              </a:ext>
+                            </a:extLst>
+                          </a:blip>
+                          <a:stretch>
+                            <a:fillRect/>
+                          </a:stretch>
+                        </pic:blipFill>
+                        <pic:spPr>
+                          <a:xfrm>
+                            <a:off x="0" y="0"/>
+                            <a:ext cx="1067148" cy="289578"/>
+                          </a:xfrm>
+                          <a:prstGeom prst="rect">
+                            <a:avLst/>
+                          </a:prstGeom>
+                        </pic:spPr>
+                      </pic:pic>
+                    </a:graphicData>
+                  </a:graphic>
+                </wp:inline>
+              </w:drawing>
+            </w:r>
           </w:p>
         </w:tc>
         <w:tc>
           <w:tcPr>
-            <w:tcW w:w="1921" w:type="dxa"/>
+            <w:tcW w:w="2722" w:type="dxa"/>
           </w:tcPr>
           <w:p>
             <w:pPr>
@@ -7059,13 +8276,22 @@
                 <w:lang w:val="en-AU"/>
               </w:rPr>
             </w:pPr>
+            <w:r>
+              <w:rPr>
+                <w:noProof/>
+                <w:sz w:val="22"/>
+                <w:szCs w:val="22"/>
+                <w:lang w:val="en-AU"/>
+              </w:rPr>
+              <w:t>pass</w:t>
+            </w:r>
           </w:p>
         </w:tc>
       </w:tr>
       <w:tr>
         <w:tc>
           <w:tcPr>
-            <w:tcW w:w="1752" w:type="dxa"/>
+            <w:tcW w:w="1476" w:type="dxa"/>
           </w:tcPr>
           <w:p>
             <w:pPr>
@@ -7080,7 +8306,7 @@
         </w:tc>
         <w:tc>
           <w:tcPr>
-            <w:tcW w:w="1432" w:type="dxa"/>
+            <w:tcW w:w="1213" w:type="dxa"/>
           </w:tcPr>
           <w:p>
             <w:pPr>
@@ -7095,7 +8321,7 @@
         </w:tc>
         <w:tc>
           <w:tcPr>
-            <w:tcW w:w="1298" w:type="dxa"/>
+            <w:tcW w:w="1103" w:type="dxa"/>
           </w:tcPr>
           <w:p>
             <w:pPr>
@@ -7110,7 +8336,7 @@
         </w:tc>
         <w:tc>
           <w:tcPr>
-            <w:tcW w:w="2613" w:type="dxa"/>
+            <w:tcW w:w="2502" w:type="dxa"/>
           </w:tcPr>
           <w:p>
             <w:pPr>
@@ -7125,7 +8351,7 @@
         </w:tc>
         <w:tc>
           <w:tcPr>
-            <w:tcW w:w="1921" w:type="dxa"/>
+            <w:tcW w:w="2722" w:type="dxa"/>
           </w:tcPr>
           <w:p>
             <w:pPr>
@@ -7158,6 +8384,103 @@
     </w:sectPr>
   </w:body>
 </w:document>
+</file>
+
+<file path=word/numbering.xml><?xml version="1.0" encoding="utf-8"?>
+<w:numbering xmlns:wpc="http://schemas.microsoft.com/office/word/2010/wordprocessingCanvas" xmlns:cx="http://schemas.microsoft.com/office/drawing/2014/chartex" xmlns:cx1="http://schemas.microsoft.com/office/drawing/2015/9/8/chartex" xmlns:cx2="http://schemas.microsoft.com/office/drawing/2015/10/21/chartex" xmlns:cx3="http://schemas.microsoft.com/office/drawing/2016/5/9/chartex" xmlns:cx4="http://schemas.microsoft.com/office/drawing/2016/5/10/chartex" xmlns:cx5="http://schemas.microsoft.com/office/drawing/2016/5/11/chartex" xmlns:cx6="http://schemas.microsoft.com/office/drawing/2016/5/12/chartex" xmlns:cx7="http://schemas.microsoft.com/office/drawing/2016/5/13/chartex" xmlns:cx8="http://schemas.microsoft.com/office/drawing/2016/5/14/chartex" xmlns:mc="http://schemas.openxmlformats.org/markup-compatibility/2006" xmlns:m="http://schemas.openxmlformats.org/officeDocument/2006/math" xmlns:aink="http://schemas.microsoft.com/office/drawing/2016/ink" xmlns:am3d="http://schemas.microsoft.com/office/drawing/2017/model3d" xmlns:oel="http://schemas.microsoft.com/office/2019/extlst" xmlns:r="http://schemas.openxmlformats.org/officeDocument/2006/relationships" xmlns:wp14="http://schemas.microsoft.com/office/word/2010/wordprocessingDrawing" xmlns:wp="http://schemas.openxmlformats.org/drawingml/2006/wordprocessingDrawing" xmlns:wpg="http://schemas.microsoft.com/office/word/2010/wordprocessingGroup" xmlns:wpi="http://schemas.microsoft.com/office/word/2010/wordprocessingInk" xmlns:wps="http://schemas.microsoft.com/office/word/2010/wordprocessingShape" xmlns:o="urn:schemas-microsoft-com:office:office" xmlns:v="urn:schemas-microsoft-com:vml" xmlns:w10="urn:schemas-microsoft-com:office:word" xmlns:w="http://schemas.openxmlformats.org/wordprocessingml/2006/main" xmlns:w14="http://schemas.microsoft.com/office/word/2010/wordml" xmlns:w15="http://schemas.microsoft.com/office/word/2012/wordml" xmlns:w16cex="http://schemas.microsoft.com/office/word/2018/wordml/cex" xmlns:w16cid="http://schemas.microsoft.com/office/word/2016/wordml/cid" xmlns:w16="http://schemas.microsoft.com/office/word/2018/wordml" xmlns:w16sdtdh="http://schemas.microsoft.com/office/word/2020/wordml/sdtdatahash" xmlns:w16sdtfl="http://schemas.microsoft.com/office/word/2024/wordml/sdtformatlock" xmlns:w16se="http://schemas.microsoft.com/office/word/2015/wordml/symex" xmlns:w16du="http://schemas.microsoft.com/office/word/2023/wordml/word16du" xmlns:wne="http://schemas.microsoft.com/office/word/2006/wordml" mc:Ignorable="w14 w15 w16se w16cid w16 w16cex w16sdtdh w16sdtfl w16du wp14">
+  <w:abstractNum w:abstractNumId="0" w15:restartNumberingAfterBreak="0">
+    <w:nsid w:val="6389492A"/>
+    <w:multiLevelType w:val="hybridMultilevel"/>
+    <w:tmpl w:val="F1BE9A6C"/>
+    <w:lvl w:ilvl="0" w:tplc="0809000F">
+      <w:start w:val="1"/>
+      <w:numFmt w:val="decimal"/>
+      <w:lvlText w:val="%1."/>
+      <w:lvlJc w:val="left"/>
+      <w:pPr>
+        <w:ind w:left="720" w:hanging="360"/>
+      </w:pPr>
+      <w:rPr>
+        <w:rFonts w:hint="default"/>
+      </w:rPr>
+    </w:lvl>
+    <w:lvl w:ilvl="1" w:tplc="08090019" w:tentative="1">
+      <w:start w:val="1"/>
+      <w:numFmt w:val="lowerLetter"/>
+      <w:lvlText w:val="%2."/>
+      <w:lvlJc w:val="left"/>
+      <w:pPr>
+        <w:ind w:left="1440" w:hanging="360"/>
+      </w:pPr>
+    </w:lvl>
+    <w:lvl w:ilvl="2" w:tplc="0809001B" w:tentative="1">
+      <w:start w:val="1"/>
+      <w:numFmt w:val="lowerRoman"/>
+      <w:lvlText w:val="%3."/>
+      <w:lvlJc w:val="right"/>
+      <w:pPr>
+        <w:ind w:left="2160" w:hanging="180"/>
+      </w:pPr>
+    </w:lvl>
+    <w:lvl w:ilvl="3" w:tplc="0809000F" w:tentative="1">
+      <w:start w:val="1"/>
+      <w:numFmt w:val="decimal"/>
+      <w:lvlText w:val="%4."/>
+      <w:lvlJc w:val="left"/>
+      <w:pPr>
+        <w:ind w:left="2880" w:hanging="360"/>
+      </w:pPr>
+    </w:lvl>
+    <w:lvl w:ilvl="4" w:tplc="08090019" w:tentative="1">
+      <w:start w:val="1"/>
+      <w:numFmt w:val="lowerLetter"/>
+      <w:lvlText w:val="%5."/>
+      <w:lvlJc w:val="left"/>
+      <w:pPr>
+        <w:ind w:left="3600" w:hanging="360"/>
+      </w:pPr>
+    </w:lvl>
+    <w:lvl w:ilvl="5" w:tplc="0809001B" w:tentative="1">
+      <w:start w:val="1"/>
+      <w:numFmt w:val="lowerRoman"/>
+      <w:lvlText w:val="%6."/>
+      <w:lvlJc w:val="right"/>
+      <w:pPr>
+        <w:ind w:left="4320" w:hanging="180"/>
+      </w:pPr>
+    </w:lvl>
+    <w:lvl w:ilvl="6" w:tplc="0809000F" w:tentative="1">
+      <w:start w:val="1"/>
+      <w:numFmt w:val="decimal"/>
+      <w:lvlText w:val="%7."/>
+      <w:lvlJc w:val="left"/>
+      <w:pPr>
+        <w:ind w:left="5040" w:hanging="360"/>
+      </w:pPr>
+    </w:lvl>
+    <w:lvl w:ilvl="7" w:tplc="08090019" w:tentative="1">
+      <w:start w:val="1"/>
+      <w:numFmt w:val="lowerLetter"/>
+      <w:lvlText w:val="%8."/>
+      <w:lvlJc w:val="left"/>
+      <w:pPr>
+        <w:ind w:left="5760" w:hanging="360"/>
+      </w:pPr>
+    </w:lvl>
+    <w:lvl w:ilvl="8" w:tplc="0809001B" w:tentative="1">
+      <w:start w:val="1"/>
+      <w:numFmt w:val="lowerRoman"/>
+      <w:lvlText w:val="%9."/>
+      <w:lvlJc w:val="right"/>
+      <w:pPr>
+        <w:ind w:left="6480" w:hanging="180"/>
+      </w:pPr>
+    </w:lvl>
+  </w:abstractNum>
+  <w:num w:numId="1" w16cid:durableId="541133256">
+    <w:abstractNumId w:val="0"/>
+  </w:num>
+</w:numbering>
 </file>
 
 <file path=word/styles.xml><?xml version="1.0" encoding="utf-8"?>
@@ -7763,7 +9086,6 @@
   <w:style w:type="character" w:default="1" w:styleId="DefaultParagraphFont">
     <w:name w:val="Default Paragraph Font"/>
     <w:uiPriority w:val="1"/>
-    <w:semiHidden/>
     <w:unhideWhenUsed/>
   </w:style>
   <w:style w:type="table" w:default="1" w:styleId="TableNormal">

</xml_diff>